<commit_message>
Install supervisor-revised manuscript, add figure assets and Zenodo metadata
</commit_message>
<xml_diff>
--- a/manuscript/Manuscript.docx
+++ b/manuscript/Manuscript.docx
@@ -12,12 +12,16 @@
         <w:rPr>
           <w:i w:val="1"/>
           <w:iCs w:val="1"/>
+          <w:sz w:val="28"/>
+          <w:szCs w:val="28"/>
         </w:rPr>
       </w:pPr>
       <w:bookmarkStart w:colFirst="0" w:colLast="0" w:name="_770sq27cjmj1" w:id="0"/>
       <w:bookmarkEnd w:id="0"/>
       <w:r>
         <w:rPr>
+          <w:sz w:val="28"/>
+          <w:szCs w:val="28"/>
           <w:rtl w:val="0"/>
         </w:rPr>
         <w:t xml:space="preserve">Mapping Multivariate Beta-lactam Resistance in </w:t>
@@ -26,93 +30,16 @@
         <w:rPr>
           <w:i w:val="1"/>
           <w:iCs w:val="1"/>
+          <w:sz w:val="28"/>
+          <w:szCs w:val="28"/>
           <w:rtl w:val="0"/>
         </w:rPr>
         <w:t xml:space="preserve">Streptococcus pneumoniae</w:t>
       </w:r>
-    </w:p>
-    <w:p>
-      <w:pPr>
-        <w:tabs>
-          <w:tab w:val="right" w:leader="none" w:pos="9026"/>
-        </w:tabs>
-        <w:spacing w:after="0" w:before="0" w:line="276" w:lineRule="auto"/>
-        <w:rPr/>
-      </w:pPr>
-      <w:r>
-        <w:rPr>
-          <w:rtl w:val="0"/>
-        </w:rPr>
-      </w:r>
-    </w:p>
-    <w:p>
-      <w:pPr>
-        <w:tabs>
-          <w:tab w:val="right" w:leader="none" w:pos="9026"/>
-        </w:tabs>
-        <w:spacing w:after="0" w:before="0" w:line="276" w:lineRule="auto"/>
-        <w:ind w:left="0" w:firstLine="0"/>
-        <w:rPr>
-          <w:b w:val="1"/>
-          <w:bCs w:val="1"/>
-        </w:rPr>
-      </w:pPr>
-      <w:r>
-        <w:rPr>
-          <w:b w:val="1"/>
-          <w:bCs w:val="1"/>
-          <w:rtl w:val="0"/>
-        </w:rPr>
-        <w:t xml:space="preserve">Other option:</w:t>
-      </w:r>
-      <w:r>
-        <w:rPr>
-          <w:rtl w:val="0"/>
-        </w:rPr>
-      </w:r>
-    </w:p>
-    <w:p>
-      <w:pPr>
-        <w:pStyle w:val="Title"/>
-        <w:numPr>
-          <w:ilvl w:val="0"/>
-          <w:numId w:val="1"/>
-        </w:numPr>
-        <w:tabs>
-          <w:tab w:val="right" w:leader="none" w:pos="9026"/>
-        </w:tabs>
-        <w:ind w:left="720" w:hanging="360"/>
-        <w:rPr>
-          <w:b w:val="0"/>
-          <w:bCs w:val="0"/>
-          <w:sz w:val="22"/>
-          <w:szCs w:val="22"/>
-          <w:u w:val="none"/>
-        </w:rPr>
-      </w:pPr>
-      <w:bookmarkStart w:colFirst="0" w:colLast="0" w:name="_5v3sf6onjc4s" w:id="1"/>
-      <w:bookmarkEnd w:id="1"/>
-      <w:r>
-        <w:rPr>
-          <w:b w:val="0"/>
-          <w:bCs w:val="0"/>
-          <w:sz w:val="22"/>
-          <w:szCs w:val="22"/>
-          <w:rtl w:val="0"/>
-        </w:rPr>
-        <w:t xml:space="preserve">Mapping the Multivariate Phenotypic Landscape of Beta-lactam Resistance in </w:t>
-      </w:r>
-      <w:r>
-        <w:rPr>
-          <w:b w:val="0"/>
-          <w:bCs w:val="0"/>
-          <w:i w:val="1"/>
-          <w:iCs w:val="1"/>
-          <w:sz w:val="22"/>
-          <w:szCs w:val="22"/>
-          <w:rtl w:val="0"/>
-        </w:rPr>
-        <w:t xml:space="preserve">Streptococcus pneumoniae</w:t>
+      <w:r>
+        <w:rPr>
+          <w:rtl w:val="0"/>
+        </w:rPr>
       </w:r>
     </w:p>
     <w:p>
@@ -317,7 +244,7 @@
       <w:pPr>
         <w:numPr>
           <w:ilvl w:val="0"/>
-          <w:numId w:val="2"/>
+          <w:numId w:val="1"/>
         </w:numPr>
         <w:spacing w:after="0" w:before="0" w:line="276" w:lineRule="auto"/>
         <w:ind w:left="720" w:hanging="360"/>
@@ -341,7 +268,7 @@
       <w:pPr>
         <w:numPr>
           <w:ilvl w:val="0"/>
-          <w:numId w:val="2"/>
+          <w:numId w:val="1"/>
         </w:numPr>
         <w:spacing w:after="0" w:before="0" w:line="276" w:lineRule="auto"/>
         <w:ind w:left="720" w:hanging="360"/>
@@ -387,7 +314,7 @@
       <w:pPr>
         <w:numPr>
           <w:ilvl w:val="0"/>
-          <w:numId w:val="2"/>
+          <w:numId w:val="1"/>
         </w:numPr>
         <w:shd w:fill="ffffff" w:val="clear"/>
         <w:spacing w:after="0" w:before="0" w:line="276" w:lineRule="auto"/>
@@ -416,7 +343,7 @@
       <w:pPr>
         <w:numPr>
           <w:ilvl w:val="0"/>
-          <w:numId w:val="2"/>
+          <w:numId w:val="1"/>
         </w:numPr>
         <w:spacing w:after="0" w:before="0" w:line="276" w:lineRule="auto"/>
         <w:ind w:left="720" w:hanging="360"/>
@@ -467,7 +394,7 @@
       <w:pPr>
         <w:numPr>
           <w:ilvl w:val="0"/>
-          <w:numId w:val="2"/>
+          <w:numId w:val="1"/>
         </w:numPr>
         <w:spacing w:after="0" w:before="0" w:line="276" w:lineRule="auto"/>
         <w:ind w:left="720" w:hanging="360"/>
@@ -529,7 +456,7 @@
       <w:pPr>
         <w:numPr>
           <w:ilvl w:val="0"/>
-          <w:numId w:val="2"/>
+          <w:numId w:val="1"/>
         </w:numPr>
         <w:spacing w:after="0" w:before="0" w:line="276" w:lineRule="auto"/>
         <w:ind w:left="720" w:hanging="360"/>
@@ -728,7 +655,7 @@
         <w:rPr>
           <w:rtl w:val="0"/>
         </w:rPr>
-        <w:t xml:space="preserve"> is typically analysed one antibiotic at a time, often using resistant/susceptible classifications. This obscures the fact that minimum inhibitory concentrations (MICs) in this species are continuous, vary across beta-lactam subclasses in correlated but non-identical ways, and reflect complex genetic variation in underlying penicillin-binding proteins (PBPs). To address this, we develop a framework for analysing multivariate resistance phenotypes–’Antimicrobial Resistance Cartography’–and apply it to 3,628 invasive pneumococcal isolates from the U.S. Active Bacterial Core surveillance programme with MICs measured for six beta-lactams. </w:t>
+        <w:t xml:space="preserve"> is typically analysed one antibiotic at a time, often using resistant/susceptible classifications. This obscures the fact that minimum inhibitory concentrations (MICs) in this species are continuous, vary across beta-lactam subclasses in correlated but non-identical ways, and reflect complex genetic variation in underlying penicillin-binding proteins (PBPs). To address this, we develop a framework for analysing multivariate resistance phenotypes, which we term ’Antimicrobial Resistance Cartography’, and apply it to 3,628 invasive pneumococcal isolates from the U.S. Active Bacterial Core surveillance programme with MICs measured for six beta-lactams. </w:t>
       </w:r>
       <w:r>
         <w:rPr>
@@ -830,7 +757,7 @@
           <w:highlight w:val="white"/>
           <w:rtl w:val="0"/>
         </w:rPr>
-        <w:t xml:space="preserve">Current analytical methods for resistance datasets overwhelmingly focus on genotypes, while tools to study beta-lactam phenotypes–the direct targets of selection and clinical intervention–remain severely limited. </w:t>
+        <w:t xml:space="preserve">Current analytical methods for resistance datasets overwhelmingly focus on genotypes, while tools to study beta-lactam phenotypes, the direct targets of selection and clinical intervention, remain limited. </w:t>
       </w:r>
       <w:r>
         <w:rPr>
@@ -1131,7 +1058,15 @@
           <w:highlight w:val="white"/>
           <w:rtl w:val="0"/>
         </w:rPr>
-        <w:t xml:space="preserve">. This covariation can arise through several mechanisms: in some cases, one genotype confers resistance to multiple antibiotics; in others, epidemiological factors, such as sequential treatment with separate beta-lactams, generates co-resistance </w:t>
+        <w:t xml:space="preserve">. This covariation can arise through several mechanisms: in some cases, one genotype confers resistance to multiple antibiotics; </w:t>
+      </w:r>
+      <w:r>
+        <w:rPr>
+          <w:color w:val="191919"/>
+          <w:highlight w:val="white"/>
+          <w:rtl w:val="0"/>
+        </w:rPr>
+        <w:t xml:space="preserve">in others, epidemiological factors, such as sequential treatment with separate beta-lactams, generates co-resistance </w:t>
       </w:r>
       <w:hyperlink r:id="rId19">
         <w:r>
@@ -1147,7 +1082,15 @@
           <w:highlight w:val="white"/>
           <w:rtl w:val="0"/>
         </w:rPr>
-        <w:t xml:space="preserve">. Understanding how these correlations arise and persist is crucial, because they could accelerate drug resistance across multiple beta-lactams simultaneously, restricting the efficacy of the entire drug class </w:t>
+        <w:t xml:space="preserve">. </w:t>
+      </w:r>
+      <w:r>
+        <w:rPr>
+          <w:color w:val="191919"/>
+          <w:highlight w:val="white"/>
+          <w:rtl w:val="0"/>
+        </w:rPr>
+        <w:t xml:space="preserve">Understanding how these correlations arise and persist is crucial, because they could accelerate drug resistance across multiple beta-lactams simultaneously, restricting the efficacy of the entire drug class </w:t>
       </w:r>
       <w:hyperlink r:id="rId20">
         <w:r>
@@ -1373,7 +1316,7 @@
         <w:rPr>
           <w:rtl w:val="0"/>
         </w:rPr>
-        <w:t xml:space="preserve">frequently contain missing, censored, or heterogeneous measurements, particularly when values fall outside the dilution range of the assay, or when multiple susceptibility-testing methods are combined within a single collection </w:t>
+        <w:t xml:space="preserve">frequently contain missing or heterogeneous measurements, such as when values fall outside the dilution range of the assay, or when multiple susceptibility-testing methods are combined within a single collection </w:t>
       </w:r>
       <w:hyperlink r:id="rId26">
         <w:r>
@@ -1816,7 +1759,18 @@
         <w:rPr>
           <w:rtl w:val="0"/>
         </w:rPr>
-        <w:t xml:space="preserve"> for which joint phenotypic and genotypic data were available: focusing on MIC values against six beta-lactams and amino acid sequences of the transpeptidase regions of PBPs. We have three objectives: I) quantitatively visualise and interpret continuous covariation in susceptibility across six beta-lactams; II) examine how these phenotypes associate with specific phylogenetic lineages (MLSTs); and III) identify and rank PBP amino acid substitutions according to the strength and consistency of their association with increased beta-lactam MIC. In addition, we demonstrate the approach mitigates common experimental issues – measurement error, censored MIC values, missing data – and increases the resolution of genotype-phenotype associations, including the detection of epistatic effects for experimental follow-up. Our contribution is not the ordination method itself, but its focused application to quantitative MIC profiles, together with improved visualisation, experimental-error handling, quantification and comparison of multivariate distance metrics, and PBP genotype–phenotype workflow, as described.</w:t>
+        <w:t xml:space="preserve"> for which joint phenotypic and genotypic data were available: focusing on MIC values against six beta-lactams and amino acid sequences of the transpeptidase regions of PBPs. We have three objectives: I) quantitatively visualise and interpret continuous covariation in susceptibility across six beta-lactams; II) examine how these phenotypes associate with specific phylogenetic lineages (MLSTs); and III) identify and rank PBP amino acid substitutions according to the strength and consistency of their association with increased beta-lactam MIC. In addition, we demonstrate the approach mitigates common experimental issues – measurement error, censored MIC values, missing data – and increases the resolution of genotype-phenotype associations, including the detection of epistatic effects for experimental follow-up. Together,</w:t>
+      </w:r>
+      <w:r>
+        <w:rPr>
+          <w:rtl w:val="0"/>
+        </w:rPr>
+        <w:t xml:space="preserve"> we show the method allows for a more quantitative comparison of MIC values, which improves visualisation and experimental-error handling, allows comparison of multivariate distance metrics, and helps identify correlations and constraints on multivariate phenotypes.</w:t>
+      </w:r>
+      <w:r>
+        <w:rPr>
+          <w:rtl w:val="0"/>
+        </w:rPr>
       </w:r>
     </w:p>
     <w:p>
@@ -1836,8 +1790,8 @@
         <w:jc w:val="left"/>
         <w:rPr/>
       </w:pPr>
-      <w:bookmarkStart w:colFirst="0" w:colLast="0" w:name="_i6dyyw70ce6x" w:id="2"/>
-      <w:bookmarkEnd w:id="2"/>
+      <w:bookmarkStart w:colFirst="0" w:colLast="0" w:name="_i6dyyw70ce6x" w:id="1"/>
+      <w:bookmarkEnd w:id="1"/>
       <w:r>
         <w:br w:type="page"/>
       </w:r>
@@ -1854,8 +1808,8 @@
         <w:jc w:val="left"/>
         <w:rPr/>
       </w:pPr>
-      <w:bookmarkStart w:colFirst="0" w:colLast="0" w:name="_ncltnvess8m8" w:id="3"/>
-      <w:bookmarkEnd w:id="3"/>
+      <w:bookmarkStart w:colFirst="0" w:colLast="0" w:name="_ncltnvess8m8" w:id="2"/>
+      <w:bookmarkEnd w:id="2"/>
       <w:r>
         <w:rPr>
           <w:rtl w:val="0"/>
@@ -1870,8 +1824,8 @@
         <w:jc w:val="left"/>
         <w:rPr/>
       </w:pPr>
-      <w:bookmarkStart w:colFirst="0" w:colLast="0" w:name="_xbdb69u1dc1s" w:id="4"/>
-      <w:bookmarkEnd w:id="4"/>
+      <w:bookmarkStart w:colFirst="0" w:colLast="0" w:name="_xbdb69u1dc1s" w:id="3"/>
+      <w:bookmarkEnd w:id="3"/>
       <w:r>
         <w:rPr>
           <w:rtl w:val="0"/>
@@ -2039,8 +1993,8 @@
           <w:szCs w:val="17"/>
         </w:rPr>
       </w:pPr>
-      <w:bookmarkStart w:colFirst="0" w:colLast="0" w:name="_baibfq2tq00h" w:id="5"/>
-      <w:bookmarkEnd w:id="5"/>
+      <w:bookmarkStart w:colFirst="0" w:colLast="0" w:name="_baibfq2tq00h" w:id="4"/>
+      <w:bookmarkEnd w:id="4"/>
       <w:r>
         <w:rPr>
           <w:b w:val="1"/>
@@ -2416,8 +2370,8 @@
           <w:bCs w:val="1"/>
         </w:rPr>
       </w:pPr>
-      <w:bookmarkStart w:colFirst="0" w:colLast="0" w:name="_43s0pafbxqt4" w:id="6"/>
-      <w:bookmarkEnd w:id="6"/>
+      <w:bookmarkStart w:colFirst="0" w:colLast="0" w:name="_43s0pafbxqt4" w:id="5"/>
+      <w:bookmarkEnd w:id="5"/>
       <w:r>
         <w:rPr>
           <w:b w:val="1"/>
@@ -2603,8 +2557,8 @@
         <w:pStyle w:val="Heading1"/>
         <w:rPr/>
       </w:pPr>
-      <w:bookmarkStart w:colFirst="0" w:colLast="0" w:name="_kw4qr6tv2s0l" w:id="7"/>
-      <w:bookmarkEnd w:id="7"/>
+      <w:bookmarkStart w:colFirst="0" w:colLast="0" w:name="_kw4qr6tv2s0l" w:id="6"/>
+      <w:bookmarkEnd w:id="6"/>
       <w:r>
         <w:rPr>
           <w:rtl w:val="0"/>
@@ -2652,7 +2606,19 @@
           <w:rFonts w:ascii="Arial Unicode MS" w:cs="Arial Unicode MS" w:eastAsia="Arial Unicode MS" w:hAnsi="Arial Unicode MS"/>
           <w:rtl w:val="0"/>
         </w:rPr>
-        <w:t xml:space="preserve">We analysed 3,628 invasive pneumococcal isolates from the Active Bacterial Core (ABC) surveillance program, with MICs measured for six beta-lactam antibiotics using two-fold microbroth dilution. Across the entire collection, most isolates exhibited low MIC values for all six antibiotics, reflecting a high level of susceptibility to the drugs. Despite this, MIC values varied considerably across isolates–with penicillin MICs ranging from ≤0.03 to ≥8μg/mL. MIC values were positively correlated across all beta-lactams, although the strength of these correlations varied, particularly among drugs with many upper and lower censored values e.g. cefuroxime (Pearson correlation coefficients = 0.77-0.96). </w:t>
+        <w:t xml:space="preserve">We analysed 3,628 invasive pneumococcal isolates from the Active Bacterial Core (ABC) surveillance program, with MICs measured for six beta-lactam antibiotics using two-fold microbroth dilution. Across the entire collection, most isolates exhibited low MIC values for all six antibiotics, reflecting a high level of susceptibility to the drugs. Despite this, MIC values varied considerably across isolates, with penicillin MICs ranging from ≤0.03 to ≥8μg/mL. MIC values were positively correlated across all beta-lactams, although the strength of these correlations varied, particularly among drugs </w:t>
+      </w:r>
+      <w:r>
+        <w:rPr>
+          <w:rtl w:val="0"/>
+        </w:rPr>
+        <w:t xml:space="preserve">with a smaller range of MIC values</w:t>
+      </w:r>
+      <w:r>
+        <w:rPr>
+          <w:rtl w:val="0"/>
+        </w:rPr>
+        <w:t xml:space="preserve"> e.g. cefuroxime (Pearson correlation coefficients = 0.77-0.96; Figure 1A). </w:t>
       </w:r>
     </w:p>
     <w:p>
@@ -2831,7 +2797,7 @@
         <w:rPr>
           <w:rtl w:val="0"/>
         </w:rPr>
-        <w:t xml:space="preserve">For example, isolates with intermediate penicillin MIC (0.12–1μg/mL) varied widely in their MIC values for other drugs, sometimes differing by up to six two-fold dilution steps, yet remaining below the clinical breakpoint for penicillin (2μg/mL) (Figure 1).</w:t>
+        <w:t xml:space="preserve">For example, isolates with intermediate penicillin MIC (0.12–1μg/mL) varied widely in their MIC values for other drugs, sometimes differing by up to six two-fold dilution steps, yet remaining below the clinical breakpoint for penicillin (2μg/mL) (Figure 1C).</w:t>
       </w:r>
       <w:r>
         <w:rPr>
@@ -2901,7 +2867,19 @@
         <w:rPr>
           <w:rtl w:val="0"/>
         </w:rPr>
-        <w:t xml:space="preserve">agonal distribution of isolates on the map reflects the strong positive correlations in MIC values across beta-lactams, but also demonstrates that correlations between different drugs are not perfectly linear.</w:t>
+        <w:t xml:space="preserve">agonal distribution of isolates on the map reflects the strong positive correlations in MIC values across beta-lactams, </w:t>
+      </w:r>
+      <w:r>
+        <w:rPr>
+          <w:rtl w:val="0"/>
+        </w:rPr>
+        <w:t xml:space="preserve">but the two dimensions required to represent the phenotypes demonstrate</w:t>
+      </w:r>
+      <w:r>
+        <w:rPr>
+          <w:rtl w:val="0"/>
+        </w:rPr>
+        <w:t xml:space="preserve"> that correlations between different drugs are not perfectly linear.</w:t>
       </w:r>
       <w:r>
         <w:rPr>
@@ -2953,7 +2931,7 @@
         <w:rPr>
           <w:rtl w:val="0"/>
         </w:rPr>
-        <w:t xml:space="preserve">, Supplementary Figure 2). This indicates that a two-dimensional map is an accurate representation of this set of MIC values. The map also displayed high stability across a range of resampling, dimensionality, and cross-validation tests (Supplementary Sections S1.7-1.10). </w:t>
+        <w:t xml:space="preserve">, Supplementary Figure S2). This indicates that a two-dimensional map is an accurate representation of this set of MIC values. The map also displayed high stability across a range of resampling, dimensionality, and cross-validation tests (Supplementary Sections S1.7-1.10). </w:t>
       </w:r>
     </w:p>
     <w:p>
@@ -3006,7 +2984,7 @@
         <w:rPr>
           <w:rtl w:val="0"/>
         </w:rPr>
-        <w:t xml:space="preserve">lthough mean pairwise error values appear low across all dimensions, this is due to the fact that many isolates exhibited uniformly low, censored MIC values, and were consequently well fit in a single dimension. However, phenotypes with elevated MIC contributed proportionally much higher stress when represented in a single dimension, as indicated by the higher pairwise error and decrease in stress values.</w:t>
+        <w:t xml:space="preserve">lthough mean pairwise error values appear low across all dimensions, this is due to the fact that many isolates exhibited uniformly low, censored MIC values (i.e. below the dilution range of the assay), and were consequently well fit in a single dimension. However, phenotypes with elevated MIC contributed proportionally much higher stress when represented in a single dimension, as indicated by the higher pairwise error and decrease in stress values.</w:t>
       </w:r>
       <w:r>
         <w:rPr>
@@ -3044,7 +3022,22 @@
           <w:color w:val="0e0e0e"/>
           <w:rtl w:val="0"/>
         </w:rPr>
-        <w:t xml:space="preserve">While higher-dimensional projections further reduced error (Table 1), improvements beyond two dimensions were more modest, suggesting 2D maps adequately capture key phenotypic patterns for this dataset. Moreover, as</w:t>
+        <w:t xml:space="preserve">While higher-dimensional projections further reduced error (Table 1), improvements beyond two dimensions were more modest (e.g., 2D to 3D results in a projection error of 0.012 MIC units - less than the error of MIC testing), suggesting 2D maps adequately capture key phenotypic patterns for this dataset </w:t>
+      </w:r>
+      <w:hyperlink r:id="rId51">
+        <w:r>
+          <w:rPr>
+            <w:rtl w:val="0"/>
+          </w:rPr>
+          <w:t xml:space="preserve">(54)</w:t>
+        </w:r>
+      </w:hyperlink>
+      <w:r>
+        <w:rPr>
+          <w:color w:val="0e0e0e"/>
+          <w:rtl w:val="0"/>
+        </w:rPr>
+        <w:t xml:space="preserve">. Moreover, as</w:t>
       </w:r>
       <w:r>
         <w:rPr>
@@ -3070,10 +3063,10 @@
         <w:ind w:left="0"/>
         <w:rPr/>
         <w:sectPr>
-          <w:headerReference r:id="rId51" w:type="default"/>
-          <w:footerReference r:id="rId52" w:type="default"/>
-          <w:footerReference r:id="rId53" w:type="first"/>
-          <w:footerReference r:id="rId54" w:type="even"/>
+          <w:headerReference r:id="rId52" w:type="default"/>
+          <w:footerReference r:id="rId53" w:type="default"/>
+          <w:footerReference r:id="rId54" w:type="first"/>
+          <w:footerReference r:id="rId55" w:type="even"/>
           <w:pgSz w:h="16840" w:w="11900" w:orient="portrait"/>
           <w:pgMar w:bottom="1440" w:top="1440" w:left="1440" w:right="1440" w:header="708" w:footer="708"/>
           <w:pgNumType w:start="1"/>
@@ -3104,7 +3097,7 @@
                     <pic:cNvPicPr preferRelativeResize="0"/>
                   </pic:nvPicPr>
                   <pic:blipFill>
-                    <a:blip r:embed="rId55"/>
+                    <a:blip r:embed="rId56"/>
                     <a:srcRect b="10061" l="0" r="0" t="8537"/>
                     <a:stretch>
                       <a:fillRect/>
@@ -3438,8 +3431,8 @@
         <w:jc w:val="left"/>
         <w:rPr/>
       </w:pPr>
-      <w:bookmarkStart w:colFirst="0" w:colLast="0" w:name="_4f1mdlm" w:id="8"/>
-      <w:bookmarkEnd w:id="8"/>
+      <w:bookmarkStart w:colFirst="0" w:colLast="0" w:name="_4f1mdlm" w:id="7"/>
+      <w:bookmarkEnd w:id="7"/>
       <w:r>
         <w:rPr>
           <w:rtl w:val="0"/>
@@ -3508,8 +3501,8 @@
                 <w:szCs w:val="20"/>
               </w:rPr>
             </w:pPr>
-            <w:bookmarkStart w:colFirst="0" w:colLast="0" w:name="_2u6wntf" w:id="9"/>
-            <w:bookmarkEnd w:id="9"/>
+            <w:bookmarkStart w:colFirst="0" w:colLast="0" w:name="_2u6wntf" w:id="8"/>
+            <w:bookmarkEnd w:id="8"/>
             <w:r>
               <w:rPr>
                 <w:b w:val="1"/>
@@ -5132,7 +5125,7 @@
         <w:rPr>
           <w:rtl w:val="0"/>
         </w:rPr>
-        <w:t xml:space="preserve">Theoretically, by positioning isolates using data from multiple drugs, the map can use the associations between them to more accurately infer MIC values–even when underlying data is missing or inaccurate. In principle, this means the map can offer greater accuracy than using MIC values for any single drug individually. We tested whether this was the case by assessing whether the map could alleviate common measurement issues in resistance surveillance datasets, such as missing values, experimental error, and combining multiple assay methods. </w:t>
+        <w:t xml:space="preserve">Theoretically, by positioning isolates using data from multiple drugs, the map can use the associations between them to more accurately infer MIC values, even when underlying data is missing or inaccurate. In principle, this means the map can offer greater accuracy than using MIC values for any single drug individually. We tested whether this was the case by assessing whether the map could alleviate common measurement issues in resistance surveillance datasets, such as missing values, experimental error, and combining multiple assay methods. </w:t>
       </w:r>
     </w:p>
     <w:p>
@@ -5159,7 +5152,7 @@
         <w:rPr>
           <w:rtl w:val="0"/>
         </w:rPr>
-        <w:t xml:space="preserve">Across 100 iterations, 86.8% of prediction errors for missing MIC values were within a single MIC dilution (mean error = 0.467)—</w:t>
+        <w:t xml:space="preserve">Across 100 iterations, 86.8% of predictions for missing MIC values were within a single MIC dilution of the true value (mean error = 0.467)—</w:t>
       </w:r>
       <w:r>
         <w:rPr>
@@ -5167,12 +5160,12 @@
         </w:rPr>
         <w:t xml:space="preserve">the range of error expected if isolates were remeasured experimentally </w:t>
       </w:r>
-      <w:hyperlink r:id="rId56">
+      <w:hyperlink r:id="rId57">
         <w:r>
           <w:rPr>
             <w:rtl w:val="0"/>
           </w:rPr>
-          <w:t xml:space="preserve">(15,16,54)</w:t>
+          <w:t xml:space="preserve">(15,16,55)</w:t>
         </w:r>
       </w:hyperlink>
       <w:r>
@@ -5312,8 +5305,8 @@
         <w:jc w:val="left"/>
         <w:rPr/>
       </w:pPr>
-      <w:bookmarkStart w:colFirst="0" w:colLast="0" w:name="_4f1mdlm" w:id="8"/>
-      <w:bookmarkEnd w:id="8"/>
+      <w:bookmarkStart w:colFirst="0" w:colLast="0" w:name="_4f1mdlm" w:id="7"/>
+      <w:bookmarkEnd w:id="7"/>
       <w:r>
         <w:rPr>
           <w:rtl w:val="0"/>
@@ -5381,8 +5374,8 @@
                 <w:szCs w:val="20"/>
               </w:rPr>
             </w:pPr>
-            <w:bookmarkStart w:colFirst="0" w:colLast="0" w:name="_2u6wntf" w:id="9"/>
-            <w:bookmarkEnd w:id="9"/>
+            <w:bookmarkStart w:colFirst="0" w:colLast="0" w:name="_2u6wntf" w:id="8"/>
+            <w:bookmarkEnd w:id="8"/>
             <w:r>
               <w:rPr>
                 <w:b w:val="1"/>
@@ -6441,9 +6434,21 @@
         <w:rPr>
           <w:rtl w:val="0"/>
         </w:rPr>
-        <w:t xml:space="preserve">Previous findings have shown elevated MIC correlates with genetic divergence among PBPs </w:t>
-      </w:r>
-      <w:hyperlink r:id="rId57">
+        <w:t xml:space="preserve">Previous findings have shown PBP types containing </w:t>
+      </w:r>
+      <w:r>
+        <w:rPr>
+          <w:rtl w:val="0"/>
+        </w:rPr>
+        <w:t xml:space="preserve">divergent </w:t>
+      </w:r>
+      <w:r>
+        <w:rPr>
+          <w:rtl w:val="0"/>
+        </w:rPr>
+        <w:t xml:space="preserve">transpeptidase sequences typically display elevated MIC </w:t>
+      </w:r>
+      <w:hyperlink r:id="rId58">
         <w:r>
           <w:rPr>
             <w:rtl w:val="0"/>
@@ -6556,7 +6561,7 @@
                     <pic:cNvPicPr preferRelativeResize="0"/>
                   </pic:nvPicPr>
                   <pic:blipFill>
-                    <a:blip r:embed="rId58"/>
+                    <a:blip r:embed="rId59"/>
                     <a:srcRect b="0" l="0" r="0" t="0"/>
                     <a:stretch>
                       <a:fillRect/>
@@ -6729,7 +6734,7 @@
         </w:rPr>
         <w:t xml:space="preserve"> methods increase statistical power to identify substitutions with effects on multiple drugs, potentially revealing trade-offs between beta-lactam subclasses </w:t>
       </w:r>
-      <w:hyperlink r:id="rId59">
+      <w:hyperlink r:id="rId60">
         <w:r>
           <w:rPr>
             <w:rtl w:val="0"/>
@@ -6881,7 +6886,7 @@
         </w:rPr>
         <w:t xml:space="preserve">everal high-ranking substitutions mapped to or near conserved PBP active-site motifs (Supplementary File 1). For example, in PBP2X, I371T, A369V, L364F, and M343T formed a cluster near the active site between the S337TMK and S395SN motifs, while V523L and S531Y lay closer to the K547SG motif </w:t>
       </w:r>
-      <w:hyperlink r:id="rId60">
+      <w:hyperlink r:id="rId61">
         <w:r>
           <w:rPr>
             <w:rtl w:val="0"/>
@@ -6895,7 +6900,7 @@
         </w:rPr>
         <w:t xml:space="preserve">. In PBP1A, T371S was within the S370TMK motif, and several further candidates lay between S370TMK and S466SN or downstream of K557TG. Moreover, PBP2B candidates with subclass-specific effects were located between S443SN and K615TG, including L609S near K615TG </w:t>
       </w:r>
-      <w:hyperlink r:id="rId61">
+      <w:hyperlink r:id="rId62">
         <w:r>
           <w:rPr>
             <w:rtl w:val="0"/>
@@ -7058,7 +7063,21 @@
         <w:rPr>
           <w:rtl w:val="0"/>
         </w:rPr>
-        <w:t xml:space="preserve">After assessing PBP positions previously identified by GWAS, random forest, and in vitro methods, we found that combining the cartography framework with several multivariate tests improved overlap with these prior evidence sources relative to any single method</w:t>
+        <w:t xml:space="preserve">After assessing PBP positions previously identified by GWAS, random forest, and </w:t>
+      </w:r>
+      <w:r>
+        <w:rPr>
+          <w:i w:val="1"/>
+          <w:iCs w:val="1"/>
+          <w:rtl w:val="0"/>
+        </w:rPr>
+        <w:t xml:space="preserve">in vitro</w:t>
+      </w:r>
+      <w:r>
+        <w:rPr>
+          <w:rtl w:val="0"/>
+        </w:rPr>
+        <w:t xml:space="preserve"> methods, we found that combining the cartography framework with several multivariate tests improved overlap with these prior evidence sources relative to any single method</w:t>
       </w:r>
       <w:r>
         <w:rPr>
@@ -7082,7 +7101,7 @@
         <w:rPr>
           <w:rtl w:val="0"/>
         </w:rPr>
-        <w:t xml:space="preserve"> Moreover, we compared the results of the multivariate mvLMM to conventional univariate methods applied to individual MICs for each drug. Multivariate mvLMMs detected 123 candidate substitutions at 107 PBP positions which were not identified by univariate LMMs on MICs for each drug individually (Table 3 and Supplementary Section S3.3). These included several substitutions with contrasting subclass effects—such as those in PBP1A and PBP2B—many of which were also supported by both clustering and single-substitution analyses</w:t>
+        <w:t xml:space="preserve"> We also compared the results of the multivariate mvLMM to conventional univariate methods applied to individual MICs for each drug. Multivariate mvLMMs detected 123 candidate substitutions at 107 PBP positions which were not identified by univariate LMMs on MICs for each drug individually (Table 3 and Supplementary Section S3.3). These included several substitutions with contrasting subclass effects—such as those in PBP1A and PBP2B—many of which were also supported by both clustering and single-substitution analyses</w:t>
       </w:r>
       <w:r>
         <w:rPr>
@@ -7142,7 +7161,7 @@
                     <pic:cNvPicPr preferRelativeResize="0"/>
                   </pic:nvPicPr>
                   <pic:blipFill>
-                    <a:blip r:embed="rId62"/>
+                    <a:blip r:embed="rId63"/>
                     <a:srcRect b="704" l="0" r="0" t="12053"/>
                     <a:stretch>
                       <a:fillRect/>
@@ -7276,7 +7295,23 @@
           <w:szCs w:val="20"/>
           <w:rtl w:val="0"/>
         </w:rPr>
-        <w:t xml:space="preserve">. The shaded areas highlight the distribution of the groups that differ in their amino acid at this location, while the coloured crosses and black line represent the median centroid positions and the phenotypic distance between them respectively. C) Amino acid changes can be visualised on the map by colouring isolates by the amino acid at a given </w:t>
+        <w:t xml:space="preserve">. The shaded areas highlight the distribution of the groups that differ in their amino acid at this location, while the coloured crosses and black line represent the median centroid positions and the phenotypic distance between them respectively. </w:t>
+      </w:r>
+      <w:r>
+        <w:rPr>
+          <w:sz w:val="20"/>
+          <w:szCs w:val="20"/>
+          <w:rtl w:val="0"/>
+        </w:rPr>
+        <w:t xml:space="preserve">C) </w:t>
+      </w:r>
+      <w:r>
+        <w:rPr>
+          <w:sz w:val="20"/>
+          <w:szCs w:val="20"/>
+          <w:rtl w:val="0"/>
+        </w:rPr>
+        <w:t xml:space="preserve">Amino acid changes can be visualised on the map by colouring isolates by the amino acid at a given </w:t>
       </w:r>
       <w:r>
         <w:rPr>
@@ -17720,7 +17755,7 @@
         <w:rPr>
           <w:rtl w:val="0"/>
         </w:rPr>
-        <w:t xml:space="preserve">In this study, we developed a multivariate framework for analysing complex, continuous resistance phenotypes and applied it to 3,628 </w:t>
+        <w:t xml:space="preserve">In this study, we developed Antimicrobial Resistance Cartography, a multivariate framework for analysing complex, continuous resistance phenotypes and applied it to 3,628 </w:t>
       </w:r>
       <w:r>
         <w:rPr>
@@ -17747,45 +17782,45 @@
           <w:rtl w:val="0"/>
         </w:rPr>
         <w:t xml:space="preserve">loss. Although susceptibility profiles were highly correlated across drugs, phenotypes deviated from a strictly linear path, as shown by the improved fit of a two-dimensional over a one-dimensional map. We hypothesise these divergences arise from intrinsic variation in drug-protein binding and the relative use of specific beta-lactam subclasses across populations </w:t>
-      </w:r>
-      <w:hyperlink r:id="rId63">
-        <w:r>
-          <w:rPr>
-            <w:rtl w:val="0"/>
-          </w:rPr>
-          <w:t xml:space="preserve">(44,55)</w:t>
-        </w:r>
-      </w:hyperlink>
-      <w:r>
-        <w:rPr>
-          <w:rtl w:val="0"/>
-        </w:rPr>
-        <w:t xml:space="preserve">. </w:t>
-      </w:r>
-      <w:r>
-        <w:rPr>
-          <w:rtl w:val="0"/>
-        </w:rPr>
-        <w:t xml:space="preserve">Second, </w:t>
-      </w:r>
-      <w:r>
-        <w:rPr>
-          <w:rtl w:val="0"/>
-        </w:rPr>
-        <w:t xml:space="preserve">genetic background was strongly associated with resistance phenotype, with many substitutions only appearing on the background of </w:t>
-      </w:r>
-      <w:r>
-        <w:rPr>
-          <w:rtl w:val="0"/>
-        </w:rPr>
-        <w:t xml:space="preserve">others, a result consistent with previous findings, but demonstrated here across multiple beta-lactam subclasses </w:t>
       </w:r>
       <w:hyperlink r:id="rId64">
         <w:r>
           <w:rPr>
             <w:rtl w:val="0"/>
           </w:rPr>
-          <w:t xml:space="preserve">(8,38,56)</w:t>
+          <w:t xml:space="preserve">(44,56)</w:t>
+        </w:r>
+      </w:hyperlink>
+      <w:r>
+        <w:rPr>
+          <w:rtl w:val="0"/>
+        </w:rPr>
+        <w:t xml:space="preserve">. </w:t>
+      </w:r>
+      <w:r>
+        <w:rPr>
+          <w:rtl w:val="0"/>
+        </w:rPr>
+        <w:t xml:space="preserve">Second, </w:t>
+      </w:r>
+      <w:r>
+        <w:rPr>
+          <w:rtl w:val="0"/>
+        </w:rPr>
+        <w:t xml:space="preserve">genetic background was strongly associated with resistance phenotype, with many substitutions only appearing on the background of </w:t>
+      </w:r>
+      <w:r>
+        <w:rPr>
+          <w:rtl w:val="0"/>
+        </w:rPr>
+        <w:t xml:space="preserve">others, a result consistent with previous findings, but demonstrated here across multiple beta-lactam subclasses </w:t>
+      </w:r>
+      <w:hyperlink r:id="rId65">
+        <w:r>
+          <w:rPr>
+            <w:rtl w:val="0"/>
+          </w:rPr>
+          <w:t xml:space="preserve">(8,38,57)</w:t>
         </w:r>
       </w:hyperlink>
       <w:r>
@@ -17956,44 +17991,44 @@
         </w:rPr>
         <w:t xml:space="preserve">methods </w:t>
       </w:r>
-      <w:hyperlink r:id="rId65">
-        <w:r>
-          <w:rPr>
-            <w:rtl w:val="0"/>
-          </w:rPr>
-          <w:t xml:space="preserve">(8,57)</w:t>
-        </w:r>
-      </w:hyperlink>
-      <w:r>
-        <w:rPr>
-          <w:rtl w:val="0"/>
-        </w:rPr>
-        <w:t xml:space="preserve">.</w:t>
-      </w:r>
-      <w:r>
-        <w:rPr>
-          <w:rtl w:val="0"/>
-        </w:rPr>
-        <w:t xml:space="preserve"> Moreover, we also introduced several </w:t>
-      </w:r>
-      <w:r>
-        <w:rPr>
-          <w:rtl w:val="0"/>
-        </w:rPr>
-        <w:t xml:space="preserve">methodological </w:t>
-      </w:r>
-      <w:r>
-        <w:rPr>
-          <w:rtl w:val="0"/>
-        </w:rPr>
-        <w:t xml:space="preserve">refinements to genotype-phenotype association testing in bacteria, such as fine-mapping within specific genomic regions and using amino acid changes rather than nucleotides </w:t>
-      </w:r>
       <w:hyperlink r:id="rId66">
         <w:r>
           <w:rPr>
             <w:rtl w:val="0"/>
           </w:rPr>
-          <w:t xml:space="preserve">(33,51,58)</w:t>
+          <w:t xml:space="preserve">(8,58)</w:t>
+        </w:r>
+      </w:hyperlink>
+      <w:r>
+        <w:rPr>
+          <w:rtl w:val="0"/>
+        </w:rPr>
+        <w:t xml:space="preserve">.</w:t>
+      </w:r>
+      <w:r>
+        <w:rPr>
+          <w:rtl w:val="0"/>
+        </w:rPr>
+        <w:t xml:space="preserve"> Moreover, we also introduced several </w:t>
+      </w:r>
+      <w:r>
+        <w:rPr>
+          <w:rtl w:val="0"/>
+        </w:rPr>
+        <w:t xml:space="preserve">methodological </w:t>
+      </w:r>
+      <w:r>
+        <w:rPr>
+          <w:rtl w:val="0"/>
+        </w:rPr>
+        <w:t xml:space="preserve">refinements to genotype-phenotype association testing in bacteria, such as fine-mapping within specific genomic regions and using amino acid changes rather than nucleotides </w:t>
+      </w:r>
+      <w:hyperlink r:id="rId67">
+        <w:r>
+          <w:rPr>
+            <w:rtl w:val="0"/>
+          </w:rPr>
+          <w:t xml:space="preserve">(33,51,59)</w:t>
         </w:r>
       </w:hyperlink>
       <w:r>
@@ -18091,7 +18126,7 @@
         </w:rPr>
         <w:t xml:space="preserve"> due to its complex genetic basis and phenotypic variation and covariation </w:t>
       </w:r>
-      <w:hyperlink r:id="rId67">
+      <w:hyperlink r:id="rId68">
         <w:r>
           <w:rPr>
             <w:rtl w:val="0"/>
@@ -18155,7 +18190,7 @@
         </w:rPr>
         <w:t xml:space="preserve">where phenotypic data are unavailable, or novel combinations of substitutions emerge </w:t>
       </w:r>
-      <w:hyperlink r:id="rId68">
+      <w:hyperlink r:id="rId69">
         <w:r>
           <w:rPr>
             <w:rtl w:val="0"/>
@@ -18204,12 +18239,12 @@
         </w:rPr>
         <w:t xml:space="preserve"> experimental testing will be required to demonstrate the phenotypic effects of these substitutions, this list of markers may help in identifying emerging resistance during clinical interventions, such as serotype displacement after vaccination </w:t>
       </w:r>
-      <w:hyperlink r:id="rId69">
+      <w:hyperlink r:id="rId70">
         <w:r>
           <w:rPr>
             <w:rtl w:val="0"/>
           </w:rPr>
-          <w:t xml:space="preserve">(59)</w:t>
+          <w:t xml:space="preserve">(60)</w:t>
         </w:r>
       </w:hyperlink>
       <w:r>
@@ -18329,7 +18364,7 @@
         </w:rPr>
         <w:t xml:space="preserve"> highlighted 31 and 27 positions as associated with high-level MIC to beta-lactams respectively </w:t>
       </w:r>
-      <w:hyperlink r:id="rId70">
+      <w:hyperlink r:id="rId71">
         <w:r>
           <w:rPr>
             <w:rtl w:val="0"/>
@@ -18358,7 +18393,7 @@
         </w:rPr>
         <w:t xml:space="preserve">the greater sensitivity of multivariate approaches in detecting subtle and correlated genotype-phenotype associations </w:t>
       </w:r>
-      <w:hyperlink r:id="rId71">
+      <w:hyperlink r:id="rId72">
         <w:r>
           <w:rPr>
             <w:rtl w:val="0"/>
@@ -18424,100 +18459,100 @@
         </w:rPr>
         <w:t xml:space="preserve">he presence of such variants among bacterial populations suggests small, incremental MIC changes are epidemiologically relevant–either by directly contributing to treatment failure rates or by facilitating stepwise progression toward clinically significant resistance </w:t>
       </w:r>
-      <w:hyperlink r:id="rId72">
-        <w:r>
-          <w:rPr>
-            <w:rtl w:val="0"/>
-          </w:rPr>
-          <w:t xml:space="preserve">(14,31,60)</w:t>
-        </w:r>
-      </w:hyperlink>
-      <w:r>
-        <w:rPr>
-          <w:rtl w:val="0"/>
-        </w:rPr>
-        <w:t xml:space="preserve">. Even if transitory, these changes may confer competitive advantages under variable drug exposure, such as in carriage sites or biofilm formations </w:t>
-      </w:r>
       <w:hyperlink r:id="rId73">
         <w:r>
           <w:rPr>
             <w:rtl w:val="0"/>
           </w:rPr>
-          <w:t xml:space="preserve">(14,20,61)</w:t>
+          <w:t xml:space="preserve">(14,31,61)</w:t>
         </w:r>
       </w:hyperlink>
       <w:r>
         <w:rPr>
           <w:rtl w:val="0"/>
         </w:rPr>
-        <w:t xml:space="preserve">. Early detection of such changes is therefore essential for informing treatment guidelines and pre-empting the emergence of high-level resistance </w:t>
+        <w:t xml:space="preserve">. Even if transitory, these changes may confer competitive advantages under variable drug exposure, such as in carriage sites or biofilm formations </w:t>
       </w:r>
       <w:hyperlink r:id="rId74">
         <w:r>
           <w:rPr>
             <w:rtl w:val="0"/>
           </w:rPr>
-          <w:t xml:space="preserve">(31,60)</w:t>
+          <w:t xml:space="preserve">(14,20,62)</w:t>
         </w:r>
       </w:hyperlink>
       <w:r>
         <w:rPr>
           <w:rtl w:val="0"/>
         </w:rPr>
-        <w:t xml:space="preserve">. Further </w:t>
-      </w:r>
-      <w:r>
-        <w:rPr>
-          <w:i w:val="1"/>
-          <w:iCs w:val="1"/>
-          <w:rtl w:val="0"/>
-        </w:rPr>
-        <w:t xml:space="preserve">in vitro </w:t>
-      </w:r>
-      <w:r>
-        <w:rPr>
-          <w:rtl w:val="0"/>
-        </w:rPr>
-        <w:t xml:space="preserve">validation of these substitutions will be required, including in additional </w:t>
-      </w:r>
-      <w:r>
-        <w:rPr>
-          <w:rtl w:val="0"/>
-        </w:rPr>
-        <w:t xml:space="preserve">isolate</w:t>
-      </w:r>
-      <w:r>
-        <w:rPr>
-          <w:rtl w:val="0"/>
-        </w:rPr>
-        <w:t xml:space="preserve"> collections, as well as exploration of other genomic regions known to affect beta-lactam MIC (</w:t>
-      </w:r>
-      <w:r>
-        <w:rPr>
-          <w:rtl w:val="0"/>
-        </w:rPr>
-        <w:t xml:space="preserve">e.g. </w:t>
-      </w:r>
-      <w:r>
-        <w:rPr>
-          <w:i w:val="1"/>
-          <w:iCs w:val="1"/>
-          <w:rtl w:val="0"/>
-        </w:rPr>
-        <w:t xml:space="preserve">murM</w:t>
-      </w:r>
-      <w:r>
-        <w:rPr>
-          <w:rtl w:val="0"/>
-        </w:rPr>
-        <w:t xml:space="preserve">) </w:t>
+        <w:t xml:space="preserve">. Early detection of such changes is therefore essential for informing treatment guidelines and pre-empting the emergence of high-level resistance </w:t>
       </w:r>
       <w:hyperlink r:id="rId75">
         <w:r>
           <w:rPr>
             <w:rtl w:val="0"/>
           </w:rPr>
-          <w:t xml:space="preserve">(56)</w:t>
+          <w:t xml:space="preserve">(31,61)</w:t>
+        </w:r>
+      </w:hyperlink>
+      <w:r>
+        <w:rPr>
+          <w:rtl w:val="0"/>
+        </w:rPr>
+        <w:t xml:space="preserve">. Further </w:t>
+      </w:r>
+      <w:r>
+        <w:rPr>
+          <w:i w:val="1"/>
+          <w:iCs w:val="1"/>
+          <w:rtl w:val="0"/>
+        </w:rPr>
+        <w:t xml:space="preserve">in vitro </w:t>
+      </w:r>
+      <w:r>
+        <w:rPr>
+          <w:rtl w:val="0"/>
+        </w:rPr>
+        <w:t xml:space="preserve">validation of these substitutions will be required, including in additional </w:t>
+      </w:r>
+      <w:r>
+        <w:rPr>
+          <w:rtl w:val="0"/>
+        </w:rPr>
+        <w:t xml:space="preserve">isolate</w:t>
+      </w:r>
+      <w:r>
+        <w:rPr>
+          <w:rtl w:val="0"/>
+        </w:rPr>
+        <w:t xml:space="preserve"> collections, as well as exploration of other genomic regions known to affect beta-lactam MIC (</w:t>
+      </w:r>
+      <w:r>
+        <w:rPr>
+          <w:rtl w:val="0"/>
+        </w:rPr>
+        <w:t xml:space="preserve">e.g. </w:t>
+      </w:r>
+      <w:r>
+        <w:rPr>
+          <w:i w:val="1"/>
+          <w:iCs w:val="1"/>
+          <w:rtl w:val="0"/>
+        </w:rPr>
+        <w:t xml:space="preserve">murM</w:t>
+      </w:r>
+      <w:r>
+        <w:rPr>
+          <w:rtl w:val="0"/>
+        </w:rPr>
+        <w:t xml:space="preserve">) </w:t>
+      </w:r>
+      <w:hyperlink r:id="rId76">
+        <w:r>
+          <w:rPr>
+            <w:rtl w:val="0"/>
+          </w:rPr>
+          <w:t xml:space="preserve">(57)</w:t>
         </w:r>
       </w:hyperlink>
       <w:r>
@@ -18609,7 +18644,7 @@
         </w:rPr>
         <w:t xml:space="preserve"> </w:t>
       </w:r>
-      <w:hyperlink r:id="rId76">
+      <w:hyperlink r:id="rId77">
         <w:r>
           <w:rPr>
             <w:rtl w:val="0"/>
@@ -18647,7 +18682,7 @@
         <w:rPr>
           <w:rtl w:val="0"/>
         </w:rPr>
-        <w:t xml:space="preserve"> patterns are also reflected in the two-dimensional phenotype map, which shows that although PBP changes </w:t>
+        <w:t xml:space="preserve"> patterns are also highlighted by the two-dimensional phenotype map, which shows that although PBP changes </w:t>
       </w:r>
       <w:r>
         <w:rPr>
@@ -18721,7 +18756,7 @@
         </w:rPr>
         <w:t xml:space="preserve">, and the target-binding specificity of drug structures </w:t>
       </w:r>
-      <w:hyperlink r:id="rId77">
+      <w:hyperlink r:id="rId78">
         <w:r>
           <w:rPr>
             <w:rtl w:val="0"/>
@@ -18753,12 +18788,12 @@
         </w:rPr>
         <w:t xml:space="preserve">This is an important distinction, as substitutions with effects on multiple drugs have a greater capacity to evade multiple antibiotics, and how this affects their relative selection pressure may determine how resistance to the entire class of drugs might evolve. In future, these insights could inform therapeutic protocols that exploit collateral sensitivity or calibrate models of co-selection in response to interventions </w:t>
       </w:r>
-      <w:hyperlink r:id="rId78">
+      <w:hyperlink r:id="rId79">
         <w:r>
           <w:rPr>
             <w:rtl w:val="0"/>
           </w:rPr>
-          <w:t xml:space="preserve">(25,62,63)</w:t>
+          <w:t xml:space="preserve">(25,63,64)</w:t>
         </w:r>
       </w:hyperlink>
       <w:r>
@@ -18802,32 +18837,12 @@
         </w:rPr>
         <w:t xml:space="preserve">or recombination rate </w:t>
       </w:r>
-      <w:hyperlink r:id="rId79">
-        <w:r>
-          <w:rPr>
-            <w:rtl w:val="0"/>
-          </w:rPr>
-          <w:t xml:space="preserve">(5,7,64,65)</w:t>
-        </w:r>
-      </w:hyperlink>
-      <w:r>
-        <w:rPr>
-          <w:rtl w:val="0"/>
-        </w:rPr>
-        <w:t xml:space="preserve">.</w:t>
-      </w:r>
-      <w:r>
-        <w:rPr>
-          <w:rtl w:val="0"/>
-        </w:rPr>
-        <w:t xml:space="preserve"> Some MLSTs, including 320 and 156, shifted in prevalence following the introduction of pneumococcal conjugate vaccines–which coincided with increases in resistance frequencies due to serotype replacement </w:t>
-      </w:r>
       <w:hyperlink r:id="rId80">
         <w:r>
           <w:rPr>
             <w:rtl w:val="0"/>
           </w:rPr>
-          <w:t xml:space="preserve">(66,67)</w:t>
+          <w:t xml:space="preserve">(5,7,65,66)</w:t>
         </w:r>
       </w:hyperlink>
       <w:r>
@@ -18840,56 +18855,76 @@
         <w:rPr>
           <w:rtl w:val="0"/>
         </w:rPr>
-        <w:t xml:space="preserve"> These MLSTs (along with 558 and 1451), exhibited uniformly high MICs, consistent with highly divergent PBPs. In contrast, other MLSTs displayed narrower MIC ranges, suggesting weaker selective pressure for increased MIC. Notably, MLSTs 338 and 1373 displayed extensive PBP divergence yet only intermediate penicillin MICs, potentially due to contrasting phenotypic effects among their PBP2B substitutions. Together, these findings suggest </w:t>
-      </w:r>
-      <w:r>
-        <w:rPr>
-          <w:i w:val="1"/>
-          <w:iCs w:val="1"/>
-          <w:rtl w:val="0"/>
-        </w:rPr>
-        <w:t xml:space="preserve">S. pneumoniae </w:t>
-      </w:r>
-      <w:r>
-        <w:rPr>
-          <w:rtl w:val="0"/>
-        </w:rPr>
-        <w:t xml:space="preserve">can achieve elevated MICs through multiple distinct mutational combinations, that these combinations can be specific to certain lineages, and that they are likely shaped by the extensive epistatic effects among PBPs </w:t>
+        <w:t xml:space="preserve"> Some MLSTs, including 320 and 156, shifted in prevalence following the introduction of pneumococcal conjugate vaccines–which coincided with increases in resistance frequencies due to serotype replacement </w:t>
       </w:r>
       <w:hyperlink r:id="rId81">
         <w:r>
           <w:rPr>
             <w:rtl w:val="0"/>
           </w:rPr>
-          <w:t xml:space="preserve">(5,64,65)</w:t>
+          <w:t xml:space="preserve">(67,68)</w:t>
         </w:r>
       </w:hyperlink>
       <w:r>
         <w:rPr>
           <w:rtl w:val="0"/>
         </w:rPr>
-        <w:t xml:space="preserve">. This has practical implications for clinical surveillance, as tailoring treatment to genetic backgrounds may help slow the emergence of high-level resistance </w:t>
+        <w:t xml:space="preserve">.</w:t>
+      </w:r>
+      <w:r>
+        <w:rPr>
+          <w:rtl w:val="0"/>
+        </w:rPr>
+        <w:t xml:space="preserve"> These MLSTs (along with 558 and 1451), exhibited uniformly high MICs, consistent with highly divergent PBPs. In contrast, other MLSTs displayed narrower MIC ranges, suggesting weaker selective pressure for increased MIC. Notably, MLSTs 338 and 1373 displayed extensive PBP divergence yet only intermediate penicillin MICs, potentially due to contrasting phenotypic effects among their PBP2B substitutions. Together, these findings suggest </w:t>
+      </w:r>
+      <w:r>
+        <w:rPr>
+          <w:i w:val="1"/>
+          <w:iCs w:val="1"/>
+          <w:rtl w:val="0"/>
+        </w:rPr>
+        <w:t xml:space="preserve">S. pneumoniae </w:t>
+      </w:r>
+      <w:r>
+        <w:rPr>
+          <w:rtl w:val="0"/>
+        </w:rPr>
+        <w:t xml:space="preserve">can achieve elevated MICs through multiple distinct mutational combinations, that these combinations can be specific to certain lineages, and that they are likely shaped by the extensive epistatic effects among PBPs </w:t>
       </w:r>
       <w:hyperlink r:id="rId82">
         <w:r>
           <w:rPr>
             <w:rtl w:val="0"/>
           </w:rPr>
-          <w:t xml:space="preserve">(7,64)</w:t>
+          <w:t xml:space="preserve">(5,65,66)</w:t>
         </w:r>
       </w:hyperlink>
       <w:r>
         <w:rPr>
           <w:rtl w:val="0"/>
         </w:rPr>
-        <w:t xml:space="preserve">. More broadly, this highlights the importance of genetic background in shaping evolutionary trajectories in this species, as it demonstrates the fitness and phenotypic outcomes of individual mutations are likely context-dependent </w:t>
+        <w:t xml:space="preserve">. This has practical implications for clinical surveillance, as tailoring treatment to genetic backgrounds may help slow the emergence of high-level resistance </w:t>
       </w:r>
       <w:hyperlink r:id="rId83">
         <w:r>
           <w:rPr>
             <w:rtl w:val="0"/>
           </w:rPr>
-          <w:t xml:space="preserve">(7,38,40,56)</w:t>
+          <w:t xml:space="preserve">(7,65)</w:t>
+        </w:r>
+      </w:hyperlink>
+      <w:r>
+        <w:rPr>
+          <w:rtl w:val="0"/>
+        </w:rPr>
+        <w:t xml:space="preserve">. More broadly, this highlights the importance of genetic background in shaping evolutionary trajectories in this species, as it demonstrates the fitness and phenotypic outcomes of individual mutations are likely context-dependent </w:t>
+      </w:r>
+      <w:hyperlink r:id="rId84">
+        <w:r>
+          <w:rPr>
+            <w:rtl w:val="0"/>
+          </w:rPr>
+          <w:t xml:space="preserve">(7,38,40,57)</w:t>
         </w:r>
       </w:hyperlink>
       <w:r>
@@ -18947,12 +18982,12 @@
         </w:rPr>
         <w:t xml:space="preserve">By visualising several continuous phenotypic traits simultaneously, these ‘maps’ could enable further comparisons among pneumococcal populations </w:t>
       </w:r>
-      <w:hyperlink r:id="rId84">
+      <w:hyperlink r:id="rId85">
         <w:r>
           <w:rPr>
             <w:rtl w:val="0"/>
           </w:rPr>
-          <w:t xml:space="preserve">(13,68)</w:t>
+          <w:t xml:space="preserve">(13,69)</w:t>
         </w:r>
       </w:hyperlink>
       <w:r>
@@ -18961,7 +18996,7 @@
         </w:rPr>
         <w:t xml:space="preserve">, facilitate modelling of full susceptibility profiles </w:t>
       </w:r>
-      <w:hyperlink r:id="rId85">
+      <w:hyperlink r:id="rId86">
         <w:r>
           <w:rPr>
             <w:rtl w:val="0"/>
@@ -18975,12 +19010,12 @@
         </w:rPr>
         <w:t xml:space="preserve">, and help track phenotypic changes over evolutionary time </w:t>
       </w:r>
-      <w:hyperlink r:id="rId86">
+      <w:hyperlink r:id="rId87">
         <w:r>
           <w:rPr>
             <w:rtl w:val="0"/>
           </w:rPr>
-          <w:t xml:space="preserve">(46,69,70)</w:t>
+          <w:t xml:space="preserve">(46,70,71)</w:t>
         </w:r>
       </w:hyperlink>
       <w:r>
@@ -19077,7 +19112,7 @@
         </w:rPr>
         <w:t xml:space="preserve">data </w:t>
       </w:r>
-      <w:hyperlink r:id="rId87">
+      <w:hyperlink r:id="rId88">
         <w:r>
           <w:rPr>
             <w:rtl w:val="0"/>
@@ -19097,32 +19132,46 @@
         </w:rPr>
         <w:t xml:space="preserve">could be applied at smaller scales to experimental evolution studies and within-host treatment monitoring </w:t>
       </w:r>
-      <w:hyperlink r:id="rId88">
-        <w:r>
-          <w:rPr>
-            <w:rtl w:val="0"/>
-          </w:rPr>
-          <w:t xml:space="preserve">(71)</w:t>
-        </w:r>
-      </w:hyperlink>
-      <w:r>
-        <w:rPr>
-          <w:rtl w:val="0"/>
-        </w:rPr>
-        <w:t xml:space="preserve">. Moreover, because the toolkit relies solely on phenotypic data, it could in principle be adapted to other species and drugs, including multi-class drug resistance–provided phenotypic correlations exist. With adequate testing, it could therefore also be applied to MIC data from other large-scale surveillance programs </w:t>
-      </w:r>
       <w:hyperlink r:id="rId89">
         <w:r>
           <w:rPr>
             <w:rtl w:val="0"/>
           </w:rPr>
-          <w:t xml:space="preserve">(72,73)</w:t>
+          <w:t xml:space="preserve">(72)</w:t>
         </w:r>
       </w:hyperlink>
       <w:r>
         <w:rPr>
           <w:rtl w:val="0"/>
         </w:rPr>
+        <w:t xml:space="preserve">. Moreover, because the toolkit relies solely on phenotypic data, it could, in principle, be adapted to other species and drugs. This could also include multi-class drug resistance, as phenotypic correlations have been demonstrated across drug classes for several important bacterial pathogens, yet the causes of this are poorly understood </w:t>
+      </w:r>
+      <w:hyperlink r:id="rId90">
+        <w:r>
+          <w:rPr>
+            <w:rtl w:val="0"/>
+          </w:rPr>
+          <w:t xml:space="preserve">(13)</w:t>
+        </w:r>
+      </w:hyperlink>
+      <w:r>
+        <w:rPr>
+          <w:rtl w:val="0"/>
+        </w:rPr>
+        <w:t xml:space="preserve">. With adequate testing, the tool could be applied to MIC data from other large-scale surveillance programs, and used to help identify lineage- or species-specific genetic predispositions in acquiring resistance </w:t>
+      </w:r>
+      <w:hyperlink r:id="rId91">
+        <w:r>
+          <w:rPr>
+            <w:rtl w:val="0"/>
+          </w:rPr>
+          <w:t xml:space="preserve">(73,74)</w:t>
+        </w:r>
+      </w:hyperlink>
+      <w:r>
+        <w:rPr>
+          <w:rtl w:val="0"/>
+        </w:rPr>
         <w:t xml:space="preserve">. </w:t>
       </w:r>
       <w:r>
@@ -19144,6 +19193,11 @@
           <w:rtl w:val="0"/>
         </w:rPr>
         <w:t xml:space="preserve">.</w:t>
+      </w:r>
+      <w:r>
+        <w:rPr>
+          <w:rtl w:val="0"/>
+        </w:rPr>
       </w:r>
     </w:p>
     <w:p>
@@ -19155,8 +19209,18 @@
           <w:szCs w:val="22"/>
         </w:rPr>
       </w:pPr>
-      <w:bookmarkStart w:colFirst="0" w:colLast="0" w:name="_ra9pd77s7su5" w:id="10"/>
-      <w:bookmarkEnd w:id="10"/>
+      <w:bookmarkStart w:colFirst="0" w:colLast="0" w:name="_pgxjkczgoqoo" w:id="9"/>
+      <w:bookmarkEnd w:id="9"/>
+      <w:r>
+        <w:rPr>
+          <w:rtl w:val="0"/>
+        </w:rPr>
+      </w:r>
+    </w:p>
+    <w:p>
+      <w:pPr>
+        <w:rPr/>
+      </w:pPr>
       <w:r>
         <w:rPr>
           <w:rtl w:val="0"/>
@@ -19172,8 +19236,8 @@
           <w:szCs w:val="22"/>
         </w:rPr>
       </w:pPr>
-      <w:bookmarkStart w:colFirst="0" w:colLast="0" w:name="_5ariq3ycnudl" w:id="11"/>
-      <w:bookmarkEnd w:id="11"/>
+      <w:bookmarkStart w:colFirst="0" w:colLast="0" w:name="_5ariq3ycnudl" w:id="10"/>
+      <w:bookmarkEnd w:id="10"/>
       <w:r>
         <w:br w:type="page"/>
       </w:r>
@@ -19192,8 +19256,8 @@
           <w:szCs w:val="22"/>
         </w:rPr>
       </w:pPr>
-      <w:bookmarkStart w:colFirst="0" w:colLast="0" w:name="_jymtf5erfmcf" w:id="12"/>
-      <w:bookmarkEnd w:id="12"/>
+      <w:bookmarkStart w:colFirst="0" w:colLast="0" w:name="_jymtf5erfmcf" w:id="11"/>
+      <w:bookmarkEnd w:id="11"/>
       <w:r>
         <w:rPr>
           <w:sz w:val="22"/>
@@ -19370,7 +19434,7 @@
         </w:rPr>
         <w:t xml:space="preserve">All code and data required to reproduce this paper is available at: </w:t>
       </w:r>
-      <w:hyperlink r:id="rId90">
+      <w:hyperlink r:id="rId92">
         <w:r>
           <w:rPr>
             <w:color w:val="1155cc"/>
@@ -19408,8 +19472,8 @@
           <w:color w:val="212121"/>
         </w:rPr>
       </w:pPr>
-      <w:bookmarkStart w:colFirst="0" w:colLast="0" w:name="_xnbvxc81jdap" w:id="13"/>
-      <w:bookmarkEnd w:id="13"/>
+      <w:bookmarkStart w:colFirst="0" w:colLast="0" w:name="_xnbvxc81jdap" w:id="12"/>
+      <w:bookmarkEnd w:id="12"/>
       <w:r>
         <w:rPr>
           <w:rtl w:val="0"/>
@@ -19425,8 +19489,8 @@
         <w:ind w:left="0"/>
         <w:rPr/>
       </w:pPr>
-      <w:bookmarkStart w:colFirst="0" w:colLast="0" w:name="_yhq645ryan5o" w:id="14"/>
-      <w:bookmarkEnd w:id="14"/>
+      <w:bookmarkStart w:colFirst="0" w:colLast="0" w:name="_yhq645ryan5o" w:id="13"/>
+      <w:bookmarkEnd w:id="13"/>
       <w:r>
         <w:rPr>
           <w:b w:val="1"/>
@@ -19583,53 +19647,6 @@
         </w:rPr>
         <w:t xml:space="preserve">References:</w:t>
       </w:r>
-      <w:r>
-        <w:rPr>
-          <w:rtl w:val="0"/>
-        </w:rPr>
-      </w:r>
-    </w:p>
-    <w:p>
-      <w:pPr>
-        <w:keepNext w:val="0"/>
-        <w:keepLines w:val="0"/>
-        <w:pageBreakBefore w:val="0"/>
-        <w:widowControl w:val="0"/>
-        <w:pBdr>
-          <w:top w:space="0" w:sz="0" w:val="nil"/>
-          <w:left w:space="0" w:sz="0" w:val="nil"/>
-          <w:bottom w:space="0" w:sz="0" w:val="nil"/>
-          <w:right w:space="0" w:sz="0" w:val="nil"/>
-          <w:between w:space="0" w:sz="0" w:val="nil"/>
-        </w:pBdr>
-        <w:shd w:fill="auto" w:val="clear"/>
-        <w:spacing w:after="240" w:before="0" w:line="240" w:lineRule="auto"/>
-        <w:ind w:left="384.00000000000006" w:right="0" w:hanging="384.00000000000006"/>
-        <w:jc w:val="left"/>
-        <w:rPr/>
-      </w:pPr>
-      <w:hyperlink r:id="rId91">
-        <w:r>
-          <w:rPr>
-            <w:rtl w:val="0"/>
-          </w:rPr>
-          <w:t xml:space="preserve">1.</w:t>
-        </w:r>
-      </w:hyperlink>
-      <w:r>
-        <w:rPr>
-          <w:rtl w:val="0"/>
-        </w:rPr>
-        <w:tab/>
-      </w:r>
-      <w:hyperlink r:id="rId92">
-        <w:r>
-          <w:rPr>
-            <w:rtl w:val="0"/>
-          </w:rPr>
-          <w:t xml:space="preserve">Beall B, Chochua S, Gertz RE, Li Y, Li Z, McGee L, et al. A Population-Based Descriptive Atlas of Invasive Pneumococcal Strains Recovered Within the U.S. During 2015–2016. Front Microbiol. 2018 Nov 19;9. doi:10.3389/fmicb.2018.02670 </w:t>
-        </w:r>
-      </w:hyperlink>
       <w:r>
         <w:rPr>
           <w:rtl w:val="0"/>
@@ -19660,7 +19677,7 @@
           <w:rPr>
             <w:rtl w:val="0"/>
           </w:rPr>
-          <w:t xml:space="preserve">2.</w:t>
+          <w:t xml:space="preserve">1.</w:t>
         </w:r>
       </w:hyperlink>
       <w:r>
@@ -19674,7 +19691,7 @@
           <w:rPr>
             <w:rtl w:val="0"/>
           </w:rPr>
-          <w:t xml:space="preserve">McCormick AW, Whitney CG, Farley MM, Lynfield R, Harrison LH, Bennett NM, et al. Geographic diversity and temporal trends of antimicrobial resistance in Streptococcus pneumoniae in the United States. Nat Med. 2003 Apr;9(4):424–30. doi:10.1038/nm839 </w:t>
+          <w:t xml:space="preserve">Beall B, Chochua S, Gertz RE, Li Y, Li Z, McGee L, et al. A Population-Based Descriptive Atlas of Invasive Pneumococcal Strains Recovered Within the U.S. During 2015–2016. Front Microbiol. 2018 Nov 19;9. doi:10.3389/fmicb.2018.02670 </w:t>
         </w:r>
       </w:hyperlink>
       <w:r>
@@ -19707,7 +19724,7 @@
           <w:rPr>
             <w:rtl w:val="0"/>
           </w:rPr>
-          <w:t xml:space="preserve">3.</w:t>
+          <w:t xml:space="preserve">2.</w:t>
         </w:r>
       </w:hyperlink>
       <w:r>
@@ -19721,7 +19738,7 @@
           <w:rPr>
             <w:rtl w:val="0"/>
           </w:rPr>
-          <w:t xml:space="preserve">Dewé TCM, D’Aeth JC, Croucher NJ. Genomic epidemiology of penicillin-non-susceptible Streptococcus pneumoniae. Microb Genomics. 2019 Oct;5(10):e000305. doi:10.1099/mgen.0.000305 PubMed PMID: 31609685; PubMed Central PMCID: PMC6861860. </w:t>
+          <w:t xml:space="preserve">McCormick AW, Whitney CG, Farley MM, Lynfield R, Harrison LH, Bennett NM, et al. Geographic diversity and temporal trends of antimicrobial resistance in Streptococcus pneumoniae in the United States. Nat Med. 2003 Apr;9(4):424–30. doi:10.1038/nm839 </w:t>
         </w:r>
       </w:hyperlink>
       <w:r>
@@ -19754,7 +19771,7 @@
           <w:rPr>
             <w:rtl w:val="0"/>
           </w:rPr>
-          <w:t xml:space="preserve">4.</w:t>
+          <w:t xml:space="preserve">3.</w:t>
         </w:r>
       </w:hyperlink>
       <w:r>
@@ -19768,7 +19785,7 @@
           <w:rPr>
             <w:rtl w:val="0"/>
           </w:rPr>
-          <w:t xml:space="preserve">Schuchat A, Hilger T, Zell E, Farley MM, Reingold A, Harrison L, et al. Active bacterial core surveillance of the emerging infections program network. Emerg Infect Dis. 2001 Jan;7(1):92–9. doi:10.3201/eid0701.010114 PubMed PMID: 11266299; PubMed Central PMCID: PMC2631675. </w:t>
+          <w:t xml:space="preserve">Dewé TCM, D’Aeth JC, Croucher NJ. Genomic epidemiology of penicillin-non-susceptible Streptococcus pneumoniae. Microb Genomics. 2019 Oct;5(10):e000305. doi:10.1099/mgen.0.000305 PubMed PMID: 31609685; PubMed Central PMCID: PMC6861860. </w:t>
         </w:r>
       </w:hyperlink>
       <w:r>
@@ -19801,7 +19818,7 @@
           <w:rPr>
             <w:rtl w:val="0"/>
           </w:rPr>
-          <w:t xml:space="preserve">5.</w:t>
+          <w:t xml:space="preserve">4.</w:t>
         </w:r>
       </w:hyperlink>
       <w:r>
@@ -19815,7 +19832,7 @@
           <w:rPr>
             <w:rtl w:val="0"/>
           </w:rPr>
-          <w:t xml:space="preserve">Croucher NJ, Harris SR, Fraser C, Quail MA, Burton J, van der Linden M, et al. Rapid pneumococcal evolution in response to clinical interventions. Science. 2011 Jan 28;331(6016):430–4. doi:10.1126/science.1198545 PubMed PMID: 21273480; PubMed Central PMCID: PMC3648787. </w:t>
+          <w:t xml:space="preserve">Schuchat A, Hilger T, Zell E, Farley MM, Reingold A, Harrison L, et al. Active bacterial core surveillance of the emerging infections program network. Emerg Infect Dis. 2001 Jan;7(1):92–9. doi:10.3201/eid0701.010114 PubMed PMID: 11266299; PubMed Central PMCID: PMC2631675. </w:t>
         </w:r>
       </w:hyperlink>
       <w:r>
@@ -19848,7 +19865,7 @@
           <w:rPr>
             <w:rtl w:val="0"/>
           </w:rPr>
-          <w:t xml:space="preserve">6.</w:t>
+          <w:t xml:space="preserve">5.</w:t>
         </w:r>
       </w:hyperlink>
       <w:r>
@@ -19862,7 +19879,7 @@
           <w:rPr>
             <w:rtl w:val="0"/>
           </w:rPr>
-          <w:t xml:space="preserve">Chewapreecha C, Marttinen P, Croucher NJ, Salter SJ, Harris SR, Mather AE, et al. Comprehensive Identification of Single Nucleotide Polymorphisms Associated with Beta-lactam Resistance within Pneumococcal Mosaic Genes. PLOS Genet. 2014 Aug 7;10(8):e1004547. doi:10.1371/journal.pgen.1004547 </w:t>
+          <w:t xml:space="preserve">Croucher NJ, Harris SR, Fraser C, Quail MA, Burton J, van der Linden M, et al. Rapid pneumococcal evolution in response to clinical interventions. Science. 2011 Jan 28;331(6016):430–4. doi:10.1126/science.1198545 PubMed PMID: 21273480; PubMed Central PMCID: PMC3648787. </w:t>
         </w:r>
       </w:hyperlink>
       <w:r>
@@ -19895,7 +19912,7 @@
           <w:rPr>
             <w:rtl w:val="0"/>
           </w:rPr>
-          <w:t xml:space="preserve">7.</w:t>
+          <w:t xml:space="preserve">6.</w:t>
         </w:r>
       </w:hyperlink>
       <w:r>
@@ -19909,7 +19926,7 @@
           <w:rPr>
             <w:rtl w:val="0"/>
           </w:rPr>
-          <w:t xml:space="preserve">Lehtinen S, Chewapreecha C, Lees J, Hanage WP, Lipsitch M, Croucher NJ, et al. Horizontal gene transfer rate is not the primary determinant of observed antibiotic resistance frequencies in Streptococcus pneumoniae. Sci Adv. 2020 May 20;6(21):eaaz6137. doi:10.1126/sciadv.aaz6137 PubMed PMID: 32671212; PubMed Central PMCID: PMC7314567. </w:t>
+          <w:t xml:space="preserve">Chewapreecha C, Marttinen P, Croucher NJ, Salter SJ, Harris SR, Mather AE, et al. Comprehensive Identification of Single Nucleotide Polymorphisms Associated with Beta-lactam Resistance within Pneumococcal Mosaic Genes. PLOS Genet. 2014 Aug 7;10(8):e1004547. doi:10.1371/journal.pgen.1004547 </w:t>
         </w:r>
       </w:hyperlink>
       <w:r>
@@ -19942,7 +19959,7 @@
           <w:rPr>
             <w:rtl w:val="0"/>
           </w:rPr>
-          <w:t xml:space="preserve">8.</w:t>
+          <w:t xml:space="preserve">7.</w:t>
         </w:r>
       </w:hyperlink>
       <w:r>
@@ -19956,7 +19973,7 @@
           <w:rPr>
             <w:rtl w:val="0"/>
           </w:rPr>
-          <w:t xml:space="preserve">Li Y, Metcalf BJ, Chochua S, Li Z, Gertz RE, Walker H, et al. Penicillin-Binding Protein Transpeptidase Signatures for Tracking and Predicting β-Lactam Resistance Levels in Streptococcus pneumoniae. mBio. 2016 Jun 14;7(3):10.1128/mbio.00756-16. doi:10.1128/mbio.00756-16 </w:t>
+          <w:t xml:space="preserve">Lehtinen S, Chewapreecha C, Lees J, Hanage WP, Lipsitch M, Croucher NJ, et al. Horizontal gene transfer rate is not the primary determinant of observed antibiotic resistance frequencies in Streptococcus pneumoniae. Sci Adv. 2020 May 20;6(21):eaaz6137. doi:10.1126/sciadv.aaz6137 PubMed PMID: 32671212; PubMed Central PMCID: PMC7314567. </w:t>
         </w:r>
       </w:hyperlink>
       <w:r>
@@ -19989,7 +20006,7 @@
           <w:rPr>
             <w:rtl w:val="0"/>
           </w:rPr>
-          <w:t xml:space="preserve">9.</w:t>
+          <w:t xml:space="preserve">8.</w:t>
         </w:r>
       </w:hyperlink>
       <w:r>
@@ -20003,7 +20020,7 @@
           <w:rPr>
             <w:rtl w:val="0"/>
           </w:rPr>
-          <w:t xml:space="preserve">D’Aeth JC, van der Linden MP, McGee L, de Lencastre H, Turner P, Song JH, et al. The role of interspecies recombination in the evolution of antibiotic-resistant pneumococci. eLife. 2021 Jul 14;10:e67113. doi:10.7554/eLife.67113 PubMed PMID: 34259624; PubMed Central PMCID: PMC8321556. </w:t>
+          <w:t xml:space="preserve">Li Y, Metcalf BJ, Chochua S, Li Z, Gertz RE, Walker H, et al. Penicillin-Binding Protein Transpeptidase Signatures for Tracking and Predicting β-Lactam Resistance Levels in Streptococcus pneumoniae. mBio. 2016 Jun 14;7(3):10.1128/mbio.00756-16. doi:10.1128/mbio.00756-16 </w:t>
         </w:r>
       </w:hyperlink>
       <w:r>
@@ -20036,7 +20053,7 @@
           <w:rPr>
             <w:rtl w:val="0"/>
           </w:rPr>
-          <w:t xml:space="preserve">10.</w:t>
+          <w:t xml:space="preserve">9.</w:t>
         </w:r>
       </w:hyperlink>
       <w:r>
@@ -20050,7 +20067,7 @@
           <w:rPr>
             <w:rtl w:val="0"/>
           </w:rPr>
-          <w:t xml:space="preserve">Gladstone RA, Lo SW, Lees JA, Croucher NJ, van Tonder AJ, Corander J, et al. International genomic definition of pneumococcal lineages, to contextualise disease, antibiotic resistance and vaccine impact. EBioMedicine. 2019 Apr 16;43:338–46. doi:10.1016/j.ebiom.2019.04.021 PubMed PMID: 31003929; PubMed Central PMCID: PMC6557916. </w:t>
+          <w:t xml:space="preserve">D’Aeth JC, van der Linden MP, McGee L, de Lencastre H, Turner P, Song JH, et al. The role of interspecies recombination in the evolution of antibiotic-resistant pneumococci. eLife. 2021 Jul 14;10:e67113. doi:10.7554/eLife.67113 PubMed PMID: 34259624; PubMed Central PMCID: PMC8321556. </w:t>
         </w:r>
       </w:hyperlink>
       <w:r>
@@ -20083,7 +20100,7 @@
           <w:rPr>
             <w:rtl w:val="0"/>
           </w:rPr>
-          <w:t xml:space="preserve">11.</w:t>
+          <w:t xml:space="preserve">10.</w:t>
         </w:r>
       </w:hyperlink>
       <w:r>
@@ -20097,7 +20114,7 @@
           <w:rPr>
             <w:rtl w:val="0"/>
           </w:rPr>
-          <w:t xml:space="preserve">Link-Gelles R, Thomas A, Lynfield R, Petit S, Schaffner W, Harrison L, et al. Geographic and temporal trends in antimicrobial nonsusceptibility in Streptococcus pneumoniae in the post-vaccine era in the United States. J Infect Dis. 2013 Oct 15;208(8):1266–73. doi:10.1093/infdis/jit315 PubMed PMID: 23852588; PubMed Central PMCID: PMC3778966. </w:t>
+          <w:t xml:space="preserve">Gladstone RA, Lo SW, Lees JA, Croucher NJ, van Tonder AJ, Corander J, et al. International genomic definition of pneumococcal lineages, to contextualise disease, antibiotic resistance and vaccine impact. EBioMedicine. 2019 Apr 16;43:338–46. doi:10.1016/j.ebiom.2019.04.021 PubMed PMID: 31003929; PubMed Central PMCID: PMC6557916. </w:t>
         </w:r>
       </w:hyperlink>
       <w:r>
@@ -20130,7 +20147,7 @@
           <w:rPr>
             <w:rtl w:val="0"/>
           </w:rPr>
-          <w:t xml:space="preserve">12.</w:t>
+          <w:t xml:space="preserve">11.</w:t>
         </w:r>
       </w:hyperlink>
       <w:r>
@@ -20144,7 +20161,7 @@
           <w:rPr>
             <w:rtl w:val="0"/>
           </w:rPr>
-          <w:t xml:space="preserve">Colijn C, Cohen T, Fraser C, Hanage W, Goldstein E, Givon-Lavi N, et al. What is the mechanism for persistent coexistence of drug-susceptible and drug-resistant strains of Streptococcus pneumoniae? J R Soc Interface. 2009 Nov 25;7(47):905–19. doi:10.1098/rsif.2009.0400 </w:t>
+          <w:t xml:space="preserve">Link-Gelles R, Thomas A, Lynfield R, Petit S, Schaffner W, Harrison L, et al. Geographic and temporal trends in antimicrobial nonsusceptibility in Streptococcus pneumoniae in the post-vaccine era in the United States. J Infect Dis. 2013 Oct 15;208(8):1266–73. doi:10.1093/infdis/jit315 PubMed PMID: 23852588; PubMed Central PMCID: PMC3778966. </w:t>
         </w:r>
       </w:hyperlink>
       <w:r>
@@ -20177,7 +20194,7 @@
           <w:rPr>
             <w:rtl w:val="0"/>
           </w:rPr>
-          <w:t xml:space="preserve">13.</w:t>
+          <w:t xml:space="preserve">12.</w:t>
         </w:r>
       </w:hyperlink>
       <w:r>
@@ -20191,7 +20208,7 @@
           <w:rPr>
             <w:rtl w:val="0"/>
           </w:rPr>
-          <w:t xml:space="preserve">Chang HH, Cohen T, Grad YH, Hanage WP, O’Brien TF, Lipsitch M. Origin and proliferation of multiple-drug resistance in bacterial pathogens. Microbiol Mol Biol Rev. 2015 Mar;79(1):101–16. doi:10.1128/MMBR.00039-14 PubMed PMID: 25652543; PubMed Central PMCID: PMC4402963. </w:t>
+          <w:t xml:space="preserve">Colijn C, Cohen T, Fraser C, Hanage W, Goldstein E, Givon-Lavi N, et al. What is the mechanism for persistent coexistence of drug-susceptible and drug-resistant strains of Streptococcus pneumoniae? J R Soc Interface. 2009 Nov 25;7(47):905–19. doi:10.1098/rsif.2009.0400 </w:t>
         </w:r>
       </w:hyperlink>
       <w:r>
@@ -20224,7 +20241,7 @@
           <w:rPr>
             <w:rtl w:val="0"/>
           </w:rPr>
-          <w:t xml:space="preserve">14.</w:t>
+          <w:t xml:space="preserve">13.</w:t>
         </w:r>
       </w:hyperlink>
       <w:r>
@@ -20238,7 +20255,7 @@
           <w:rPr>
             <w:rtl w:val="0"/>
           </w:rPr>
-          <w:t xml:space="preserve">Opatowski L, Mandel J, Varon E, Boëlle PY, Temime L, Guillemot D. Antibiotic dose impact on resistance selection in the community: a mathematical model of beta-lactams and Streptococcus pneumoniae dynamics. Antimicrob Agents Chemother. 2010 Jun;54(6):2330–7. doi:10.1128/AAC.00331-09 PubMed PMID: 20231396; PubMed Central PMCID: PMC2876390. </w:t>
+          <w:t xml:space="preserve">Chang HH, Cohen T, Grad YH, Hanage WP, O’Brien TF, Lipsitch M. Origin and proliferation of multiple-drug resistance in bacterial pathogens. Microbiol Mol Biol Rev. 2015 Mar;79(1):101–16. doi:10.1128/MMBR.00039-14 PubMed PMID: 25652543; PubMed Central PMCID: PMC4402963. </w:t>
         </w:r>
       </w:hyperlink>
       <w:r>
@@ -20271,7 +20288,7 @@
           <w:rPr>
             <w:rtl w:val="0"/>
           </w:rPr>
-          <w:t xml:space="preserve">15.</w:t>
+          <w:t xml:space="preserve">14.</w:t>
         </w:r>
       </w:hyperlink>
       <w:r>
@@ -20285,7 +20302,7 @@
           <w:rPr>
             <w:rtl w:val="0"/>
           </w:rPr>
-          <w:t xml:space="preserve">Jorgensen JH, Ferraro MJ. Antimicrobial susceptibility testing: a review of general principles and contemporary practices. Clin Infect Dis. 2009 Dec 1;49(11):1749–55. doi:10.1086/647952 PubMed PMID: 19857164. </w:t>
+          <w:t xml:space="preserve">Opatowski L, Mandel J, Varon E, Boëlle PY, Temime L, Guillemot D. Antibiotic dose impact on resistance selection in the community: a mathematical model of beta-lactams and Streptococcus pneumoniae dynamics. Antimicrob Agents Chemother. 2010 Jun;54(6):2330–7. doi:10.1128/AAC.00331-09 PubMed PMID: 20231396; PubMed Central PMCID: PMC2876390. </w:t>
         </w:r>
       </w:hyperlink>
       <w:r>
@@ -20318,7 +20335,7 @@
           <w:rPr>
             <w:rtl w:val="0"/>
           </w:rPr>
-          <w:t xml:space="preserve">16.</w:t>
+          <w:t xml:space="preserve">15.</w:t>
         </w:r>
       </w:hyperlink>
       <w:r>
@@ -20332,7 +20349,7 @@
           <w:rPr>
             <w:rtl w:val="0"/>
           </w:rPr>
-          <w:t xml:space="preserve">Michael A, Kelman T, Pitesky M. Overview of Quantitative Methodologies to Understand Antimicrobial Resistance via Minimum Inhibitory Concentration. Anim Basel. 2020 Aug 12;10(8):1405. doi:10.3390/ani10081405 PubMed PMID: 32806615; PubMed Central PMCID: PMC7459578. </w:t>
+          <w:t xml:space="preserve">Jorgensen JH, Ferraro MJ. Antimicrobial susceptibility testing: a review of general principles and contemporary practices. Clin Infect Dis. 2009 Dec 1;49(11):1749–55. doi:10.1086/647952 PubMed PMID: 19857164. </w:t>
         </w:r>
       </w:hyperlink>
       <w:r>
@@ -20365,7 +20382,7 @@
           <w:rPr>
             <w:rtl w:val="0"/>
           </w:rPr>
-          <w:t xml:space="preserve">17.</w:t>
+          <w:t xml:space="preserve">16.</w:t>
         </w:r>
       </w:hyperlink>
       <w:r>
@@ -20379,7 +20396,7 @@
           <w:rPr>
             <w:rtl w:val="0"/>
           </w:rPr>
-          <w:t xml:space="preserve">Negri MC, Morosini MI, Baquero MR, Campo R del, Blázquez J, Baquero F. Very Low Cefotaxime Concentrations Select for Hypermutable Streptococcus pneumoniae Populations. Antimicrob Agents Chemother. 2002 Feb;46(2):528–30. doi:10.1128/AAC.46.2.528-530.2002 PubMed PMID: 11796370; PubMed Central PMCID: PMC127056. </w:t>
+          <w:t xml:space="preserve">Michael A, Kelman T, Pitesky M. Overview of Quantitative Methodologies to Understand Antimicrobial Resistance via Minimum Inhibitory Concentration. Anim Basel. 2020 Aug 12;10(8):1405. doi:10.3390/ani10081405 PubMed PMID: 32806615; PubMed Central PMCID: PMC7459578. </w:t>
         </w:r>
       </w:hyperlink>
       <w:r>
@@ -20412,7 +20429,7 @@
           <w:rPr>
             <w:rtl w:val="0"/>
           </w:rPr>
-          <w:t xml:space="preserve">18.</w:t>
+          <w:t xml:space="preserve">17.</w:t>
         </w:r>
       </w:hyperlink>
       <w:r>
@@ -20426,7 +20443,7 @@
           <w:rPr>
             <w:rtl w:val="0"/>
           </w:rPr>
-          <w:t xml:space="preserve">Weinstein MP, Klugman KP, Jones RN. Rationale for revised penicillin susceptibility breakpoints versus Streptococcus pneumoniae: coping with antimicrobial susceptibility in an era of resistance. Clin Infect Dis Off Publ Infect Dis Soc Am. 2009 Jun 1;48(11):1596–600. doi:10.1086/598975 PubMed PMID: 19400744. </w:t>
+          <w:t xml:space="preserve">Negri MC, Morosini MI, Baquero MR, Campo R del, Blázquez J, Baquero F. Very Low Cefotaxime Concentrations Select for Hypermutable Streptococcus pneumoniae Populations. Antimicrob Agents Chemother. 2002 Feb;46(2):528–30. doi:10.1128/AAC.46.2.528-530.2002 PubMed PMID: 11796370; PubMed Central PMCID: PMC127056. </w:t>
         </w:r>
       </w:hyperlink>
       <w:r>
@@ -20459,7 +20476,7 @@
           <w:rPr>
             <w:rtl w:val="0"/>
           </w:rPr>
-          <w:t xml:space="preserve">19.</w:t>
+          <w:t xml:space="preserve">18.</w:t>
         </w:r>
       </w:hyperlink>
       <w:r>
@@ -20473,7 +20490,7 @@
           <w:rPr>
             <w:rtl w:val="0"/>
           </w:rPr>
-          <w:t xml:space="preserve">Gullberg E, Cao S, Berg OG, Ilbäck C, Sandegren L, Hughes D, et al. Selection of resistant bacteria at very low antibiotic concentrations. PLoS Pathog. 2011 Jul;7(7):e1002158. doi:10.1371/journal.ppat.1002158 PubMed PMID: 21811410; PubMed Central PMCID: PMC3141051. </w:t>
+          <w:t xml:space="preserve">Weinstein MP, Klugman KP, Jones RN. Rationale for revised penicillin susceptibility breakpoints versus Streptococcus pneumoniae: coping with antimicrobial susceptibility in an era of resistance. Clin Infect Dis Off Publ Infect Dis Soc Am. 2009 Jun 1;48(11):1596–600. doi:10.1086/598975 PubMed PMID: 19400744. </w:t>
         </w:r>
       </w:hyperlink>
       <w:r>
@@ -20506,7 +20523,7 @@
           <w:rPr>
             <w:rtl w:val="0"/>
           </w:rPr>
-          <w:t xml:space="preserve">20.</w:t>
+          <w:t xml:space="preserve">19.</w:t>
         </w:r>
       </w:hyperlink>
       <w:r>
@@ -20520,7 +20537,7 @@
           <w:rPr>
             <w:rtl w:val="0"/>
           </w:rPr>
-          <w:t xml:space="preserve">Andersson DI, Hughes D. Microbiological effects of sublethal levels of antibiotics. Nat Rev Microbiol. 2014 Jul;12(7):465–78. doi:10.1038/nrmicro3270 PubMed PMID: 24861036. </w:t>
+          <w:t xml:space="preserve">Gullberg E, Cao S, Berg OG, Ilbäck C, Sandegren L, Hughes D, et al. Selection of resistant bacteria at very low antibiotic concentrations. PLoS Pathog. 2011 Jul;7(7):e1002158. doi:10.1371/journal.ppat.1002158 PubMed PMID: 21811410; PubMed Central PMCID: PMC3141051. </w:t>
         </w:r>
       </w:hyperlink>
       <w:r>
@@ -20553,7 +20570,7 @@
           <w:rPr>
             <w:rtl w:val="0"/>
           </w:rPr>
-          <w:t xml:space="preserve">21.</w:t>
+          <w:t xml:space="preserve">20.</w:t>
         </w:r>
       </w:hyperlink>
       <w:r>
@@ -20567,7 +20584,7 @@
           <w:rPr>
             <w:rtl w:val="0"/>
           </w:rPr>
-          <w:t xml:space="preserve">Baquero F, Negri MC, Morosini MI, Blázquez J. Antibiotic-selective environments. Clin Infect Dis Off Publ Infect Dis Soc Am. 1998 Aug;27 Suppl 1:S5-11. doi:10.1086/514916 PubMed PMID: 9710666. </w:t>
+          <w:t xml:space="preserve">Andersson DI, Hughes D. Microbiological effects of sublethal levels of antibiotics. Nat Rev Microbiol. 2014 Jul;12(7):465–78. doi:10.1038/nrmicro3270 PubMed PMID: 24861036. </w:t>
         </w:r>
       </w:hyperlink>
       <w:r>
@@ -20600,7 +20617,7 @@
           <w:rPr>
             <w:rtl w:val="0"/>
           </w:rPr>
-          <w:t xml:space="preserve">22.</w:t>
+          <w:t xml:space="preserve">21.</w:t>
         </w:r>
       </w:hyperlink>
       <w:r>
@@ -20614,7 +20631,7 @@
           <w:rPr>
             <w:rtl w:val="0"/>
           </w:rPr>
-          <w:t xml:space="preserve">Hakenbeck R, Brückner R, Denapaite D, Maurer P. Molecular mechanisms of β-lactam resistance in Streptococcus pneumoniae. Future Microbiol. 2012 Mar;7(3):395–410. doi:10.2217/fmb.12.2 PubMed PMID: 22393892. </w:t>
+          <w:t xml:space="preserve">Baquero F, Negri MC, Morosini MI, Blázquez J. Antibiotic-selective environments. Clin Infect Dis Off Publ Infect Dis Soc Am. 1998 Aug;27 Suppl 1:S5-11. doi:10.1086/514916 PubMed PMID: 9710666. </w:t>
         </w:r>
       </w:hyperlink>
       <w:r>
@@ -20647,7 +20664,7 @@
           <w:rPr>
             <w:rtl w:val="0"/>
           </w:rPr>
-          <w:t xml:space="preserve">23.</w:t>
+          <w:t xml:space="preserve">22.</w:t>
         </w:r>
       </w:hyperlink>
       <w:r>
@@ -20661,7 +20678,7 @@
           <w:rPr>
             <w:rtl w:val="0"/>
           </w:rPr>
-          <w:t xml:space="preserve">Coffey TJ, Daniels M, McDougal LK, Dowson CG, Tenover FC, Spratt BG. Genetic analysis of clinical isolates of Streptococcus pneumoniae with high-level resistance to expanded-spectrum cephalosporins. Antimicrob Agents Chemother. 1995 Jun;39(6):1306–13. doi:10.1128/AAC.39.6.1306 PubMed PMID: 7574521; PubMed Central PMCID: PMC162732. </w:t>
+          <w:t xml:space="preserve">Hakenbeck R, Brückner R, Denapaite D, Maurer P. Molecular mechanisms of β-lactam resistance in Streptococcus pneumoniae. Future Microbiol. 2012 Mar;7(3):395–410. doi:10.2217/fmb.12.2 PubMed PMID: 22393892. </w:t>
         </w:r>
       </w:hyperlink>
       <w:r>
@@ -20694,7 +20711,7 @@
           <w:rPr>
             <w:rtl w:val="0"/>
           </w:rPr>
-          <w:t xml:space="preserve">24.</w:t>
+          <w:t xml:space="preserve">23.</w:t>
         </w:r>
       </w:hyperlink>
       <w:r>
@@ -20708,7 +20725,7 @@
           <w:rPr>
             <w:rtl w:val="0"/>
           </w:rPr>
-          <w:t xml:space="preserve">Kocaoglu O, Tsui HCT, Winkler ME, Carlson EE. Profiling of β-lactam selectivity for penicillin-binding proteins in Streptococcus pneumoniae D39. Antimicrob Agents Chemother. 2015;59(6):3548–55. doi:10.1128/AAC.05142-14 PubMed PMID: 25845878; PubMed Central PMCID: PMC4432181. </w:t>
+          <w:t xml:space="preserve">Coffey TJ, Daniels M, McDougal LK, Dowson CG, Tenover FC, Spratt BG. Genetic analysis of clinical isolates of Streptococcus pneumoniae with high-level resistance to expanded-spectrum cephalosporins. Antimicrob Agents Chemother. 1995 Jun;39(6):1306–13. doi:10.1128/AAC.39.6.1306 PubMed PMID: 7574521; PubMed Central PMCID: PMC162732. </w:t>
         </w:r>
       </w:hyperlink>
       <w:r>
@@ -20741,7 +20758,7 @@
           <w:rPr>
             <w:rtl w:val="0"/>
           </w:rPr>
-          <w:t xml:space="preserve">25.</w:t>
+          <w:t xml:space="preserve">24.</w:t>
         </w:r>
       </w:hyperlink>
       <w:r>
@@ -20755,7 +20772,7 @@
           <w:rPr>
             <w:rtl w:val="0"/>
           </w:rPr>
-          <w:t xml:space="preserve">Pouwels KB, Freeman R, Muller-Pebody B, Rooney G, Henderson KL, Robotham JV, et al. Association between use of different antibiotics and trimethoprim resistance: going beyond the obvious crude association. J Antimicrob Chemother. 2018 Jun 1;73(6):1700–7. doi:10.1093/jac/dky031 PubMed PMID: 29394363. </w:t>
+          <w:t xml:space="preserve">Kocaoglu O, Tsui HCT, Winkler ME, Carlson EE. Profiling of β-lactam selectivity for penicillin-binding proteins in Streptococcus pneumoniae D39. Antimicrob Agents Chemother. 2015;59(6):3548–55. doi:10.1128/AAC.05142-14 PubMed PMID: 25845878; PubMed Central PMCID: PMC4432181. </w:t>
         </w:r>
       </w:hyperlink>
       <w:r>
@@ -20788,7 +20805,7 @@
           <w:rPr>
             <w:rtl w:val="0"/>
           </w:rPr>
-          <w:t xml:space="preserve">26.</w:t>
+          <w:t xml:space="preserve">25.</w:t>
         </w:r>
       </w:hyperlink>
       <w:r>
@@ -20802,7 +20819,7 @@
           <w:rPr>
             <w:rtl w:val="0"/>
           </w:rPr>
-          <w:t xml:space="preserve">Pouwels KB, Muller-Pebody B, Smieszek T, Hopkins S, Robotham JV. Selection and co-selection of antibiotic resistances among Escherichia coli by antibiotic use in primary care: An ecological analysis. PLoS One. 2019;14(6):e0218134. doi:10.1371/journal.pone.0218134 PubMed PMID: 31181106; PubMed Central PMCID: PMC6557515. </w:t>
+          <w:t xml:space="preserve">Pouwels KB, Freeman R, Muller-Pebody B, Rooney G, Henderson KL, Robotham JV, et al. Association between use of different antibiotics and trimethoprim resistance: going beyond the obvious crude association. J Antimicrob Chemother. 2018 Jun 1;73(6):1700–7. doi:10.1093/jac/dky031 PubMed PMID: 29394363. </w:t>
         </w:r>
       </w:hyperlink>
       <w:r>
@@ -20835,7 +20852,7 @@
           <w:rPr>
             <w:rtl w:val="0"/>
           </w:rPr>
-          <w:t xml:space="preserve">27.</w:t>
+          <w:t xml:space="preserve">26.</w:t>
         </w:r>
       </w:hyperlink>
       <w:r>
@@ -20849,7 +20866,7 @@
           <w:rPr>
             <w:rtl w:val="0"/>
           </w:rPr>
-          <w:t xml:space="preserve">Seale AC, Hutchison C, Fernandes S, Stoesser N, Kelly H, Lowe B, et al. Supporting surveillance capacity for antimicrobial resistance: Laboratory capacity strengthening for drug resistant infections in low and middle income countries. Wellcome Open Res. 2017;2:91. doi:10.12688/wellcomeopenres.12523.1 PubMed PMID: 29181453; PubMed Central PMCID: PMC5686477. </w:t>
+          <w:t xml:space="preserve">Pouwels KB, Muller-Pebody B, Smieszek T, Hopkins S, Robotham JV. Selection and co-selection of antibiotic resistances among Escherichia coli by antibiotic use in primary care: An ecological analysis. PLoS One. 2019;14(6):e0218134. doi:10.1371/journal.pone.0218134 PubMed PMID: 31181106; PubMed Central PMCID: PMC6557515. </w:t>
         </w:r>
       </w:hyperlink>
       <w:r>
@@ -20882,7 +20899,7 @@
           <w:rPr>
             <w:rtl w:val="0"/>
           </w:rPr>
-          <w:t xml:space="preserve">28.</w:t>
+          <w:t xml:space="preserve">27.</w:t>
         </w:r>
       </w:hyperlink>
       <w:r>
@@ -20896,7 +20913,7 @@
           <w:rPr>
             <w:rtl w:val="0"/>
           </w:rPr>
-          <w:t xml:space="preserve">Iskandar K, Molinier L, Hallit S, Sartelli M, Hardcastle TC, Haque M, et al. Surveillance of antimicrobial resistance in low- and middle-income countries: a scattered picture. Antimicrob Resist Infect Control. 2021 Mar 31;10(1):63. doi:10.1186/s13756-021-00931-w PubMed PMID: 33789754; PubMed Central PMCID: PMC8011122. </w:t>
+          <w:t xml:space="preserve">Seale AC, Hutchison C, Fernandes S, Stoesser N, Kelly H, Lowe B, et al. Supporting surveillance capacity for antimicrobial resistance: Laboratory capacity strengthening for drug resistant infections in low and middle income countries. Wellcome Open Res. 2017;2:91. doi:10.12688/wellcomeopenres.12523.1 PubMed PMID: 29181453; PubMed Central PMCID: PMC5686477. </w:t>
         </w:r>
       </w:hyperlink>
       <w:r>
@@ -20929,7 +20946,7 @@
           <w:rPr>
             <w:rtl w:val="0"/>
           </w:rPr>
-          <w:t xml:space="preserve">29.</w:t>
+          <w:t xml:space="preserve">28.</w:t>
         </w:r>
       </w:hyperlink>
       <w:r>
@@ -20943,7 +20960,7 @@
           <w:rPr>
             <w:rtl w:val="0"/>
           </w:rPr>
-          <w:t xml:space="preserve">Argimón S, Masim MAL, Gayeta JM, Lagrada ML, Macaranas PKV, Cohen V, et al. Integrating whole-genome sequencing within the National Antimicrobial Resistance Surveillance Program in the Philippines. Nat Commun. 2020 Jun 1;11(1):2719. doi:10.1038/s41467-020-16322-5 PubMed PMID: 32483195; PubMed Central PMCID: PMC7264328. </w:t>
+          <w:t xml:space="preserve">Iskandar K, Molinier L, Hallit S, Sartelli M, Hardcastle TC, Haque M, et al. Surveillance of antimicrobial resistance in low- and middle-income countries: a scattered picture. Antimicrob Resist Infect Control. 2021 Mar 31;10(1):63. doi:10.1186/s13756-021-00931-w PubMed PMID: 33789754; PubMed Central PMCID: PMC8011122. </w:t>
         </w:r>
       </w:hyperlink>
       <w:r>
@@ -20976,7 +20993,7 @@
           <w:rPr>
             <w:rtl w:val="0"/>
           </w:rPr>
-          <w:t xml:space="preserve">30.</w:t>
+          <w:t xml:space="preserve">29.</w:t>
         </w:r>
       </w:hyperlink>
       <w:r>
@@ -20990,7 +21007,7 @@
           <w:rPr>
             <w:rtl w:val="0"/>
           </w:rPr>
-          <w:t xml:space="preserve">Lees JA, Mai TT, Galardini M, Wheeler NE, Horsfield ST, Parkhill J, et al. Improved Prediction of Bacterial Genotype-Phenotype Associations Using Interpretable Pangenome-Spanning Regressions. mBio. 2020 Jul 7;11(4):e01344-20. doi:10.1128/mBio.01344-20 PubMed PMID: 32636251; PubMed Central PMCID: PMC7343994. </w:t>
+          <w:t xml:space="preserve">Argimón S, Masim MAL, Gayeta JM, Lagrada ML, Macaranas PKV, Cohen V, et al. Integrating whole-genome sequencing within the National Antimicrobial Resistance Surveillance Program in the Philippines. Nat Commun. 2020 Jun 1;11(1):2719. doi:10.1038/s41467-020-16322-5 PubMed PMID: 32483195; PubMed Central PMCID: PMC7264328. </w:t>
         </w:r>
       </w:hyperlink>
       <w:r>
@@ -21023,7 +21040,7 @@
           <w:rPr>
             <w:rtl w:val="0"/>
           </w:rPr>
-          <w:t xml:space="preserve">31.</w:t>
+          <w:t xml:space="preserve">30.</w:t>
         </w:r>
       </w:hyperlink>
       <w:r>
@@ -21037,7 +21054,7 @@
           <w:rPr>
             <w:rtl w:val="0"/>
           </w:rPr>
-          <w:t xml:space="preserve">Dhand A, Sakoulas G. Reduced vancomycin susceptibility among clinical Staphylococcus aureus isolates (‘the MIC Creep’): implications for therapy. F1000 Med Rep. 2012 Feb 1;4:4. doi:10.3410/M4-4 PubMed PMID: 22312414; PubMed Central PMCID: PMC3270590. </w:t>
+          <w:t xml:space="preserve">Lees JA, Mai TT, Galardini M, Wheeler NE, Horsfield ST, Parkhill J, et al. Improved Prediction of Bacterial Genotype-Phenotype Associations Using Interpretable Pangenome-Spanning Regressions. mBio. 2020 Jul 7;11(4):e01344-20. doi:10.1128/mBio.01344-20 PubMed PMID: 32636251; PubMed Central PMCID: PMC7343994. </w:t>
         </w:r>
       </w:hyperlink>
       <w:r>
@@ -21070,7 +21087,7 @@
           <w:rPr>
             <w:rtl w:val="0"/>
           </w:rPr>
-          <w:t xml:space="preserve">32.</w:t>
+          <w:t xml:space="preserve">31.</w:t>
         </w:r>
       </w:hyperlink>
       <w:r>
@@ -21084,7 +21101,7 @@
           <w:rPr>
             <w:rtl w:val="0"/>
           </w:rPr>
-          <w:t xml:space="preserve">Ryu S, Cowling BJ, Wu P, Olesen S, Fraser C, Sun DS, et al. Case-based surveillance of antimicrobial resistance with full susceptibility profiles. JAC Antimicrob Resist. 2019 Dec;1(3):dlz070. doi:10.1093/jacamr/dlz070 PubMed PMID: 32280945; PubMed Central PMCID: PMC7134534. </w:t>
+          <w:t xml:space="preserve">Dhand A, Sakoulas G. Reduced vancomycin susceptibility among clinical Staphylococcus aureus isolates (‘the MIC Creep’): implications for therapy. F1000 Med Rep. 2012 Feb 1;4:4. doi:10.3410/M4-4 PubMed PMID: 22312414; PubMed Central PMCID: PMC3270590. </w:t>
         </w:r>
       </w:hyperlink>
       <w:r>
@@ -21117,7 +21134,7 @@
           <w:rPr>
             <w:rtl w:val="0"/>
           </w:rPr>
-          <w:t xml:space="preserve">33.</w:t>
+          <w:t xml:space="preserve">32.</w:t>
         </w:r>
       </w:hyperlink>
       <w:r>
@@ -21131,7 +21148,7 @@
           <w:rPr>
             <w:rtl w:val="0"/>
           </w:rPr>
-          <w:t xml:space="preserve">CRyPTIC Consortium. Quantitative measurement of antibiotic resistance in Mycobacterium tuberculosis reveals genetic determinants of resistance and susceptibility in a target gene approach. Nat Commun. 2024 Jan 12;15(1):488. doi:10.1038/s41467-023-44325-5 PubMed PMID: 38216576; PubMed Central PMCID: PMC10786857. </w:t>
+          <w:t xml:space="preserve">Ryu S, Cowling BJ, Wu P, Olesen S, Fraser C, Sun DS, et al. Case-based surveillance of antimicrobial resistance with full susceptibility profiles. JAC Antimicrob Resist. 2019 Dec;1(3):dlz070. doi:10.1093/jacamr/dlz070 PubMed PMID: 32280945; PubMed Central PMCID: PMC7134534. </w:t>
         </w:r>
       </w:hyperlink>
       <w:r>
@@ -21164,7 +21181,7 @@
           <w:rPr>
             <w:rtl w:val="0"/>
           </w:rPr>
-          <w:t xml:space="preserve">34.</w:t>
+          <w:t xml:space="preserve">33.</w:t>
         </w:r>
       </w:hyperlink>
       <w:r>
@@ -21178,7 +21195,7 @@
           <w:rPr>
             <w:rtl w:val="0"/>
           </w:rPr>
-          <w:t xml:space="preserve">Mallawaarachchi S, Tonkin-Hill G, Croucher NJ, Turner P, Speed D, Corander J, et al. Genome-wide association, prediction and heritability in bacteria with application to Streptococcus pneumoniae. NAR Genomics Bioinforma. 2022 Mar;4(1):lqac011. doi:10.1093/nargab/lqac011 PubMed PMID: 35211669; PubMed Central PMCID: PMC8862724. </w:t>
+          <w:t xml:space="preserve">CRyPTIC Consortium. Quantitative measurement of antibiotic resistance in Mycobacterium tuberculosis reveals genetic determinants of resistance and susceptibility in a target gene approach. Nat Commun. 2024 Jan 12;15(1):488. doi:10.1038/s41467-023-44325-5 PubMed PMID: 38216576; PubMed Central PMCID: PMC10786857. </w:t>
         </w:r>
       </w:hyperlink>
       <w:r>
@@ -21211,7 +21228,7 @@
           <w:rPr>
             <w:rtl w:val="0"/>
           </w:rPr>
-          <w:t xml:space="preserve">35.</w:t>
+          <w:t xml:space="preserve">34.</w:t>
         </w:r>
       </w:hyperlink>
       <w:r>
@@ -21225,7 +21242,7 @@
           <w:rPr>
             <w:rtl w:val="0"/>
           </w:rPr>
-          <w:t xml:space="preserve">Gladstone RA, Lo SW, Goater R, Yeats C, Taylor B, Hadfield J, et al. Visualizing variation within global pneumococcal sequence clusters (GPSCS) and country population snapshots to contextualize pneumococcal isolates. Microb Genomics. 2020 Apr 30;6(5):1–13. doi:10.1099/MGEN.0.000357/ PubMed PMID: 32375991. </w:t>
+          <w:t xml:space="preserve">Mallawaarachchi S, Tonkin-Hill G, Croucher NJ, Turner P, Speed D, Corander J, et al. Genome-wide association, prediction and heritability in bacteria with application to Streptococcus pneumoniae. NAR Genomics Bioinforma. 2022 Mar;4(1):lqac011. doi:10.1093/nargab/lqac011 PubMed PMID: 35211669; PubMed Central PMCID: PMC8862724. </w:t>
         </w:r>
       </w:hyperlink>
       <w:r>
@@ -21258,7 +21275,7 @@
           <w:rPr>
             <w:rtl w:val="0"/>
           </w:rPr>
-          <w:t xml:space="preserve">36.</w:t>
+          <w:t xml:space="preserve">35.</w:t>
         </w:r>
       </w:hyperlink>
       <w:r>
@@ -21272,7 +21289,7 @@
           <w:rPr>
             <w:rtl w:val="0"/>
           </w:rPr>
-          <w:t xml:space="preserve">Hakenbeck R. Discovery of β-lactam-resistant variants in diverse pneumococcal populations. Genome Med. 2014 Sep 25;6(9):72. doi:10.1186/s13073-014-0072-8 PubMed PMID: 25473434. </w:t>
+          <w:t xml:space="preserve">Gladstone RA, Lo SW, Goater R, Yeats C, Taylor B, Hadfield J, et al. Visualizing variation within global pneumococcal sequence clusters (GPSCS) and country population snapshots to contextualize pneumococcal isolates. Microb Genomics. 2020 Apr 30;6(5):1–13. doi:10.1099/MGEN.0.000357/ PubMed PMID: 32375991. </w:t>
         </w:r>
       </w:hyperlink>
       <w:r>
@@ -21305,7 +21322,7 @@
           <w:rPr>
             <w:rtl w:val="0"/>
           </w:rPr>
-          <w:t xml:space="preserve">37.</w:t>
+          <w:t xml:space="preserve">36.</w:t>
         </w:r>
       </w:hyperlink>
       <w:r>
@@ -21319,7 +21336,7 @@
           <w:rPr>
             <w:rtl w:val="0"/>
           </w:rPr>
-          <w:t xml:space="preserve">Dowson CG, Hutchison A, Brannigan JA, George RC, Hansman D, Liñares J, et al. Horizontal transfer of penicillin-binding protein genes in penicillin-resistant clinical isolates of Streptococcus pneumoniae. Proc Natl Acad Sci U S A. 1989 Nov;86(22):8842–6. doi:10.1073/pnas.86.22.8842 PubMed PMID: 2813426; PubMed Central PMCID: PMC298386. </w:t>
+          <w:t xml:space="preserve">Hakenbeck R. Discovery of β-lactam-resistant variants in diverse pneumococcal populations. Genome Med. 2014 Sep 25;6(9):72. doi:10.1186/s13073-014-0072-8 PubMed PMID: 25473434. </w:t>
         </w:r>
       </w:hyperlink>
       <w:r>
@@ -21352,7 +21369,7 @@
           <w:rPr>
             <w:rtl w:val="0"/>
           </w:rPr>
-          <w:t xml:space="preserve">38.</w:t>
+          <w:t xml:space="preserve">37.</w:t>
         </w:r>
       </w:hyperlink>
       <w:r>
@@ -21366,7 +21383,7 @@
           <w:rPr>
             <w:rtl w:val="0"/>
           </w:rPr>
-          <w:t xml:space="preserve">Skwark MJ, Croucher NJ, Puranen S, Chewapreecha C, Pesonen M, Xu YY, et al. Interacting networks of resistance, virulence and core machinery genes identified by genome-wide epistasis analysis. PLOS Genet. 2017 Feb 16;13(2):e1006508. doi:10.1371/journal.pgen.1006508 </w:t>
+          <w:t xml:space="preserve">Dowson CG, Hutchison A, Brannigan JA, George RC, Hansman D, Liñares J, et al. Horizontal transfer of penicillin-binding protein genes in penicillin-resistant clinical isolates of Streptococcus pneumoniae. Proc Natl Acad Sci U S A. 1989 Nov;86(22):8842–6. doi:10.1073/pnas.86.22.8842 PubMed PMID: 2813426; PubMed Central PMCID: PMC298386. </w:t>
         </w:r>
       </w:hyperlink>
       <w:r>
@@ -21399,7 +21416,7 @@
           <w:rPr>
             <w:rtl w:val="0"/>
           </w:rPr>
-          <w:t xml:space="preserve">39.</w:t>
+          <w:t xml:space="preserve">38.</w:t>
         </w:r>
       </w:hyperlink>
       <w:r>
@@ -21413,7 +21430,7 @@
           <w:rPr>
             <w:rtl w:val="0"/>
           </w:rPr>
-          <w:t xml:space="preserve">Pensar J, Puranen S, Arnold B, MacAlasdair N, Kuronen J, Tonkin-Hill G, et al. Genome-wide epistasis and co-selection study using mutual information. Nucleic Acids Res. 2019 Oct 10;47(18):e112. doi:10.1093/nar/gkz656 </w:t>
+          <w:t xml:space="preserve">Skwark MJ, Croucher NJ, Puranen S, Chewapreecha C, Pesonen M, Xu YY, et al. Interacting networks of resistance, virulence and core machinery genes identified by genome-wide epistasis analysis. PLOS Genet. 2017 Feb 16;13(2):e1006508. doi:10.1371/journal.pgen.1006508 </w:t>
         </w:r>
       </w:hyperlink>
       <w:r>
@@ -21446,7 +21463,7 @@
           <w:rPr>
             <w:rtl w:val="0"/>
           </w:rPr>
-          <w:t xml:space="preserve">40.</w:t>
+          <w:t xml:space="preserve">39.</w:t>
         </w:r>
       </w:hyperlink>
       <w:r>
@@ -21460,7 +21477,7 @@
           <w:rPr>
             <w:rtl w:val="0"/>
           </w:rPr>
-          <w:t xml:space="preserve">Orio AGA, Piñas GE, Cortes PR, Cian MB, Echenique J. Compensatory Evolution of pbp Mutations Restores the Fitness Cost Imposed by β-Lactam Resistance in Streptococcus pneumoniae. PLOS Pathog. 2011 Feb 17;7(2):e1002000. doi:10.1371/journal.ppat.1002000 </w:t>
+          <w:t xml:space="preserve">Pensar J, Puranen S, Arnold B, MacAlasdair N, Kuronen J, Tonkin-Hill G, et al. Genome-wide epistasis and co-selection study using mutual information. Nucleic Acids Res. 2019 Oct 10;47(18):e112. doi:10.1093/nar/gkz656 </w:t>
         </w:r>
       </w:hyperlink>
       <w:r>
@@ -21493,7 +21510,7 @@
           <w:rPr>
             <w:rtl w:val="0"/>
           </w:rPr>
-          <w:t xml:space="preserve">41.</w:t>
+          <w:t xml:space="preserve">40.</w:t>
         </w:r>
       </w:hyperlink>
       <w:r>
@@ -21507,7 +21524,7 @@
           <w:rPr>
             <w:rtl w:val="0"/>
           </w:rPr>
-          <w:t xml:space="preserve">Mouz N, Di Guilmi AM, Gordon E, Hakenbeck R, Dideberg O, Vernet T. Mutations in the active site of penicillin-binding protein PBP2x from Streptococcus pneumoniae. Role in the specificity for beta-lactam antibiotics. J Biol Chem. 1999 Jul 2;274(27):19175–80. doi:10.1074/jbc.274.27.19175 PubMed PMID: 10383423. </w:t>
+          <w:t xml:space="preserve">Orio AGA, Piñas GE, Cortes PR, Cian MB, Echenique J. Compensatory Evolution of pbp Mutations Restores the Fitness Cost Imposed by β-Lactam Resistance in Streptococcus pneumoniae. PLOS Pathog. 2011 Feb 17;7(2):e1002000. doi:10.1371/journal.ppat.1002000 </w:t>
         </w:r>
       </w:hyperlink>
       <w:r>
@@ -21540,7 +21557,7 @@
           <w:rPr>
             <w:rtl w:val="0"/>
           </w:rPr>
-          <w:t xml:space="preserve">42.</w:t>
+          <w:t xml:space="preserve">41.</w:t>
         </w:r>
       </w:hyperlink>
       <w:r>
@@ -21554,7 +21571,7 @@
           <w:rPr>
             <w:rtl w:val="0"/>
           </w:rPr>
-          <w:t xml:space="preserve">Zerfaß I, Hakenbeck R, Denapaite D. An Important Site in PBP2x of Penicillin-Resistant Clinical Isolates of Streptococcus pneumoniae: Mutational Analysis of Thr338. Antimicrob Agents Chemother. 2009 Mar;53(3):1107–15. doi:10.1128/AAC.01107-08 PubMed PMID: 19075056; PubMed Central PMCID: PMC2650557. </w:t>
+          <w:t xml:space="preserve">Mouz N, Di Guilmi AM, Gordon E, Hakenbeck R, Dideberg O, Vernet T. Mutations in the active site of penicillin-binding protein PBP2x from Streptococcus pneumoniae. Role in the specificity for beta-lactam antibiotics. J Biol Chem. 1999 Jul 2;274(27):19175–80. doi:10.1074/jbc.274.27.19175 PubMed PMID: 10383423. </w:t>
         </w:r>
       </w:hyperlink>
       <w:r>
@@ -21587,7 +21604,7 @@
           <w:rPr>
             <w:rtl w:val="0"/>
           </w:rPr>
-          <w:t xml:space="preserve">43.</w:t>
+          <w:t xml:space="preserve">42.</w:t>
         </w:r>
       </w:hyperlink>
       <w:r>
@@ -21601,7 +21618,7 @@
           <w:rPr>
             <w:rtl w:val="0"/>
           </w:rPr>
-          <w:t xml:space="preserve">Enright MC, Spratt BG. A multilocus sequence typing scheme for Streptococcus pneumoniae: identification of clones associated with serious invasive disease. Microbiology. 1998 Nov;144 (Pt 11):3049–60. doi:10.1099/00221287-144-11-3049 PubMed PMID: 9846740. </w:t>
+          <w:t xml:space="preserve">Zerfaß I, Hakenbeck R, Denapaite D. An Important Site in PBP2x of Penicillin-Resistant Clinical Isolates of Streptococcus pneumoniae: Mutational Analysis of Thr338. Antimicrob Agents Chemother. 2009 Mar;53(3):1107–15. doi:10.1128/AAC.01107-08 PubMed PMID: 19075056; PubMed Central PMCID: PMC2650557. </w:t>
         </w:r>
       </w:hyperlink>
       <w:r>
@@ -21634,7 +21651,7 @@
           <w:rPr>
             <w:rtl w:val="0"/>
           </w:rPr>
-          <w:t xml:space="preserve">44.</w:t>
+          <w:t xml:space="preserve">43.</w:t>
         </w:r>
       </w:hyperlink>
       <w:r>
@@ -21648,7 +21665,7 @@
           <w:rPr>
             <w:rtl w:val="0"/>
           </w:rPr>
-          <w:t xml:space="preserve">Smith DJ, Lapedes AS, de Jong JC, Bestebroer TM, Rimmelzwaan GF, Osterhaus ADME, et al. Mapping the antigenic and genetic evolution of influenza virus. Science. 2004 Jul 16;305(5682):371–6. doi:10.1126/science.1097211 PubMed PMID: 15218094. </w:t>
+          <w:t xml:space="preserve">Enright MC, Spratt BG. A multilocus sequence typing scheme for Streptococcus pneumoniae: identification of clones associated with serious invasive disease. Microbiology. 1998 Nov;144 (Pt 11):3049–60. doi:10.1099/00221287-144-11-3049 PubMed PMID: 9846740. </w:t>
         </w:r>
       </w:hyperlink>
       <w:r>
@@ -21681,7 +21698,7 @@
           <w:rPr>
             <w:rtl w:val="0"/>
           </w:rPr>
-          <w:t xml:space="preserve">45.</w:t>
+          <w:t xml:space="preserve">44.</w:t>
         </w:r>
       </w:hyperlink>
       <w:r>
@@ -21695,7 +21712,7 @@
           <w:rPr>
             <w:rtl w:val="0"/>
           </w:rPr>
-          <w:t xml:space="preserve">Wilks SH, Mühlemann B, Shen X, Türeli S, LeGresley EB, Netzl A, et al. Mapping SARS-CoV-2 antigenic relationships and serological responses. Science. 2023 Oct 6;382(6666):eadj0070. doi:10.1126/science.adj0070 PubMed PMID: 37797027; PubMed Central PMCID: PMC12145880. </w:t>
+          <w:t xml:space="preserve">Smith DJ, Lapedes AS, de Jong JC, Bestebroer TM, Rimmelzwaan GF, Osterhaus ADME, et al. Mapping the antigenic and genetic evolution of influenza virus. Science. 2004 Jul 16;305(5682):371–6. doi:10.1126/science.1097211 PubMed PMID: 15218094. </w:t>
         </w:r>
       </w:hyperlink>
       <w:r>
@@ -21728,7 +21745,7 @@
           <w:rPr>
             <w:rtl w:val="0"/>
           </w:rPr>
-          <w:t xml:space="preserve">46.</w:t>
+          <w:t xml:space="preserve">45.</w:t>
         </w:r>
       </w:hyperlink>
       <w:r>
@@ -21742,7 +21759,7 @@
           <w:rPr>
             <w:rtl w:val="0"/>
           </w:rPr>
-          <w:t xml:space="preserve">Katzelnick LC, Coello Escoto A, Huang AT, Garcia-Carreras B, Chowdhury N, Maljkovic Berry I, et al. Antigenic evolution of dengue viruses over 20 years. Science. 2021 Nov 19;374(6570):999–1004. doi:10.1126/science.abk0058 PubMed PMID: 34793238; PubMed Central PMCID: PMC8693836. </w:t>
+          <w:t xml:space="preserve">Wilks SH, Mühlemann B, Shen X, Türeli S, LeGresley EB, Netzl A, et al. Mapping SARS-CoV-2 antigenic relationships and serological responses. Science. 2023 Oct 6;382(6666):eadj0070. doi:10.1126/science.adj0070 PubMed PMID: 37797027; PubMed Central PMCID: PMC12145880. </w:t>
         </w:r>
       </w:hyperlink>
       <w:r>
@@ -21775,7 +21792,7 @@
           <w:rPr>
             <w:rtl w:val="0"/>
           </w:rPr>
-          <w:t xml:space="preserve">47.</w:t>
+          <w:t xml:space="preserve">46.</w:t>
         </w:r>
       </w:hyperlink>
       <w:r>
@@ -21789,7 +21806,7 @@
           <w:rPr>
             <w:rtl w:val="0"/>
           </w:rPr>
-          <w:t xml:space="preserve">Fonville JM, Wilks SH, James SL, Fox A, Ventresca M, Aban M, et al. Antibody landscapes after influenza virus infection or vaccination. Science. 2014 Nov 21;346(6212):996–1000. doi:10.1126/science.1256427 PubMed PMID: 25414313; PubMed Central PMCID: PMC4246172. </w:t>
+          <w:t xml:space="preserve">Katzelnick LC, Coello Escoto A, Huang AT, Garcia-Carreras B, Chowdhury N, Maljkovic Berry I, et al. Antigenic evolution of dengue viruses over 20 years. Science. 2021 Nov 19;374(6570):999–1004. doi:10.1126/science.abk0058 PubMed PMID: 34793238; PubMed Central PMCID: PMC8693836. </w:t>
         </w:r>
       </w:hyperlink>
       <w:r>
@@ -21822,7 +21839,7 @@
           <w:rPr>
             <w:rtl w:val="0"/>
           </w:rPr>
-          <w:t xml:space="preserve">48.</w:t>
+          <w:t xml:space="preserve">47.</w:t>
         </w:r>
       </w:hyperlink>
       <w:r>
@@ -21836,7 +21853,7 @@
           <w:rPr>
             <w:rtl w:val="0"/>
           </w:rPr>
-          <w:t xml:space="preserve">Li Y, Metcalf BJ, Chochua S, Li Z, Gertz RE, Walker H, et al. Validation of β-lactam minimum inhibitory concentration predictions for pneumococcal isolates with newly encountered penicillin binding protein (PBP) sequences. BMC Genomics. 2017 Aug 15;18(1):621. doi:10.1186/s12864-017-4017-7 PubMed PMID: 28810827. </w:t>
+          <w:t xml:space="preserve">Fonville JM, Wilks SH, James SL, Fox A, Ventresca M, Aban M, et al. Antibody landscapes after influenza virus infection or vaccination. Science. 2014 Nov 21;346(6212):996–1000. doi:10.1126/science.1256427 PubMed PMID: 25414313; PubMed Central PMCID: PMC4246172. </w:t>
         </w:r>
       </w:hyperlink>
       <w:r>
@@ -21869,7 +21886,7 @@
           <w:rPr>
             <w:rtl w:val="0"/>
           </w:rPr>
-          <w:t xml:space="preserve">49.</w:t>
+          <w:t xml:space="preserve">48.</w:t>
         </w:r>
       </w:hyperlink>
       <w:r>
@@ -21883,7 +21900,7 @@
           <w:rPr>
             <w:rtl w:val="0"/>
           </w:rPr>
-          <w:t xml:space="preserve">Mair P, Groenen PJF, De Leeuw J. More on Multidimensional Scaling and Unfolding in R: smacof Version 2. J Stat Softw. 2022 May 13;102:1–47. doi:10.18637/jss.v102.i10 </w:t>
+          <w:t xml:space="preserve">Li Y, Metcalf BJ, Chochua S, Li Z, Gertz RE, Walker H, et al. Validation of β-lactam minimum inhibitory concentration predictions for pneumococcal isolates with newly encountered penicillin binding protein (PBP) sequences. BMC Genomics. 2017 Aug 15;18(1):621. doi:10.1186/s12864-017-4017-7 PubMed PMID: 28810827. </w:t>
         </w:r>
       </w:hyperlink>
       <w:r>
@@ -21916,7 +21933,7 @@
           <w:rPr>
             <w:rtl w:val="0"/>
           </w:rPr>
-          <w:t xml:space="preserve">50.</w:t>
+          <w:t xml:space="preserve">49.</w:t>
         </w:r>
       </w:hyperlink>
       <w:r>
@@ -21930,7 +21947,7 @@
           <w:rPr>
             <w:rtl w:val="0"/>
           </w:rPr>
-          <w:t xml:space="preserve">De Leeuw J, Mair P. Multidimensional Scaling Using Majorization: SMACOF in R. J Stat Softw. 2009 Aug 4;31:1–30. doi:10.18637/jss.v031.i03 </w:t>
+          <w:t xml:space="preserve">Mair P, Groenen PJF, De Leeuw J. More on Multidimensional Scaling and Unfolding in R: smacof Version 2. J Stat Softw. 2022 May 13;102:1–47. doi:10.18637/jss.v102.i10 </w:t>
         </w:r>
       </w:hyperlink>
       <w:r>
@@ -21963,7 +21980,7 @@
           <w:rPr>
             <w:rtl w:val="0"/>
           </w:rPr>
-          <w:t xml:space="preserve">51.</w:t>
+          <w:t xml:space="preserve">50.</w:t>
         </w:r>
       </w:hyperlink>
       <w:r>
@@ -21977,7 +21994,7 @@
           <w:rPr>
             <w:rtl w:val="0"/>
           </w:rPr>
-          <w:t xml:space="preserve">Pattinson DJ. Predicting the Antigenic Evolution of Influenza Viruses with Application to Vaccination Strategy [Internet]. [Cambridge, UK]: University of Cambridge; 2020 [cited 2025 Aug 15]. Available from: https://www.repository.cam.ac.uk/items/0fd9bca6-c64b-47cd-92b4-34302f5e6bd6 </w:t>
+          <w:t xml:space="preserve">De Leeuw J, Mair P. Multidimensional Scaling Using Majorization: SMACOF in R. J Stat Softw. 2009 Aug 4;31:1–30. doi:10.18637/jss.v031.i03 </w:t>
         </w:r>
       </w:hyperlink>
       <w:r>
@@ -22010,7 +22027,7 @@
           <w:rPr>
             <w:rtl w:val="0"/>
           </w:rPr>
-          <w:t xml:space="preserve">52.</w:t>
+          <w:t xml:space="preserve">51.</w:t>
         </w:r>
       </w:hyperlink>
       <w:r>
@@ -22024,7 +22041,7 @@
           <w:rPr>
             <w:rtl w:val="0"/>
           </w:rPr>
-          <w:t xml:space="preserve">Lippert C, Listgarten J, Liu Y, Kadie CM, Davidson RI, Heckerman D. FaST linear mixed models for genome-wide association studies. Nat Methods. 2011 Oct;8(10):833–5. doi:10.1038/nmeth.1681 </w:t>
+          <w:t xml:space="preserve">Pattinson DJ. Predicting the Antigenic Evolution of Influenza Viruses with Application to Vaccination Strategy [Internet]. [Cambridge, UK]: University of Cambridge; 2020 [cited 2025 Aug 15]. Available from: https://www.repository.cam.ac.uk/items/0fd9bca6-c64b-47cd-92b4-34302f5e6bd6 </w:t>
         </w:r>
       </w:hyperlink>
       <w:r>
@@ -22057,7 +22074,7 @@
           <w:rPr>
             <w:rtl w:val="0"/>
           </w:rPr>
-          <w:t xml:space="preserve">53.</w:t>
+          <w:t xml:space="preserve">52.</w:t>
         </w:r>
       </w:hyperlink>
       <w:r>
@@ -22071,7 +22088,7 @@
           <w:rPr>
             <w:rtl w:val="0"/>
           </w:rPr>
-          <w:t xml:space="preserve">Lippert C, Casale FP, Rakitsch B, Stegle O. LIMIX: genetic analysis of multiple traits [Internet]. bioRxiv; 2014 [cited 2025 Aug 15]. p. 003905. Available from: https://www.biorxiv.org/content/10.1101/003905v1 doi:10.1101/003905 </w:t>
+          <w:t xml:space="preserve">Lippert C, Listgarten J, Liu Y, Kadie CM, Davidson RI, Heckerman D. FaST linear mixed models for genome-wide association studies. Nat Methods. 2011 Oct;8(10):833–5. doi:10.1038/nmeth.1681 </w:t>
         </w:r>
       </w:hyperlink>
       <w:r>
@@ -22104,7 +22121,7 @@
           <w:rPr>
             <w:rtl w:val="0"/>
           </w:rPr>
-          <w:t xml:space="preserve">54.</w:t>
+          <w:t xml:space="preserve">53.</w:t>
         </w:r>
       </w:hyperlink>
       <w:r>
@@ -22118,7 +22135,7 @@
           <w:rPr>
             <w:rtl w:val="0"/>
           </w:rPr>
-          <w:t xml:space="preserve">Andrews JM. Determination of minimum inhibitory concentrations. J Antimicrob Chemother. 2001 Jul 1;48(Suppl 1):5–16. doi:10.1093/jac/48.suppl_1.5 </w:t>
+          <w:t xml:space="preserve">Lippert C, Casale FP, Rakitsch B, Stegle O. LIMIX: genetic analysis of multiple traits [Internet]. bioRxiv; 2014 [cited 2025 Aug 15]. p. 003905. Available from: https://www.biorxiv.org/content/10.1101/003905v1 doi:10.1101/003905 </w:t>
         </w:r>
       </w:hyperlink>
       <w:r>
@@ -22151,7 +22168,7 @@
           <w:rPr>
             <w:rtl w:val="0"/>
           </w:rPr>
-          <w:t xml:space="preserve">55.</w:t>
+          <w:t xml:space="preserve">54.</w:t>
         </w:r>
       </w:hyperlink>
       <w:r>
@@ -22165,7 +22182,7 @@
           <w:rPr>
             <w:rtl w:val="0"/>
           </w:rPr>
-          <w:t xml:space="preserve">Bedford T, Rambaut A, Pascual M. Canalization of the evolutionary trajectory of the human influenza virus. BMC Biol. 2012 Apr 30;10(1):38. doi:10.1186/1741-7007-10-38 </w:t>
+          <w:t xml:space="preserve">Brennan-Krohn T, Smith KP, Kirby JE. The Poisoned Well: Enhancing the Predictive Value of Antimicrobial Susceptibility Testing in the Era of Multidrug Resistance. J Clin Microbiol. 2017 Aug;55(8):2304–8. doi:10.1128/JCM.00511-17 PubMed PMID: 28468856; PubMed Central PMCID: PMC5527407. </w:t>
         </w:r>
       </w:hyperlink>
       <w:r>
@@ -22198,7 +22215,7 @@
           <w:rPr>
             <w:rtl w:val="0"/>
           </w:rPr>
-          <w:t xml:space="preserve">56.</w:t>
+          <w:t xml:space="preserve">55.</w:t>
         </w:r>
       </w:hyperlink>
       <w:r>
@@ -22212,7 +22229,7 @@
           <w:rPr>
             <w:rtl w:val="0"/>
           </w:rPr>
-          <w:t xml:space="preserve">Gibson PS, Bexkens E, Zuber S, Cowley LA, Veening JW. The acquisition of clinically relevant amoxicillin resistance in Streptococcus pneumoniae requires ordered horizontal gene transfer of four loci. PLOS Pathog. 2022 Jul 25;18(7):e1010727. doi:10.1371/journal.ppat.1010727 </w:t>
+          <w:t xml:space="preserve">Andrews JM. Determination of minimum inhibitory concentrations. J Antimicrob Chemother. 2001 Jul 1;48(Suppl 1):5–16. doi:10.1093/jac/48.suppl_1.5 </w:t>
         </w:r>
       </w:hyperlink>
       <w:r>
@@ -22245,7 +22262,7 @@
           <w:rPr>
             <w:rtl w:val="0"/>
           </w:rPr>
-          <w:t xml:space="preserve">57.</w:t>
+          <w:t xml:space="preserve">56.</w:t>
         </w:r>
       </w:hyperlink>
       <w:r>
@@ -22259,7 +22276,7 @@
           <w:rPr>
             <w:rtl w:val="0"/>
           </w:rPr>
-          <w:t xml:space="preserve">Batisti Biffignandi G, Chindelevitch L, Corbella M, Feil EJ, Sassera D, Lees JA. Optimising machine learning prediction of minimum inhibitory concentrations in Klebsiella pneumoniae. Microb Genomics. 2024 Mar;10(3):001222. doi:10.1099/mgen.0.001222 PubMed PMID: 38529944; PubMed Central PMCID: PMC10995625. </w:t>
+          <w:t xml:space="preserve">Bedford T, Rambaut A, Pascual M. Canalization of the evolutionary trajectory of the human influenza virus. BMC Biol. 2012 Apr 30;10(1):38. doi:10.1186/1741-7007-10-38 </w:t>
         </w:r>
       </w:hyperlink>
       <w:r>
@@ -22292,7 +22309,7 @@
           <w:rPr>
             <w:rtl w:val="0"/>
           </w:rPr>
-          <w:t xml:space="preserve">58.</w:t>
+          <w:t xml:space="preserve">57.</w:t>
         </w:r>
       </w:hyperlink>
       <w:r>
@@ -22306,7 +22323,7 @@
           <w:rPr>
             <w:rtl w:val="0"/>
           </w:rPr>
-          <w:t xml:space="preserve">Schaid DJ, Chen W, Larson NB. From genome-wide associations to candidate causal variants by statistical fine-mapping. Nat Rev Genet. 2018 Aug;19(8):491–504. doi:10.1038/s41576-018-0016-z PubMed PMID: 29844615; PubMed Central PMCID: PMC6050137. </w:t>
+          <w:t xml:space="preserve">Gibson PS, Bexkens E, Zuber S, Cowley LA, Veening JW. The acquisition of clinically relevant amoxicillin resistance in Streptococcus pneumoniae requires ordered horizontal gene transfer of four loci. PLOS Pathog. 2022 Jul 25;18(7):e1010727. doi:10.1371/journal.ppat.1010727 </w:t>
         </w:r>
       </w:hyperlink>
       <w:r>
@@ -22339,7 +22356,7 @@
           <w:rPr>
             <w:rtl w:val="0"/>
           </w:rPr>
-          <w:t xml:space="preserve">59.</w:t>
+          <w:t xml:space="preserve">58.</w:t>
         </w:r>
       </w:hyperlink>
       <w:r>
@@ -22353,7 +22370,7 @@
           <w:rPr>
             <w:rtl w:val="0"/>
           </w:rPr>
-          <w:t xml:space="preserve">Lekhuleni C, Ndlangisa K, Gladstone RA, Chochua S, Metcalf BJ, Li Y, et al. Impact of pneumococcal conjugate vaccines on invasive pneumococcal disease-causing lineages among South African children. Nat Commun. 2024 Sep 27;15(1):8401. doi:10.1038/s41467-024-52459-3 </w:t>
+          <w:t xml:space="preserve">Batisti Biffignandi G, Chindelevitch L, Corbella M, Feil EJ, Sassera D, Lees JA. Optimising machine learning prediction of minimum inhibitory concentrations in Klebsiella pneumoniae. Microb Genomics. 2024 Mar;10(3):001222. doi:10.1099/mgen.0.001222 PubMed PMID: 38529944; PubMed Central PMCID: PMC10995625. </w:t>
         </w:r>
       </w:hyperlink>
       <w:r>
@@ -22386,7 +22403,7 @@
           <w:rPr>
             <w:rtl w:val="0"/>
           </w:rPr>
-          <w:t xml:space="preserve">60.</w:t>
+          <w:t xml:space="preserve">59.</w:t>
         </w:r>
       </w:hyperlink>
       <w:r>
@@ -22400,7 +22417,7 @@
           <w:rPr>
             <w:rtl w:val="0"/>
           </w:rPr>
-          <w:t xml:space="preserve">Colangeli R, Jedrey H, Kim S, Connell R, Ma S, Chippada Venkata UD, et al. Bacterial Factors That Predict Relapse after Tuberculosis Therapy. N Engl J Med. 2018 Aug 30;379(9):823–33. doi:10.1056/NEJMoa1715849 PubMed PMID: 30157391; PubMed Central PMCID: PMC6317071. </w:t>
+          <w:t xml:space="preserve">Schaid DJ, Chen W, Larson NB. From genome-wide associations to candidate causal variants by statistical fine-mapping. Nat Rev Genet. 2018 Aug;19(8):491–504. doi:10.1038/s41576-018-0016-z PubMed PMID: 29844615; PubMed Central PMCID: PMC6050137. </w:t>
         </w:r>
       </w:hyperlink>
       <w:r>
@@ -22433,7 +22450,7 @@
           <w:rPr>
             <w:rtl w:val="0"/>
           </w:rPr>
-          <w:t xml:space="preserve">61.</w:t>
+          <w:t xml:space="preserve">60.</w:t>
         </w:r>
       </w:hyperlink>
       <w:r>
@@ -22447,7 +22464,7 @@
           <w:rPr>
             <w:rtl w:val="0"/>
           </w:rPr>
-          <w:t xml:space="preserve">Negri MC, Lipsitch M, Blázquez J, Levin BR, Baquero F. Concentration-dependent selection of small phenotypic differences in TEM beta-lactamase-mediated antibiotic resistance. Antimicrob Agents Chemother. 2000 Sep;44(9):2485–91. doi:10.1128/AAC.44.9.2485-2491.2000 PubMed PMID: 10952599; PubMed Central PMCID: PMC90089. </w:t>
+          <w:t xml:space="preserve">Lekhuleni C, Ndlangisa K, Gladstone RA, Chochua S, Metcalf BJ, Li Y, et al. Impact of pneumococcal conjugate vaccines on invasive pneumococcal disease-causing lineages among South African children. Nat Commun. 2024 Sep 27;15(1):8401. doi:10.1038/s41467-024-52459-3 </w:t>
         </w:r>
       </w:hyperlink>
       <w:r>
@@ -22480,7 +22497,7 @@
           <w:rPr>
             <w:rtl w:val="0"/>
           </w:rPr>
-          <w:t xml:space="preserve">62.</w:t>
+          <w:t xml:space="preserve">61.</w:t>
         </w:r>
       </w:hyperlink>
       <w:r>
@@ -22494,7 +22511,7 @@
           <w:rPr>
             <w:rtl w:val="0"/>
           </w:rPr>
-          <w:t xml:space="preserve">Liakopoulos A, Aulin LBS, Buffoni M, Fragkiskou E, van Hasselt JGC, Rozen DE. Allele-specific collateral and fitness effects determine the dynamics of fluoroquinolone resistance evolution. Proc Natl Acad Sci U S A. 2022 May 3;119(18):e2121768119. doi:10.1073/pnas.2121768119 PubMed PMID: 35476512; PubMed Central PMCID: PMC9170170. </w:t>
+          <w:t xml:space="preserve">Colangeli R, Jedrey H, Kim S, Connell R, Ma S, Chippada Venkata UD, et al. Bacterial Factors That Predict Relapse after Tuberculosis Therapy. N Engl J Med. 2018 Aug 30;379(9):823–33. doi:10.1056/NEJMoa1715849 PubMed PMID: 30157391; PubMed Central PMCID: PMC6317071. </w:t>
         </w:r>
       </w:hyperlink>
       <w:r>
@@ -22527,7 +22544,7 @@
           <w:rPr>
             <w:rtl w:val="0"/>
           </w:rPr>
-          <w:t xml:space="preserve">63.</w:t>
+          <w:t xml:space="preserve">62.</w:t>
         </w:r>
       </w:hyperlink>
       <w:r>
@@ -22541,7 +22558,7 @@
           <w:rPr>
             <w:rtl w:val="0"/>
           </w:rPr>
-          <w:t xml:space="preserve">Hernando-Amado S, Laborda P, Martínez JL. Tackling antibiotic resistance by inducing transient and robust collateral sensitivity. Nat Commun. 2023 Mar 30;14(1):1723. doi:10.1038/s41467-023-37357-4 </w:t>
+          <w:t xml:space="preserve">Negri MC, Lipsitch M, Blázquez J, Levin BR, Baquero F. Concentration-dependent selection of small phenotypic differences in TEM beta-lactamase-mediated antibiotic resistance. Antimicrob Agents Chemother. 2000 Sep;44(9):2485–91. doi:10.1128/AAC.44.9.2485-2491.2000 PubMed PMID: 10952599; PubMed Central PMCID: PMC90089. </w:t>
         </w:r>
       </w:hyperlink>
       <w:r>
@@ -22574,7 +22591,7 @@
           <w:rPr>
             <w:rtl w:val="0"/>
           </w:rPr>
-          <w:t xml:space="preserve">64.</w:t>
+          <w:t xml:space="preserve">63.</w:t>
         </w:r>
       </w:hyperlink>
       <w:r>
@@ -22588,7 +22605,7 @@
           <w:rPr>
             <w:rtl w:val="0"/>
           </w:rPr>
-          <w:t xml:space="preserve">Lehtinen S, Blanquart F, Croucher NJ, Turner P, Lipsitch M, Fraser C. Evolution of antibiotic resistance is linked to any genetic mechanism affecting bacterial duration of carriage. Proc Natl Acad Sci U S A. 2017 Jan 31;114(5):1075–80. doi:10.1073/pnas.1617849114 PubMed PMID: 28096340; PubMed Central PMCID: PMC5293062. </w:t>
+          <w:t xml:space="preserve">Liakopoulos A, Aulin LBS, Buffoni M, Fragkiskou E, van Hasselt JGC, Rozen DE. Allele-specific collateral and fitness effects determine the dynamics of fluoroquinolone resistance evolution. Proc Natl Acad Sci U S A. 2022 May 3;119(18):e2121768119. doi:10.1073/pnas.2121768119 PubMed PMID: 35476512; PubMed Central PMCID: PMC9170170. </w:t>
         </w:r>
       </w:hyperlink>
       <w:r>
@@ -22621,7 +22638,7 @@
           <w:rPr>
             <w:rtl w:val="0"/>
           </w:rPr>
-          <w:t xml:space="preserve">65.</w:t>
+          <w:t xml:space="preserve">64.</w:t>
         </w:r>
       </w:hyperlink>
       <w:r>
@@ -22635,7 +22652,7 @@
           <w:rPr>
             <w:rtl w:val="0"/>
           </w:rPr>
-          <w:t xml:space="preserve">Hanage WP, Fraser C, Tang J, Connor TR, Corander J. Hyper-recombination, diversity, and antibiotic resistance in pneumococcus. Science. 2009 Jun 12;324(5933):1454–7. doi:10.1126/science.1171908 PubMed PMID: 19520963. </w:t>
+          <w:t xml:space="preserve">Hernando-Amado S, Laborda P, Martínez JL. Tackling antibiotic resistance by inducing transient and robust collateral sensitivity. Nat Commun. 2023 Mar 30;14(1):1723. doi:10.1038/s41467-023-37357-4 </w:t>
         </w:r>
       </w:hyperlink>
       <w:r>
@@ -22668,7 +22685,7 @@
           <w:rPr>
             <w:rtl w:val="0"/>
           </w:rPr>
-          <w:t xml:space="preserve">66.</w:t>
+          <w:t xml:space="preserve">65.</w:t>
         </w:r>
       </w:hyperlink>
       <w:r>
@@ -22682,7 +22699,7 @@
           <w:rPr>
             <w:rtl w:val="0"/>
           </w:rPr>
-          <w:t xml:space="preserve">Dagan R, Klugman KP. Impact of conjugate pneumococcal vaccines on antibiotic resistance. Lancet Infect Dis. 2008 Dec;8(12):785–95. doi:10.1016/S1473-3099(08)70281-0 PubMed PMID: 19022193. </w:t>
+          <w:t xml:space="preserve">Lehtinen S, Blanquart F, Croucher NJ, Turner P, Lipsitch M, Fraser C. Evolution of antibiotic resistance is linked to any genetic mechanism affecting bacterial duration of carriage. Proc Natl Acad Sci U S A. 2017 Jan 31;114(5):1075–80. doi:10.1073/pnas.1617849114 PubMed PMID: 28096340; PubMed Central PMCID: PMC5293062. </w:t>
         </w:r>
       </w:hyperlink>
       <w:r>
@@ -22715,7 +22732,7 @@
           <w:rPr>
             <w:rtl w:val="0"/>
           </w:rPr>
-          <w:t xml:space="preserve">67.</w:t>
+          <w:t xml:space="preserve">66.</w:t>
         </w:r>
       </w:hyperlink>
       <w:r>
@@ -22729,7 +22746,7 @@
           <w:rPr>
             <w:rtl w:val="0"/>
           </w:rPr>
-          <w:t xml:space="preserve">Kyaw MH, Lynfield R, Schaffner W, Craig AS, Hadler J, Reingold A, et al. Effect of introduction of the pneumococcal conjugate vaccine on drug-resistant Streptococcus pneumoniae. N Engl J Med. 2006 Apr 6;354(14):1455–63. doi:10.1056/NEJMoa051642 PubMed PMID: 16598044. </w:t>
+          <w:t xml:space="preserve">Hanage WP, Fraser C, Tang J, Connor TR, Corander J. Hyper-recombination, diversity, and antibiotic resistance in pneumococcus. Science. 2009 Jun 12;324(5933):1454–7. doi:10.1126/science.1171908 PubMed PMID: 19520963. </w:t>
         </w:r>
       </w:hyperlink>
       <w:r>
@@ -22762,7 +22779,7 @@
           <w:rPr>
             <w:rtl w:val="0"/>
           </w:rPr>
-          <w:t xml:space="preserve">68.</w:t>
+          <w:t xml:space="preserve">67.</w:t>
         </w:r>
       </w:hyperlink>
       <w:r>
@@ -22776,7 +22793,7 @@
           <w:rPr>
             <w:rtl w:val="0"/>
           </w:rPr>
-          <w:t xml:space="preserve">Wildfire J, Waterlow NR, Clements A, Fuller NM, Knight GM. MIC distribution analysis identifies differences in AMR between population sub-groups. Wellcome Open Res. 2024;9:244. doi:10.12688/wellcomeopenres.21269.1 PubMed PMID: 39119595; PubMed Central PMCID: PMC11306957. </w:t>
+          <w:t xml:space="preserve">Dagan R, Klugman KP. Impact of conjugate pneumococcal vaccines on antibiotic resistance. Lancet Infect Dis. 2008 Dec;8(12):785–95. doi:10.1016/S1473-3099(08)70281-0 PubMed PMID: 19022193. </w:t>
         </w:r>
       </w:hyperlink>
       <w:r>
@@ -22809,7 +22826,7 @@
           <w:rPr>
             <w:rtl w:val="0"/>
           </w:rPr>
-          <w:t xml:space="preserve">69.</w:t>
+          <w:t xml:space="preserve">68.</w:t>
         </w:r>
       </w:hyperlink>
       <w:r>
@@ -22823,7 +22840,7 @@
           <w:rPr>
             <w:rtl w:val="0"/>
           </w:rPr>
-          <w:t xml:space="preserve">Kenyon C, Laumen J, Van Den Bossche D, Van Dijck C. Where have all the susceptible gonococci gone? A historical review of changes in MIC distribution over the past 75 years. BMC Infect Dis. 2019 Dec 27;19(1):1085. doi:10.1186/s12879-019-4712-x </w:t>
+          <w:t xml:space="preserve">Kyaw MH, Lynfield R, Schaffner W, Craig AS, Hadler J, Reingold A, et al. Effect of introduction of the pneumococcal conjugate vaccine on drug-resistant Streptococcus pneumoniae. N Engl J Med. 2006 Apr 6;354(14):1455–63. doi:10.1056/NEJMoa051642 PubMed PMID: 16598044. </w:t>
         </w:r>
       </w:hyperlink>
       <w:r>
@@ -22856,7 +22873,7 @@
           <w:rPr>
             <w:rtl w:val="0"/>
           </w:rPr>
-          <w:t xml:space="preserve">70.</w:t>
+          <w:t xml:space="preserve">69.</w:t>
         </w:r>
       </w:hyperlink>
       <w:r>
@@ -22870,7 +22887,7 @@
           <w:rPr>
             <w:rtl w:val="0"/>
           </w:rPr>
-          <w:t xml:space="preserve">Bedford T, Suchard MA, Lemey P, Dudas G, Gregory V, Hay AJ, et al. Integrating influenza antigenic dynamics with molecular evolution. eLife. 2014 Feb 4;3:e01914. doi:10.7554/eLife.01914 </w:t>
+          <w:t xml:space="preserve">Wildfire J, Waterlow NR, Clements A, Fuller NM, Knight GM. MIC distribution analysis identifies differences in AMR between population sub-groups. Wellcome Open Res. 2024;9:244. doi:10.12688/wellcomeopenres.21269.1 PubMed PMID: 39119595; PubMed Central PMCID: PMC11306957. </w:t>
         </w:r>
       </w:hyperlink>
       <w:r>
@@ -22903,7 +22920,7 @@
           <w:rPr>
             <w:rtl w:val="0"/>
           </w:rPr>
-          <w:t xml:space="preserve">71.</w:t>
+          <w:t xml:space="preserve">70.</w:t>
         </w:r>
       </w:hyperlink>
       <w:r>
@@ -22917,7 +22934,7 @@
           <w:rPr>
             <w:rtl w:val="0"/>
           </w:rPr>
-          <w:t xml:space="preserve">Balmer A. Multivariate Methods for the Study of Beta-lactam Resistance in Streptococci [PhD Thesis] [Internet]. [Cambridge, UK]: University of Cambridge; 2025 [cited 2025 Aug 15]. Available from: https://www.repository.cam.ac.uk/items/a20b3ee7-5ae5-417f-a95f-15299a52caff </w:t>
+          <w:t xml:space="preserve">Kenyon C, Laumen J, Van Den Bossche D, Van Dijck C. Where have all the susceptible gonococci gone? A historical review of changes in MIC distribution over the past 75 years. BMC Infect Dis. 2019 Dec 27;19(1):1085. doi:10.1186/s12879-019-4712-x </w:t>
         </w:r>
       </w:hyperlink>
       <w:r>
@@ -22950,7 +22967,7 @@
           <w:rPr>
             <w:rtl w:val="0"/>
           </w:rPr>
-          <w:t xml:space="preserve">72.</w:t>
+          <w:t xml:space="preserve">71.</w:t>
         </w:r>
       </w:hyperlink>
       <w:r>
@@ -22964,7 +22981,7 @@
           <w:rPr>
             <w:rtl w:val="0"/>
           </w:rPr>
-          <w:t xml:space="preserve">Global antimicrobial resistance and use surveillance system (‎GLASS)‎ report: 2022 [Internet]. [cited 2024 Jun 22]. Available from: https://www.who.int/publications/i/item/9789240062702 </w:t>
+          <w:t xml:space="preserve">Bedford T, Suchard MA, Lemey P, Dudas G, Gregory V, Hay AJ, et al. Integrating influenza antigenic dynamics with molecular evolution. eLife. 2014 Feb 4;3:e01914. doi:10.7554/eLife.01914 </w:t>
         </w:r>
       </w:hyperlink>
       <w:r>
@@ -22997,6 +23014,53 @@
           <w:rPr>
             <w:rtl w:val="0"/>
           </w:rPr>
+          <w:t xml:space="preserve">72.</w:t>
+        </w:r>
+      </w:hyperlink>
+      <w:r>
+        <w:rPr>
+          <w:rtl w:val="0"/>
+        </w:rPr>
+        <w:tab/>
+      </w:r>
+      <w:hyperlink r:id="rId236">
+        <w:r>
+          <w:rPr>
+            <w:rtl w:val="0"/>
+          </w:rPr>
+          <w:t xml:space="preserve">Balmer A. Multivariate Methods for the Study of Beta-lactam Resistance in Streptococci [PhD Thesis] [Internet]. [Cambridge, UK]: University of Cambridge; 2025 [cited 2025 Aug 15]. Available from: https://www.repository.cam.ac.uk/items/a20b3ee7-5ae5-417f-a95f-15299a52caff </w:t>
+        </w:r>
+      </w:hyperlink>
+      <w:r>
+        <w:rPr>
+          <w:rtl w:val="0"/>
+        </w:rPr>
+      </w:r>
+    </w:p>
+    <w:p>
+      <w:pPr>
+        <w:keepNext w:val="0"/>
+        <w:keepLines w:val="0"/>
+        <w:pageBreakBefore w:val="0"/>
+        <w:widowControl w:val="0"/>
+        <w:pBdr>
+          <w:top w:space="0" w:sz="0" w:val="nil"/>
+          <w:left w:space="0" w:sz="0" w:val="nil"/>
+          <w:bottom w:space="0" w:sz="0" w:val="nil"/>
+          <w:right w:space="0" w:sz="0" w:val="nil"/>
+          <w:between w:space="0" w:sz="0" w:val="nil"/>
+        </w:pBdr>
+        <w:shd w:fill="auto" w:val="clear"/>
+        <w:spacing w:after="240" w:before="0" w:line="240" w:lineRule="auto"/>
+        <w:ind w:left="384.00000000000006" w:right="0" w:hanging="384.00000000000006"/>
+        <w:jc w:val="left"/>
+        <w:rPr/>
+      </w:pPr>
+      <w:hyperlink r:id="rId237">
+        <w:r>
+          <w:rPr>
+            <w:rtl w:val="0"/>
+          </w:rPr>
           <w:t xml:space="preserve">73.</w:t>
         </w:r>
       </w:hyperlink>
@@ -23006,7 +23070,54 @@
         </w:rPr>
         <w:tab/>
       </w:r>
-      <w:hyperlink r:id="rId236">
+      <w:hyperlink r:id="rId238">
+        <w:r>
+          <w:rPr>
+            <w:rtl w:val="0"/>
+          </w:rPr>
+          <w:t xml:space="preserve">Global antimicrobial resistance and use surveillance system (‎GLASS)‎ report: 2022 [Internet]. [cited 2024 Jun 22]. Available from: https://www.who.int/publications/i/item/9789240062702 </w:t>
+        </w:r>
+      </w:hyperlink>
+      <w:r>
+        <w:rPr>
+          <w:rtl w:val="0"/>
+        </w:rPr>
+      </w:r>
+    </w:p>
+    <w:p>
+      <w:pPr>
+        <w:keepNext w:val="0"/>
+        <w:keepLines w:val="0"/>
+        <w:pageBreakBefore w:val="0"/>
+        <w:widowControl w:val="0"/>
+        <w:pBdr>
+          <w:top w:space="0" w:sz="0" w:val="nil"/>
+          <w:left w:space="0" w:sz="0" w:val="nil"/>
+          <w:bottom w:space="0" w:sz="0" w:val="nil"/>
+          <w:right w:space="0" w:sz="0" w:val="nil"/>
+          <w:between w:space="0" w:sz="0" w:val="nil"/>
+        </w:pBdr>
+        <w:shd w:fill="auto" w:val="clear"/>
+        <w:spacing w:after="240" w:before="0" w:line="240" w:lineRule="auto"/>
+        <w:ind w:left="384.00000000000006" w:right="0" w:hanging="384.00000000000006"/>
+        <w:jc w:val="left"/>
+        <w:rPr/>
+      </w:pPr>
+      <w:hyperlink r:id="rId239">
+        <w:r>
+          <w:rPr>
+            <w:rtl w:val="0"/>
+          </w:rPr>
+          <w:t xml:space="preserve">74.</w:t>
+        </w:r>
+      </w:hyperlink>
+      <w:r>
+        <w:rPr>
+          <w:rtl w:val="0"/>
+        </w:rPr>
+        <w:tab/>
+      </w:r>
+      <w:hyperlink r:id="rId240">
         <w:r>
           <w:rPr>
             <w:rtl w:val="0"/>
@@ -23192,116 +23303,6 @@
   <w:abstractNum w:abstractNumId="1">
     <w:lvl w:ilvl="0">
       <w:start w:val="1"/>
-      <w:numFmt w:val="bullet"/>
-      <w:lvlText w:val="●"/>
-      <w:lvlJc w:val="left"/>
-      <w:pPr>
-        <w:ind w:left="720" w:hanging="360"/>
-      </w:pPr>
-      <w:rPr>
-        <w:u w:val="none"/>
-      </w:rPr>
-    </w:lvl>
-    <w:lvl w:ilvl="1">
-      <w:start w:val="1"/>
-      <w:numFmt w:val="bullet"/>
-      <w:lvlText w:val="○"/>
-      <w:lvlJc w:val="left"/>
-      <w:pPr>
-        <w:ind w:left="1440" w:hanging="360"/>
-      </w:pPr>
-      <w:rPr>
-        <w:u w:val="none"/>
-      </w:rPr>
-    </w:lvl>
-    <w:lvl w:ilvl="2">
-      <w:start w:val="1"/>
-      <w:numFmt w:val="bullet"/>
-      <w:lvlText w:val="■"/>
-      <w:lvlJc w:val="left"/>
-      <w:pPr>
-        <w:ind w:left="2160" w:hanging="360"/>
-      </w:pPr>
-      <w:rPr>
-        <w:u w:val="none"/>
-      </w:rPr>
-    </w:lvl>
-    <w:lvl w:ilvl="3">
-      <w:start w:val="1"/>
-      <w:numFmt w:val="bullet"/>
-      <w:lvlText w:val="●"/>
-      <w:lvlJc w:val="left"/>
-      <w:pPr>
-        <w:ind w:left="2880" w:hanging="360"/>
-      </w:pPr>
-      <w:rPr>
-        <w:u w:val="none"/>
-      </w:rPr>
-    </w:lvl>
-    <w:lvl w:ilvl="4">
-      <w:start w:val="1"/>
-      <w:numFmt w:val="bullet"/>
-      <w:lvlText w:val="○"/>
-      <w:lvlJc w:val="left"/>
-      <w:pPr>
-        <w:ind w:left="3600" w:hanging="360"/>
-      </w:pPr>
-      <w:rPr>
-        <w:u w:val="none"/>
-      </w:rPr>
-    </w:lvl>
-    <w:lvl w:ilvl="5">
-      <w:start w:val="1"/>
-      <w:numFmt w:val="bullet"/>
-      <w:lvlText w:val="■"/>
-      <w:lvlJc w:val="left"/>
-      <w:pPr>
-        <w:ind w:left="4320" w:hanging="360"/>
-      </w:pPr>
-      <w:rPr>
-        <w:u w:val="none"/>
-      </w:rPr>
-    </w:lvl>
-    <w:lvl w:ilvl="6">
-      <w:start w:val="1"/>
-      <w:numFmt w:val="bullet"/>
-      <w:lvlText w:val="●"/>
-      <w:lvlJc w:val="left"/>
-      <w:pPr>
-        <w:ind w:left="5040" w:hanging="360"/>
-      </w:pPr>
-      <w:rPr>
-        <w:u w:val="none"/>
-      </w:rPr>
-    </w:lvl>
-    <w:lvl w:ilvl="7">
-      <w:start w:val="1"/>
-      <w:numFmt w:val="bullet"/>
-      <w:lvlText w:val="○"/>
-      <w:lvlJc w:val="left"/>
-      <w:pPr>
-        <w:ind w:left="5760" w:hanging="360"/>
-      </w:pPr>
-      <w:rPr>
-        <w:u w:val="none"/>
-      </w:rPr>
-    </w:lvl>
-    <w:lvl w:ilvl="8">
-      <w:start w:val="1"/>
-      <w:numFmt w:val="bullet"/>
-      <w:lvlText w:val="■"/>
-      <w:lvlJc w:val="left"/>
-      <w:pPr>
-        <w:ind w:left="6480" w:hanging="360"/>
-      </w:pPr>
-      <w:rPr>
-        <w:u w:val="none"/>
-      </w:rPr>
-    </w:lvl>
-  </w:abstractNum>
-  <w:abstractNum w:abstractNumId="2">
-    <w:lvl w:ilvl="0">
-      <w:start w:val="1"/>
       <w:numFmt w:val="decimal"/>
       <w:lvlText w:val="%1."/>
       <w:lvlJc w:val="left"/>
@@ -23411,9 +23412,6 @@
   </w:abstractNum>
   <w:num w:numId="1">
     <w:abstractNumId w:val="1"/>
-  </w:num>
-  <w:num w:numId="2">
-    <w:abstractNumId w:val="2"/>
   </w:num>
 </w:numbering>
 </file>

</xml_diff>

<commit_message>
Align package on final title, strip structure-context annotations
- Set the final paper title, "Mapping the Phenotypic Landscape of Beta-lactam
  Resistance in Streptococcus pneumoniae", consistently across the manuscript,
  cover letter, README (landing page and citation block), CITATION.cff and
  .zenodo.json; note the former title against earlier preprint versions
- Install the 2 September manuscript and supplement as the canonical versions
- Reduce Supplementary File 1 to its original 14-column set (394 rows,
  values recomputed) and repair two garbled headers: bare "total" is the count
  of supporting methods, and the mvLMM/uvLMM header lacked a closing bracket
- Remove the structure-context annotation script and its published artifacts;
  the annotations were not independently verified and are not required by the
  manuscript
- Keep the eLife cover letter local-only, as with other submission-process notes

Co-Authored-By: Claude Opus 5 <noreply@anthropic.com>
</commit_message>
<xml_diff>
--- a/manuscript/Manuscript.docx
+++ b/manuscript/Manuscript.docx
@@ -4,30 +4,33 @@
   <w:body>
     <w:p>
       <w:pPr>
-        <w:pStyle w:val="Title"/>
         <w:tabs>
           <w:tab w:val="right" w:leader="none" w:pos="9026"/>
         </w:tabs>
-        <w:spacing w:after="0" w:before="0" w:lineRule="auto"/>
-        <w:rPr>
+        <w:spacing w:line="360" w:lineRule="auto"/>
+        <w:rPr>
+          <w:b w:val="1"/>
+          <w:bCs w:val="1"/>
           <w:i w:val="1"/>
           <w:iCs w:val="1"/>
           <w:sz w:val="28"/>
           <w:szCs w:val="28"/>
         </w:rPr>
       </w:pPr>
-      <w:bookmarkStart w:colFirst="0" w:colLast="0" w:name="_770sq27cjmj1" w:id="0"/>
-      <w:bookmarkEnd w:id="0"/>
-      <w:r>
-        <w:rPr>
+      <w:r>
+        <w:rPr>
+          <w:b w:val="1"/>
+          <w:bCs w:val="1"/>
           <w:sz w:val="28"/>
           <w:szCs w:val="28"/>
           <w:rtl w:val="0"/>
         </w:rPr>
-        <w:t xml:space="preserve">Mapping Multivariate Beta-lactam Resistance in </w:t>
-      </w:r>
-      <w:r>
-        <w:rPr>
+        <w:t xml:space="preserve">Mapping the Phenotypic Landscape of Beta-lactam Resistance in </w:t>
+      </w:r>
+      <w:r>
+        <w:rPr>
+          <w:b w:val="1"/>
+          <w:bCs w:val="1"/>
           <w:i w:val="1"/>
           <w:iCs w:val="1"/>
           <w:sz w:val="28"/>
@@ -35,11 +38,6 @@
           <w:rtl w:val="0"/>
         </w:rPr>
         <w:t xml:space="preserve">Streptococcus pneumoniae</w:t>
-      </w:r>
-      <w:r>
-        <w:rPr>
-          <w:rtl w:val="0"/>
-        </w:rPr>
       </w:r>
     </w:p>
     <w:p>
@@ -47,22 +45,7 @@
         <w:tabs>
           <w:tab w:val="right" w:leader="none" w:pos="9026"/>
         </w:tabs>
-        <w:spacing w:after="0" w:before="0" w:line="276" w:lineRule="auto"/>
-        <w:ind w:left="0" w:firstLine="0"/>
-        <w:rPr/>
-      </w:pPr>
-      <w:r>
-        <w:rPr>
-          <w:rtl w:val="0"/>
-        </w:rPr>
-      </w:r>
-    </w:p>
-    <w:p>
-      <w:pPr>
-        <w:tabs>
-          <w:tab w:val="right" w:leader="none" w:pos="9026"/>
-        </w:tabs>
-        <w:spacing w:after="0" w:before="0" w:line="276" w:lineRule="auto"/>
+        <w:spacing w:after="0" w:before="0" w:line="360" w:lineRule="auto"/>
         <w:ind w:left="0" w:firstLine="0"/>
         <w:rPr/>
       </w:pPr>
@@ -1790,8 +1773,8 @@
         <w:jc w:val="left"/>
         <w:rPr/>
       </w:pPr>
-      <w:bookmarkStart w:colFirst="0" w:colLast="0" w:name="_i6dyyw70ce6x" w:id="1"/>
-      <w:bookmarkEnd w:id="1"/>
+      <w:bookmarkStart w:colFirst="0" w:colLast="0" w:name="_i6dyyw70ce6x" w:id="0"/>
+      <w:bookmarkEnd w:id="0"/>
       <w:r>
         <w:br w:type="page"/>
       </w:r>
@@ -1808,8 +1791,8 @@
         <w:jc w:val="left"/>
         <w:rPr/>
       </w:pPr>
-      <w:bookmarkStart w:colFirst="0" w:colLast="0" w:name="_ncltnvess8m8" w:id="2"/>
-      <w:bookmarkEnd w:id="2"/>
+      <w:bookmarkStart w:colFirst="0" w:colLast="0" w:name="_ncltnvess8m8" w:id="1"/>
+      <w:bookmarkEnd w:id="1"/>
       <w:r>
         <w:rPr>
           <w:rtl w:val="0"/>
@@ -1824,8 +1807,8 @@
         <w:jc w:val="left"/>
         <w:rPr/>
       </w:pPr>
-      <w:bookmarkStart w:colFirst="0" w:colLast="0" w:name="_xbdb69u1dc1s" w:id="3"/>
-      <w:bookmarkEnd w:id="3"/>
+      <w:bookmarkStart w:colFirst="0" w:colLast="0" w:name="_xbdb69u1dc1s" w:id="2"/>
+      <w:bookmarkEnd w:id="2"/>
       <w:r>
         <w:rPr>
           <w:rtl w:val="0"/>
@@ -1993,8 +1976,8 @@
           <w:szCs w:val="17"/>
         </w:rPr>
       </w:pPr>
-      <w:bookmarkStart w:colFirst="0" w:colLast="0" w:name="_baibfq2tq00h" w:id="4"/>
-      <w:bookmarkEnd w:id="4"/>
+      <w:bookmarkStart w:colFirst="0" w:colLast="0" w:name="_baibfq2tq00h" w:id="3"/>
+      <w:bookmarkEnd w:id="3"/>
       <w:r>
         <w:rPr>
           <w:b w:val="1"/>
@@ -2370,8 +2353,8 @@
           <w:bCs w:val="1"/>
         </w:rPr>
       </w:pPr>
-      <w:bookmarkStart w:colFirst="0" w:colLast="0" w:name="_43s0pafbxqt4" w:id="5"/>
-      <w:bookmarkEnd w:id="5"/>
+      <w:bookmarkStart w:colFirst="0" w:colLast="0" w:name="_43s0pafbxqt4" w:id="4"/>
+      <w:bookmarkEnd w:id="4"/>
       <w:r>
         <w:rPr>
           <w:b w:val="1"/>
@@ -2557,8 +2540,8 @@
         <w:pStyle w:val="Heading1"/>
         <w:rPr/>
       </w:pPr>
-      <w:bookmarkStart w:colFirst="0" w:colLast="0" w:name="_kw4qr6tv2s0l" w:id="6"/>
-      <w:bookmarkEnd w:id="6"/>
+      <w:bookmarkStart w:colFirst="0" w:colLast="0" w:name="_kw4qr6tv2s0l" w:id="5"/>
+      <w:bookmarkEnd w:id="5"/>
       <w:r>
         <w:rPr>
           <w:rtl w:val="0"/>
@@ -2606,7 +2589,7 @@
           <w:rFonts w:ascii="Arial Unicode MS" w:cs="Arial Unicode MS" w:eastAsia="Arial Unicode MS" w:hAnsi="Arial Unicode MS"/>
           <w:rtl w:val="0"/>
         </w:rPr>
-        <w:t xml:space="preserve">We analysed 3,628 invasive pneumococcal isolates from the Active Bacterial Core (ABC) surveillance program, with MICs measured for six beta-lactam antibiotics using two-fold microbroth dilution. Across the entire collection, most isolates exhibited low MIC values for all six antibiotics, reflecting a high level of susceptibility to the drugs. Despite this, MIC values varied considerably across isolates, with penicillin MICs ranging from ≤0.03 to ≥8μg/mL. MIC values were positively correlated across all beta-lactams, although the strength of these correlations varied, particularly among drugs </w:t>
+        <w:t xml:space="preserve">We analysed 3,628 invasive pneumococcal isolates from the Active Bacterial Core (ABC) surveillance program, with MICs measured for six beta-lactam antibiotics using two-fold microbroth dilution. Across these isolates, most exhibited low MIC values for all six antibiotics, reflecting a high level of susceptibility to the drugs. Despite this, MIC values varied considerably across isolates, with penicillin MICs ranging from ≤0.03 to 8μg/mL. MIC values were positively correlated across all beta-lactams, although the strength of these correlations varied, particularly among drugs </w:t>
       </w:r>
       <w:r>
         <w:rPr>
@@ -3431,8 +3414,8 @@
         <w:jc w:val="left"/>
         <w:rPr/>
       </w:pPr>
-      <w:bookmarkStart w:colFirst="0" w:colLast="0" w:name="_4f1mdlm" w:id="7"/>
-      <w:bookmarkEnd w:id="7"/>
+      <w:bookmarkStart w:colFirst="0" w:colLast="0" w:name="_4f1mdlm" w:id="6"/>
+      <w:bookmarkEnd w:id="6"/>
       <w:r>
         <w:rPr>
           <w:rtl w:val="0"/>
@@ -3501,8 +3484,8 @@
                 <w:szCs w:val="20"/>
               </w:rPr>
             </w:pPr>
-            <w:bookmarkStart w:colFirst="0" w:colLast="0" w:name="_2u6wntf" w:id="8"/>
-            <w:bookmarkEnd w:id="8"/>
+            <w:bookmarkStart w:colFirst="0" w:colLast="0" w:name="_2u6wntf" w:id="7"/>
+            <w:bookmarkEnd w:id="7"/>
             <w:r>
               <w:rPr>
                 <w:b w:val="1"/>
@@ -5305,8 +5288,8 @@
         <w:jc w:val="left"/>
         <w:rPr/>
       </w:pPr>
-      <w:bookmarkStart w:colFirst="0" w:colLast="0" w:name="_4f1mdlm" w:id="7"/>
-      <w:bookmarkEnd w:id="7"/>
+      <w:bookmarkStart w:colFirst="0" w:colLast="0" w:name="_4f1mdlm" w:id="6"/>
+      <w:bookmarkEnd w:id="6"/>
       <w:r>
         <w:rPr>
           <w:rtl w:val="0"/>
@@ -5374,8 +5357,8 @@
                 <w:szCs w:val="20"/>
               </w:rPr>
             </w:pPr>
-            <w:bookmarkStart w:colFirst="0" w:colLast="0" w:name="_2u6wntf" w:id="8"/>
-            <w:bookmarkEnd w:id="8"/>
+            <w:bookmarkStart w:colFirst="0" w:colLast="0" w:name="_2u6wntf" w:id="7"/>
+            <w:bookmarkEnd w:id="7"/>
             <w:r>
               <w:rPr>
                 <w:b w:val="1"/>
@@ -19209,8 +19192,8 @@
           <w:szCs w:val="22"/>
         </w:rPr>
       </w:pPr>
-      <w:bookmarkStart w:colFirst="0" w:colLast="0" w:name="_pgxjkczgoqoo" w:id="9"/>
-      <w:bookmarkEnd w:id="9"/>
+      <w:bookmarkStart w:colFirst="0" w:colLast="0" w:name="_pgxjkczgoqoo" w:id="8"/>
+      <w:bookmarkEnd w:id="8"/>
       <w:r>
         <w:rPr>
           <w:rtl w:val="0"/>
@@ -19236,8 +19219,8 @@
           <w:szCs w:val="22"/>
         </w:rPr>
       </w:pPr>
-      <w:bookmarkStart w:colFirst="0" w:colLast="0" w:name="_5ariq3ycnudl" w:id="10"/>
-      <w:bookmarkEnd w:id="10"/>
+      <w:bookmarkStart w:colFirst="0" w:colLast="0" w:name="_5ariq3ycnudl" w:id="9"/>
+      <w:bookmarkEnd w:id="9"/>
       <w:r>
         <w:br w:type="page"/>
       </w:r>
@@ -19256,8 +19239,8 @@
           <w:szCs w:val="22"/>
         </w:rPr>
       </w:pPr>
-      <w:bookmarkStart w:colFirst="0" w:colLast="0" w:name="_jymtf5erfmcf" w:id="11"/>
-      <w:bookmarkEnd w:id="11"/>
+      <w:bookmarkStart w:colFirst="0" w:colLast="0" w:name="_jymtf5erfmcf" w:id="10"/>
+      <w:bookmarkEnd w:id="10"/>
       <w:r>
         <w:rPr>
           <w:sz w:val="22"/>
@@ -19388,68 +19371,6 @@
           <w:rtl w:val="0"/>
         </w:rPr>
         <w:t xml:space="preserve">This work was supported by the Biotechnology and Biological Sciences Research Council (BBSRC) through a Doctoral Training Partnership.</w:t>
-      </w:r>
-      <w:r>
-        <w:rPr>
-          <w:rtl w:val="0"/>
-        </w:rPr>
-      </w:r>
-    </w:p>
-    <w:p>
-      <w:pPr>
-        <w:rPr/>
-      </w:pPr>
-      <w:r>
-        <w:rPr>
-          <w:rtl w:val="0"/>
-        </w:rPr>
-      </w:r>
-    </w:p>
-    <w:p>
-      <w:pPr>
-        <w:spacing w:line="360" w:lineRule="auto"/>
-        <w:rPr>
-          <w:b w:val="1"/>
-          <w:bCs w:val="1"/>
-        </w:rPr>
-      </w:pPr>
-      <w:r>
-        <w:rPr>
-          <w:b w:val="1"/>
-          <w:bCs w:val="1"/>
-          <w:rtl w:val="0"/>
-        </w:rPr>
-        <w:t xml:space="preserve">Link to GitHub Repository</w:t>
-      </w:r>
-    </w:p>
-    <w:p>
-      <w:pPr>
-        <w:spacing w:line="360" w:lineRule="auto"/>
-        <w:jc w:val="left"/>
-        <w:rPr/>
-      </w:pPr>
-      <w:r>
-        <w:rPr>
-          <w:rtl w:val="0"/>
-        </w:rPr>
-        <w:t xml:space="preserve">All code and data required to reproduce this paper is available at: </w:t>
-      </w:r>
-      <w:hyperlink r:id="rId92">
-        <w:r>
-          <w:rPr>
-            <w:color w:val="1155cc"/>
-            <w:u w:val="single"/>
-            <w:rtl w:val="0"/>
-          </w:rPr>
-          <w:t xml:space="preserve">https://github.com/AndrewBalmer/AMR-cartography</w:t>
-        </w:r>
-      </w:hyperlink>
-      <w:r>
-        <w:rPr>
-          <w:color w:val="ff0000"/>
-          <w:rtl w:val="0"/>
-        </w:rPr>
-        <w:t xml:space="preserve">. </w:t>
       </w:r>
       <w:r>
         <w:rPr>
@@ -19472,8 +19393,8 @@
           <w:color w:val="212121"/>
         </w:rPr>
       </w:pPr>
-      <w:bookmarkStart w:colFirst="0" w:colLast="0" w:name="_xnbvxc81jdap" w:id="12"/>
-      <w:bookmarkEnd w:id="12"/>
+      <w:bookmarkStart w:colFirst="0" w:colLast="0" w:name="_xnbvxc81jdap" w:id="11"/>
+      <w:bookmarkEnd w:id="11"/>
       <w:r>
         <w:rPr>
           <w:rtl w:val="0"/>
@@ -19489,8 +19410,8 @@
         <w:ind w:left="0"/>
         <w:rPr/>
       </w:pPr>
-      <w:bookmarkStart w:colFirst="0" w:colLast="0" w:name="_yhq645ryan5o" w:id="13"/>
-      <w:bookmarkEnd w:id="13"/>
+      <w:bookmarkStart w:colFirst="0" w:colLast="0" w:name="_yhq645ryan5o" w:id="12"/>
+      <w:bookmarkEnd w:id="12"/>
       <w:r>
         <w:rPr>
           <w:b w:val="1"/>
@@ -19521,6 +19442,20 @@
           <w:rtl w:val="0"/>
         </w:rPr>
         <w:t xml:space="preserve">The authors have declared that no competing interests exist.</w:t>
+      </w:r>
+    </w:p>
+    <w:p>
+      <w:pPr>
+        <w:shd w:fill="ffffff" w:val="clear"/>
+        <w:rPr>
+          <w:rFonts w:ascii="Times New Roman" w:cs="Times New Roman" w:eastAsia="Times New Roman" w:hAnsi="Times New Roman"/>
+          <w:color w:val="212121"/>
+        </w:rPr>
+      </w:pPr>
+      <w:r>
+        <w:rPr>
+          <w:rtl w:val="0"/>
+        </w:rPr>
       </w:r>
     </w:p>
     <w:p>
@@ -19530,16 +19465,29 @@
       </w:pPr>
       <w:r>
         <w:rPr>
-          <w:rFonts w:ascii="Times New Roman" w:cs="Times New Roman" w:eastAsia="Times New Roman" w:hAnsi="Times New Roman"/>
-          <w:color w:val="212121"/>
+          <w:b w:val="1"/>
+          <w:bCs w:val="1"/>
+          <w:rtl w:val="0"/>
+        </w:rPr>
+        <w:t xml:space="preserve">Data availability.</w:t>
+      </w:r>
+      <w:r>
+        <w:rPr>
           <w:rtl w:val="0"/>
         </w:rPr>
         <w:t xml:space="preserve"> </w:t>
       </w:r>
-      <w:r>
-        <w:rPr>
-          <w:rtl w:val="0"/>
-        </w:rPr>
+    </w:p>
+    <w:p>
+      <w:pPr>
+        <w:shd w:fill="ffffff" w:val="clear"/>
+        <w:rPr/>
+      </w:pPr>
+      <w:r>
+        <w:rPr>
+          <w:rtl w:val="0"/>
+        </w:rPr>
+        <w:t xml:space="preserve">All MIC and PBP sequence data analysed in this study were generated by the CDC Active Bacterial Core surveillance programme and are publicly available. All code, processed data and analysis workflows required to reproduce this study are available at https://github.com/AndrewBalmer/AMR-cartography. Source data for Table 3 and Supplementary Figures S18–S20 are provided in manuscript/source_data/.</w:t>
       </w:r>
     </w:p>
     <w:p>
@@ -19558,8 +19506,26 @@
         </w:rPr>
       </w:pPr>
       <w:r>
-        <w:br w:type="page"/>
-      </w:r>
+        <w:rPr>
+          <w:rtl w:val="0"/>
+        </w:rPr>
+      </w:r>
+    </w:p>
+    <w:p>
+      <w:pPr>
+        <w:pBdr>
+          <w:top w:color="auto" w:space="0" w:sz="0" w:val="none"/>
+          <w:left w:color="auto" w:space="0" w:sz="0" w:val="none"/>
+          <w:bottom w:color="auto" w:space="0" w:sz="0" w:val="none"/>
+          <w:right w:color="auto" w:space="0" w:sz="0" w:val="none"/>
+          <w:between w:color="auto" w:space="0" w:sz="0" w:val="none"/>
+        </w:pBdr>
+        <w:shd w:fill="ffffff" w:val="clear"/>
+        <w:rPr>
+          <w:b w:val="1"/>
+          <w:bCs w:val="1"/>
+        </w:rPr>
+      </w:pPr>
       <w:r>
         <w:rPr>
           <w:rtl w:val="0"/>
@@ -19672,7 +19638,7 @@
         <w:jc w:val="left"/>
         <w:rPr/>
       </w:pPr>
-      <w:hyperlink r:id="rId93">
+      <w:hyperlink r:id="rId92">
         <w:r>
           <w:rPr>
             <w:rtl w:val="0"/>
@@ -19686,7 +19652,7 @@
         </w:rPr>
         <w:tab/>
       </w:r>
-      <w:hyperlink r:id="rId94">
+      <w:hyperlink r:id="rId93">
         <w:r>
           <w:rPr>
             <w:rtl w:val="0"/>
@@ -19719,7 +19685,7 @@
         <w:jc w:val="left"/>
         <w:rPr/>
       </w:pPr>
-      <w:hyperlink r:id="rId95">
+      <w:hyperlink r:id="rId94">
         <w:r>
           <w:rPr>
             <w:rtl w:val="0"/>
@@ -19733,7 +19699,7 @@
         </w:rPr>
         <w:tab/>
       </w:r>
-      <w:hyperlink r:id="rId96">
+      <w:hyperlink r:id="rId95">
         <w:r>
           <w:rPr>
             <w:rtl w:val="0"/>
@@ -19766,7 +19732,7 @@
         <w:jc w:val="left"/>
         <w:rPr/>
       </w:pPr>
-      <w:hyperlink r:id="rId97">
+      <w:hyperlink r:id="rId96">
         <w:r>
           <w:rPr>
             <w:rtl w:val="0"/>
@@ -19780,7 +19746,7 @@
         </w:rPr>
         <w:tab/>
       </w:r>
-      <w:hyperlink r:id="rId98">
+      <w:hyperlink r:id="rId97">
         <w:r>
           <w:rPr>
             <w:rtl w:val="0"/>
@@ -19813,7 +19779,7 @@
         <w:jc w:val="left"/>
         <w:rPr/>
       </w:pPr>
-      <w:hyperlink r:id="rId99">
+      <w:hyperlink r:id="rId98">
         <w:r>
           <w:rPr>
             <w:rtl w:val="0"/>
@@ -19827,7 +19793,7 @@
         </w:rPr>
         <w:tab/>
       </w:r>
-      <w:hyperlink r:id="rId100">
+      <w:hyperlink r:id="rId99">
         <w:r>
           <w:rPr>
             <w:rtl w:val="0"/>
@@ -19860,7 +19826,7 @@
         <w:jc w:val="left"/>
         <w:rPr/>
       </w:pPr>
-      <w:hyperlink r:id="rId101">
+      <w:hyperlink r:id="rId100">
         <w:r>
           <w:rPr>
             <w:rtl w:val="0"/>
@@ -19874,7 +19840,7 @@
         </w:rPr>
         <w:tab/>
       </w:r>
-      <w:hyperlink r:id="rId102">
+      <w:hyperlink r:id="rId101">
         <w:r>
           <w:rPr>
             <w:rtl w:val="0"/>
@@ -19907,7 +19873,7 @@
         <w:jc w:val="left"/>
         <w:rPr/>
       </w:pPr>
-      <w:hyperlink r:id="rId103">
+      <w:hyperlink r:id="rId102">
         <w:r>
           <w:rPr>
             <w:rtl w:val="0"/>
@@ -19921,7 +19887,7 @@
         </w:rPr>
         <w:tab/>
       </w:r>
-      <w:hyperlink r:id="rId104">
+      <w:hyperlink r:id="rId103">
         <w:r>
           <w:rPr>
             <w:rtl w:val="0"/>
@@ -19954,7 +19920,7 @@
         <w:jc w:val="left"/>
         <w:rPr/>
       </w:pPr>
-      <w:hyperlink r:id="rId105">
+      <w:hyperlink r:id="rId104">
         <w:r>
           <w:rPr>
             <w:rtl w:val="0"/>
@@ -19968,7 +19934,7 @@
         </w:rPr>
         <w:tab/>
       </w:r>
-      <w:hyperlink r:id="rId106">
+      <w:hyperlink r:id="rId105">
         <w:r>
           <w:rPr>
             <w:rtl w:val="0"/>
@@ -20001,7 +19967,7 @@
         <w:jc w:val="left"/>
         <w:rPr/>
       </w:pPr>
-      <w:hyperlink r:id="rId107">
+      <w:hyperlink r:id="rId106">
         <w:r>
           <w:rPr>
             <w:rtl w:val="0"/>
@@ -20015,7 +19981,7 @@
         </w:rPr>
         <w:tab/>
       </w:r>
-      <w:hyperlink r:id="rId108">
+      <w:hyperlink r:id="rId107">
         <w:r>
           <w:rPr>
             <w:rtl w:val="0"/>
@@ -20048,7 +20014,7 @@
         <w:jc w:val="left"/>
         <w:rPr/>
       </w:pPr>
-      <w:hyperlink r:id="rId109">
+      <w:hyperlink r:id="rId108">
         <w:r>
           <w:rPr>
             <w:rtl w:val="0"/>
@@ -20062,7 +20028,7 @@
         </w:rPr>
         <w:tab/>
       </w:r>
-      <w:hyperlink r:id="rId110">
+      <w:hyperlink r:id="rId109">
         <w:r>
           <w:rPr>
             <w:rtl w:val="0"/>
@@ -20095,7 +20061,7 @@
         <w:jc w:val="left"/>
         <w:rPr/>
       </w:pPr>
-      <w:hyperlink r:id="rId111">
+      <w:hyperlink r:id="rId110">
         <w:r>
           <w:rPr>
             <w:rtl w:val="0"/>
@@ -20109,7 +20075,7 @@
         </w:rPr>
         <w:tab/>
       </w:r>
-      <w:hyperlink r:id="rId112">
+      <w:hyperlink r:id="rId111">
         <w:r>
           <w:rPr>
             <w:rtl w:val="0"/>
@@ -20142,7 +20108,7 @@
         <w:jc w:val="left"/>
         <w:rPr/>
       </w:pPr>
-      <w:hyperlink r:id="rId113">
+      <w:hyperlink r:id="rId112">
         <w:r>
           <w:rPr>
             <w:rtl w:val="0"/>
@@ -20156,7 +20122,7 @@
         </w:rPr>
         <w:tab/>
       </w:r>
-      <w:hyperlink r:id="rId114">
+      <w:hyperlink r:id="rId113">
         <w:r>
           <w:rPr>
             <w:rtl w:val="0"/>
@@ -20189,7 +20155,7 @@
         <w:jc w:val="left"/>
         <w:rPr/>
       </w:pPr>
-      <w:hyperlink r:id="rId115">
+      <w:hyperlink r:id="rId114">
         <w:r>
           <w:rPr>
             <w:rtl w:val="0"/>
@@ -20203,7 +20169,7 @@
         </w:rPr>
         <w:tab/>
       </w:r>
-      <w:hyperlink r:id="rId116">
+      <w:hyperlink r:id="rId115">
         <w:r>
           <w:rPr>
             <w:rtl w:val="0"/>
@@ -20236,7 +20202,7 @@
         <w:jc w:val="left"/>
         <w:rPr/>
       </w:pPr>
-      <w:hyperlink r:id="rId117">
+      <w:hyperlink r:id="rId116">
         <w:r>
           <w:rPr>
             <w:rtl w:val="0"/>
@@ -20250,7 +20216,7 @@
         </w:rPr>
         <w:tab/>
       </w:r>
-      <w:hyperlink r:id="rId118">
+      <w:hyperlink r:id="rId117">
         <w:r>
           <w:rPr>
             <w:rtl w:val="0"/>
@@ -20283,7 +20249,7 @@
         <w:jc w:val="left"/>
         <w:rPr/>
       </w:pPr>
-      <w:hyperlink r:id="rId119">
+      <w:hyperlink r:id="rId118">
         <w:r>
           <w:rPr>
             <w:rtl w:val="0"/>
@@ -20297,7 +20263,7 @@
         </w:rPr>
         <w:tab/>
       </w:r>
-      <w:hyperlink r:id="rId120">
+      <w:hyperlink r:id="rId119">
         <w:r>
           <w:rPr>
             <w:rtl w:val="0"/>
@@ -20330,7 +20296,7 @@
         <w:jc w:val="left"/>
         <w:rPr/>
       </w:pPr>
-      <w:hyperlink r:id="rId121">
+      <w:hyperlink r:id="rId120">
         <w:r>
           <w:rPr>
             <w:rtl w:val="0"/>
@@ -20344,7 +20310,7 @@
         </w:rPr>
         <w:tab/>
       </w:r>
-      <w:hyperlink r:id="rId122">
+      <w:hyperlink r:id="rId121">
         <w:r>
           <w:rPr>
             <w:rtl w:val="0"/>
@@ -20377,7 +20343,7 @@
         <w:jc w:val="left"/>
         <w:rPr/>
       </w:pPr>
-      <w:hyperlink r:id="rId123">
+      <w:hyperlink r:id="rId122">
         <w:r>
           <w:rPr>
             <w:rtl w:val="0"/>
@@ -20391,7 +20357,7 @@
         </w:rPr>
         <w:tab/>
       </w:r>
-      <w:hyperlink r:id="rId124">
+      <w:hyperlink r:id="rId123">
         <w:r>
           <w:rPr>
             <w:rtl w:val="0"/>
@@ -20424,7 +20390,7 @@
         <w:jc w:val="left"/>
         <w:rPr/>
       </w:pPr>
-      <w:hyperlink r:id="rId125">
+      <w:hyperlink r:id="rId124">
         <w:r>
           <w:rPr>
             <w:rtl w:val="0"/>
@@ -20438,7 +20404,7 @@
         </w:rPr>
         <w:tab/>
       </w:r>
-      <w:hyperlink r:id="rId126">
+      <w:hyperlink r:id="rId125">
         <w:r>
           <w:rPr>
             <w:rtl w:val="0"/>
@@ -20471,7 +20437,7 @@
         <w:jc w:val="left"/>
         <w:rPr/>
       </w:pPr>
-      <w:hyperlink r:id="rId127">
+      <w:hyperlink r:id="rId126">
         <w:r>
           <w:rPr>
             <w:rtl w:val="0"/>
@@ -20485,7 +20451,7 @@
         </w:rPr>
         <w:tab/>
       </w:r>
-      <w:hyperlink r:id="rId128">
+      <w:hyperlink r:id="rId127">
         <w:r>
           <w:rPr>
             <w:rtl w:val="0"/>
@@ -20518,7 +20484,7 @@
         <w:jc w:val="left"/>
         <w:rPr/>
       </w:pPr>
-      <w:hyperlink r:id="rId129">
+      <w:hyperlink r:id="rId128">
         <w:r>
           <w:rPr>
             <w:rtl w:val="0"/>
@@ -20532,7 +20498,7 @@
         </w:rPr>
         <w:tab/>
       </w:r>
-      <w:hyperlink r:id="rId130">
+      <w:hyperlink r:id="rId129">
         <w:r>
           <w:rPr>
             <w:rtl w:val="0"/>
@@ -20565,7 +20531,7 @@
         <w:jc w:val="left"/>
         <w:rPr/>
       </w:pPr>
-      <w:hyperlink r:id="rId131">
+      <w:hyperlink r:id="rId130">
         <w:r>
           <w:rPr>
             <w:rtl w:val="0"/>
@@ -20579,7 +20545,7 @@
         </w:rPr>
         <w:tab/>
       </w:r>
-      <w:hyperlink r:id="rId132">
+      <w:hyperlink r:id="rId131">
         <w:r>
           <w:rPr>
             <w:rtl w:val="0"/>
@@ -20612,7 +20578,7 @@
         <w:jc w:val="left"/>
         <w:rPr/>
       </w:pPr>
-      <w:hyperlink r:id="rId133">
+      <w:hyperlink r:id="rId132">
         <w:r>
           <w:rPr>
             <w:rtl w:val="0"/>
@@ -20626,7 +20592,7 @@
         </w:rPr>
         <w:tab/>
       </w:r>
-      <w:hyperlink r:id="rId134">
+      <w:hyperlink r:id="rId133">
         <w:r>
           <w:rPr>
             <w:rtl w:val="0"/>
@@ -20659,7 +20625,7 @@
         <w:jc w:val="left"/>
         <w:rPr/>
       </w:pPr>
-      <w:hyperlink r:id="rId135">
+      <w:hyperlink r:id="rId134">
         <w:r>
           <w:rPr>
             <w:rtl w:val="0"/>
@@ -20673,7 +20639,7 @@
         </w:rPr>
         <w:tab/>
       </w:r>
-      <w:hyperlink r:id="rId136">
+      <w:hyperlink r:id="rId135">
         <w:r>
           <w:rPr>
             <w:rtl w:val="0"/>
@@ -20706,7 +20672,7 @@
         <w:jc w:val="left"/>
         <w:rPr/>
       </w:pPr>
-      <w:hyperlink r:id="rId137">
+      <w:hyperlink r:id="rId136">
         <w:r>
           <w:rPr>
             <w:rtl w:val="0"/>
@@ -20720,7 +20686,7 @@
         </w:rPr>
         <w:tab/>
       </w:r>
-      <w:hyperlink r:id="rId138">
+      <w:hyperlink r:id="rId137">
         <w:r>
           <w:rPr>
             <w:rtl w:val="0"/>
@@ -20753,7 +20719,7 @@
         <w:jc w:val="left"/>
         <w:rPr/>
       </w:pPr>
-      <w:hyperlink r:id="rId139">
+      <w:hyperlink r:id="rId138">
         <w:r>
           <w:rPr>
             <w:rtl w:val="0"/>
@@ -20767,7 +20733,7 @@
         </w:rPr>
         <w:tab/>
       </w:r>
-      <w:hyperlink r:id="rId140">
+      <w:hyperlink r:id="rId139">
         <w:r>
           <w:rPr>
             <w:rtl w:val="0"/>
@@ -20800,7 +20766,7 @@
         <w:jc w:val="left"/>
         <w:rPr/>
       </w:pPr>
-      <w:hyperlink r:id="rId141">
+      <w:hyperlink r:id="rId140">
         <w:r>
           <w:rPr>
             <w:rtl w:val="0"/>
@@ -20814,7 +20780,7 @@
         </w:rPr>
         <w:tab/>
       </w:r>
-      <w:hyperlink r:id="rId142">
+      <w:hyperlink r:id="rId141">
         <w:r>
           <w:rPr>
             <w:rtl w:val="0"/>
@@ -20847,7 +20813,7 @@
         <w:jc w:val="left"/>
         <w:rPr/>
       </w:pPr>
-      <w:hyperlink r:id="rId143">
+      <w:hyperlink r:id="rId142">
         <w:r>
           <w:rPr>
             <w:rtl w:val="0"/>
@@ -20861,7 +20827,7 @@
         </w:rPr>
         <w:tab/>
       </w:r>
-      <w:hyperlink r:id="rId144">
+      <w:hyperlink r:id="rId143">
         <w:r>
           <w:rPr>
             <w:rtl w:val="0"/>
@@ -20894,7 +20860,7 @@
         <w:jc w:val="left"/>
         <w:rPr/>
       </w:pPr>
-      <w:hyperlink r:id="rId145">
+      <w:hyperlink r:id="rId144">
         <w:r>
           <w:rPr>
             <w:rtl w:val="0"/>
@@ -20908,7 +20874,7 @@
         </w:rPr>
         <w:tab/>
       </w:r>
-      <w:hyperlink r:id="rId146">
+      <w:hyperlink r:id="rId145">
         <w:r>
           <w:rPr>
             <w:rtl w:val="0"/>
@@ -20941,7 +20907,7 @@
         <w:jc w:val="left"/>
         <w:rPr/>
       </w:pPr>
-      <w:hyperlink r:id="rId147">
+      <w:hyperlink r:id="rId146">
         <w:r>
           <w:rPr>
             <w:rtl w:val="0"/>
@@ -20955,7 +20921,7 @@
         </w:rPr>
         <w:tab/>
       </w:r>
-      <w:hyperlink r:id="rId148">
+      <w:hyperlink r:id="rId147">
         <w:r>
           <w:rPr>
             <w:rtl w:val="0"/>
@@ -20988,7 +20954,7 @@
         <w:jc w:val="left"/>
         <w:rPr/>
       </w:pPr>
-      <w:hyperlink r:id="rId149">
+      <w:hyperlink r:id="rId148">
         <w:r>
           <w:rPr>
             <w:rtl w:val="0"/>
@@ -21002,7 +20968,7 @@
         </w:rPr>
         <w:tab/>
       </w:r>
-      <w:hyperlink r:id="rId150">
+      <w:hyperlink r:id="rId149">
         <w:r>
           <w:rPr>
             <w:rtl w:val="0"/>
@@ -21035,7 +21001,7 @@
         <w:jc w:val="left"/>
         <w:rPr/>
       </w:pPr>
-      <w:hyperlink r:id="rId151">
+      <w:hyperlink r:id="rId150">
         <w:r>
           <w:rPr>
             <w:rtl w:val="0"/>
@@ -21049,7 +21015,7 @@
         </w:rPr>
         <w:tab/>
       </w:r>
-      <w:hyperlink r:id="rId152">
+      <w:hyperlink r:id="rId151">
         <w:r>
           <w:rPr>
             <w:rtl w:val="0"/>
@@ -21082,7 +21048,7 @@
         <w:jc w:val="left"/>
         <w:rPr/>
       </w:pPr>
-      <w:hyperlink r:id="rId153">
+      <w:hyperlink r:id="rId152">
         <w:r>
           <w:rPr>
             <w:rtl w:val="0"/>
@@ -21096,7 +21062,7 @@
         </w:rPr>
         <w:tab/>
       </w:r>
-      <w:hyperlink r:id="rId154">
+      <w:hyperlink r:id="rId153">
         <w:r>
           <w:rPr>
             <w:rtl w:val="0"/>
@@ -21129,7 +21095,7 @@
         <w:jc w:val="left"/>
         <w:rPr/>
       </w:pPr>
-      <w:hyperlink r:id="rId155">
+      <w:hyperlink r:id="rId154">
         <w:r>
           <w:rPr>
             <w:rtl w:val="0"/>
@@ -21143,7 +21109,7 @@
         </w:rPr>
         <w:tab/>
       </w:r>
-      <w:hyperlink r:id="rId156">
+      <w:hyperlink r:id="rId155">
         <w:r>
           <w:rPr>
             <w:rtl w:val="0"/>
@@ -21176,7 +21142,7 @@
         <w:jc w:val="left"/>
         <w:rPr/>
       </w:pPr>
-      <w:hyperlink r:id="rId157">
+      <w:hyperlink r:id="rId156">
         <w:r>
           <w:rPr>
             <w:rtl w:val="0"/>
@@ -21190,7 +21156,7 @@
         </w:rPr>
         <w:tab/>
       </w:r>
-      <w:hyperlink r:id="rId158">
+      <w:hyperlink r:id="rId157">
         <w:r>
           <w:rPr>
             <w:rtl w:val="0"/>
@@ -21223,7 +21189,7 @@
         <w:jc w:val="left"/>
         <w:rPr/>
       </w:pPr>
-      <w:hyperlink r:id="rId159">
+      <w:hyperlink r:id="rId158">
         <w:r>
           <w:rPr>
             <w:rtl w:val="0"/>
@@ -21237,7 +21203,7 @@
         </w:rPr>
         <w:tab/>
       </w:r>
-      <w:hyperlink r:id="rId160">
+      <w:hyperlink r:id="rId159">
         <w:r>
           <w:rPr>
             <w:rtl w:val="0"/>
@@ -21270,7 +21236,7 @@
         <w:jc w:val="left"/>
         <w:rPr/>
       </w:pPr>
-      <w:hyperlink r:id="rId161">
+      <w:hyperlink r:id="rId160">
         <w:r>
           <w:rPr>
             <w:rtl w:val="0"/>
@@ -21284,7 +21250,7 @@
         </w:rPr>
         <w:tab/>
       </w:r>
-      <w:hyperlink r:id="rId162">
+      <w:hyperlink r:id="rId161">
         <w:r>
           <w:rPr>
             <w:rtl w:val="0"/>
@@ -21317,7 +21283,7 @@
         <w:jc w:val="left"/>
         <w:rPr/>
       </w:pPr>
-      <w:hyperlink r:id="rId163">
+      <w:hyperlink r:id="rId162">
         <w:r>
           <w:rPr>
             <w:rtl w:val="0"/>
@@ -21331,7 +21297,7 @@
         </w:rPr>
         <w:tab/>
       </w:r>
-      <w:hyperlink r:id="rId164">
+      <w:hyperlink r:id="rId163">
         <w:r>
           <w:rPr>
             <w:rtl w:val="0"/>
@@ -21364,7 +21330,7 @@
         <w:jc w:val="left"/>
         <w:rPr/>
       </w:pPr>
-      <w:hyperlink r:id="rId165">
+      <w:hyperlink r:id="rId164">
         <w:r>
           <w:rPr>
             <w:rtl w:val="0"/>
@@ -21378,7 +21344,7 @@
         </w:rPr>
         <w:tab/>
       </w:r>
-      <w:hyperlink r:id="rId166">
+      <w:hyperlink r:id="rId165">
         <w:r>
           <w:rPr>
             <w:rtl w:val="0"/>
@@ -21411,7 +21377,7 @@
         <w:jc w:val="left"/>
         <w:rPr/>
       </w:pPr>
-      <w:hyperlink r:id="rId167">
+      <w:hyperlink r:id="rId166">
         <w:r>
           <w:rPr>
             <w:rtl w:val="0"/>
@@ -21425,7 +21391,7 @@
         </w:rPr>
         <w:tab/>
       </w:r>
-      <w:hyperlink r:id="rId168">
+      <w:hyperlink r:id="rId167">
         <w:r>
           <w:rPr>
             <w:rtl w:val="0"/>
@@ -21458,7 +21424,7 @@
         <w:jc w:val="left"/>
         <w:rPr/>
       </w:pPr>
-      <w:hyperlink r:id="rId169">
+      <w:hyperlink r:id="rId168">
         <w:r>
           <w:rPr>
             <w:rtl w:val="0"/>
@@ -21472,7 +21438,7 @@
         </w:rPr>
         <w:tab/>
       </w:r>
-      <w:hyperlink r:id="rId170">
+      <w:hyperlink r:id="rId169">
         <w:r>
           <w:rPr>
             <w:rtl w:val="0"/>
@@ -21505,7 +21471,7 @@
         <w:jc w:val="left"/>
         <w:rPr/>
       </w:pPr>
-      <w:hyperlink r:id="rId171">
+      <w:hyperlink r:id="rId170">
         <w:r>
           <w:rPr>
             <w:rtl w:val="0"/>
@@ -21519,7 +21485,7 @@
         </w:rPr>
         <w:tab/>
       </w:r>
-      <w:hyperlink r:id="rId172">
+      <w:hyperlink r:id="rId171">
         <w:r>
           <w:rPr>
             <w:rtl w:val="0"/>
@@ -21552,7 +21518,7 @@
         <w:jc w:val="left"/>
         <w:rPr/>
       </w:pPr>
-      <w:hyperlink r:id="rId173">
+      <w:hyperlink r:id="rId172">
         <w:r>
           <w:rPr>
             <w:rtl w:val="0"/>
@@ -21566,7 +21532,7 @@
         </w:rPr>
         <w:tab/>
       </w:r>
-      <w:hyperlink r:id="rId174">
+      <w:hyperlink r:id="rId173">
         <w:r>
           <w:rPr>
             <w:rtl w:val="0"/>
@@ -21599,7 +21565,7 @@
         <w:jc w:val="left"/>
         <w:rPr/>
       </w:pPr>
-      <w:hyperlink r:id="rId175">
+      <w:hyperlink r:id="rId174">
         <w:r>
           <w:rPr>
             <w:rtl w:val="0"/>
@@ -21613,7 +21579,7 @@
         </w:rPr>
         <w:tab/>
       </w:r>
-      <w:hyperlink r:id="rId176">
+      <w:hyperlink r:id="rId175">
         <w:r>
           <w:rPr>
             <w:rtl w:val="0"/>
@@ -21646,7 +21612,7 @@
         <w:jc w:val="left"/>
         <w:rPr/>
       </w:pPr>
-      <w:hyperlink r:id="rId177">
+      <w:hyperlink r:id="rId176">
         <w:r>
           <w:rPr>
             <w:rtl w:val="0"/>
@@ -21660,7 +21626,7 @@
         </w:rPr>
         <w:tab/>
       </w:r>
-      <w:hyperlink r:id="rId178">
+      <w:hyperlink r:id="rId177">
         <w:r>
           <w:rPr>
             <w:rtl w:val="0"/>
@@ -21693,7 +21659,7 @@
         <w:jc w:val="left"/>
         <w:rPr/>
       </w:pPr>
-      <w:hyperlink r:id="rId179">
+      <w:hyperlink r:id="rId178">
         <w:r>
           <w:rPr>
             <w:rtl w:val="0"/>
@@ -21707,7 +21673,7 @@
         </w:rPr>
         <w:tab/>
       </w:r>
-      <w:hyperlink r:id="rId180">
+      <w:hyperlink r:id="rId179">
         <w:r>
           <w:rPr>
             <w:rtl w:val="0"/>
@@ -21740,7 +21706,7 @@
         <w:jc w:val="left"/>
         <w:rPr/>
       </w:pPr>
-      <w:hyperlink r:id="rId181">
+      <w:hyperlink r:id="rId180">
         <w:r>
           <w:rPr>
             <w:rtl w:val="0"/>
@@ -21754,7 +21720,7 @@
         </w:rPr>
         <w:tab/>
       </w:r>
-      <w:hyperlink r:id="rId182">
+      <w:hyperlink r:id="rId181">
         <w:r>
           <w:rPr>
             <w:rtl w:val="0"/>
@@ -21787,7 +21753,7 @@
         <w:jc w:val="left"/>
         <w:rPr/>
       </w:pPr>
-      <w:hyperlink r:id="rId183">
+      <w:hyperlink r:id="rId182">
         <w:r>
           <w:rPr>
             <w:rtl w:val="0"/>
@@ -21801,7 +21767,7 @@
         </w:rPr>
         <w:tab/>
       </w:r>
-      <w:hyperlink r:id="rId184">
+      <w:hyperlink r:id="rId183">
         <w:r>
           <w:rPr>
             <w:rtl w:val="0"/>
@@ -21834,7 +21800,7 @@
         <w:jc w:val="left"/>
         <w:rPr/>
       </w:pPr>
-      <w:hyperlink r:id="rId185">
+      <w:hyperlink r:id="rId184">
         <w:r>
           <w:rPr>
             <w:rtl w:val="0"/>
@@ -21848,7 +21814,7 @@
         </w:rPr>
         <w:tab/>
       </w:r>
-      <w:hyperlink r:id="rId186">
+      <w:hyperlink r:id="rId185">
         <w:r>
           <w:rPr>
             <w:rtl w:val="0"/>
@@ -21881,7 +21847,7 @@
         <w:jc w:val="left"/>
         <w:rPr/>
       </w:pPr>
-      <w:hyperlink r:id="rId187">
+      <w:hyperlink r:id="rId186">
         <w:r>
           <w:rPr>
             <w:rtl w:val="0"/>
@@ -21895,7 +21861,7 @@
         </w:rPr>
         <w:tab/>
       </w:r>
-      <w:hyperlink r:id="rId188">
+      <w:hyperlink r:id="rId187">
         <w:r>
           <w:rPr>
             <w:rtl w:val="0"/>
@@ -21928,7 +21894,7 @@
         <w:jc w:val="left"/>
         <w:rPr/>
       </w:pPr>
-      <w:hyperlink r:id="rId189">
+      <w:hyperlink r:id="rId188">
         <w:r>
           <w:rPr>
             <w:rtl w:val="0"/>
@@ -21942,7 +21908,7 @@
         </w:rPr>
         <w:tab/>
       </w:r>
-      <w:hyperlink r:id="rId190">
+      <w:hyperlink r:id="rId189">
         <w:r>
           <w:rPr>
             <w:rtl w:val="0"/>
@@ -21975,7 +21941,7 @@
         <w:jc w:val="left"/>
         <w:rPr/>
       </w:pPr>
-      <w:hyperlink r:id="rId191">
+      <w:hyperlink r:id="rId190">
         <w:r>
           <w:rPr>
             <w:rtl w:val="0"/>
@@ -21989,7 +21955,7 @@
         </w:rPr>
         <w:tab/>
       </w:r>
-      <w:hyperlink r:id="rId192">
+      <w:hyperlink r:id="rId191">
         <w:r>
           <w:rPr>
             <w:rtl w:val="0"/>
@@ -22022,7 +21988,7 @@
         <w:jc w:val="left"/>
         <w:rPr/>
       </w:pPr>
-      <w:hyperlink r:id="rId193">
+      <w:hyperlink r:id="rId192">
         <w:r>
           <w:rPr>
             <w:rtl w:val="0"/>
@@ -22036,7 +22002,7 @@
         </w:rPr>
         <w:tab/>
       </w:r>
-      <w:hyperlink r:id="rId194">
+      <w:hyperlink r:id="rId193">
         <w:r>
           <w:rPr>
             <w:rtl w:val="0"/>
@@ -22069,7 +22035,7 @@
         <w:jc w:val="left"/>
         <w:rPr/>
       </w:pPr>
-      <w:hyperlink r:id="rId195">
+      <w:hyperlink r:id="rId194">
         <w:r>
           <w:rPr>
             <w:rtl w:val="0"/>
@@ -22083,7 +22049,7 @@
         </w:rPr>
         <w:tab/>
       </w:r>
-      <w:hyperlink r:id="rId196">
+      <w:hyperlink r:id="rId195">
         <w:r>
           <w:rPr>
             <w:rtl w:val="0"/>
@@ -22116,7 +22082,7 @@
         <w:jc w:val="left"/>
         <w:rPr/>
       </w:pPr>
-      <w:hyperlink r:id="rId197">
+      <w:hyperlink r:id="rId196">
         <w:r>
           <w:rPr>
             <w:rtl w:val="0"/>
@@ -22130,7 +22096,7 @@
         </w:rPr>
         <w:tab/>
       </w:r>
-      <w:hyperlink r:id="rId198">
+      <w:hyperlink r:id="rId197">
         <w:r>
           <w:rPr>
             <w:rtl w:val="0"/>
@@ -22163,7 +22129,7 @@
         <w:jc w:val="left"/>
         <w:rPr/>
       </w:pPr>
-      <w:hyperlink r:id="rId199">
+      <w:hyperlink r:id="rId198">
         <w:r>
           <w:rPr>
             <w:rtl w:val="0"/>
@@ -22177,7 +22143,7 @@
         </w:rPr>
         <w:tab/>
       </w:r>
-      <w:hyperlink r:id="rId200">
+      <w:hyperlink r:id="rId199">
         <w:r>
           <w:rPr>
             <w:rtl w:val="0"/>
@@ -22210,7 +22176,7 @@
         <w:jc w:val="left"/>
         <w:rPr/>
       </w:pPr>
-      <w:hyperlink r:id="rId201">
+      <w:hyperlink r:id="rId200">
         <w:r>
           <w:rPr>
             <w:rtl w:val="0"/>
@@ -22224,7 +22190,7 @@
         </w:rPr>
         <w:tab/>
       </w:r>
-      <w:hyperlink r:id="rId202">
+      <w:hyperlink r:id="rId201">
         <w:r>
           <w:rPr>
             <w:rtl w:val="0"/>
@@ -22257,7 +22223,7 @@
         <w:jc w:val="left"/>
         <w:rPr/>
       </w:pPr>
-      <w:hyperlink r:id="rId203">
+      <w:hyperlink r:id="rId202">
         <w:r>
           <w:rPr>
             <w:rtl w:val="0"/>
@@ -22271,7 +22237,7 @@
         </w:rPr>
         <w:tab/>
       </w:r>
-      <w:hyperlink r:id="rId204">
+      <w:hyperlink r:id="rId203">
         <w:r>
           <w:rPr>
             <w:rtl w:val="0"/>
@@ -22304,7 +22270,7 @@
         <w:jc w:val="left"/>
         <w:rPr/>
       </w:pPr>
-      <w:hyperlink r:id="rId205">
+      <w:hyperlink r:id="rId204">
         <w:r>
           <w:rPr>
             <w:rtl w:val="0"/>
@@ -22318,7 +22284,7 @@
         </w:rPr>
         <w:tab/>
       </w:r>
-      <w:hyperlink r:id="rId206">
+      <w:hyperlink r:id="rId205">
         <w:r>
           <w:rPr>
             <w:rtl w:val="0"/>
@@ -22351,7 +22317,7 @@
         <w:jc w:val="left"/>
         <w:rPr/>
       </w:pPr>
-      <w:hyperlink r:id="rId207">
+      <w:hyperlink r:id="rId206">
         <w:r>
           <w:rPr>
             <w:rtl w:val="0"/>
@@ -22365,7 +22331,7 @@
         </w:rPr>
         <w:tab/>
       </w:r>
-      <w:hyperlink r:id="rId208">
+      <w:hyperlink r:id="rId207">
         <w:r>
           <w:rPr>
             <w:rtl w:val="0"/>
@@ -22398,7 +22364,7 @@
         <w:jc w:val="left"/>
         <w:rPr/>
       </w:pPr>
-      <w:hyperlink r:id="rId209">
+      <w:hyperlink r:id="rId208">
         <w:r>
           <w:rPr>
             <w:rtl w:val="0"/>
@@ -22412,7 +22378,7 @@
         </w:rPr>
         <w:tab/>
       </w:r>
-      <w:hyperlink r:id="rId210">
+      <w:hyperlink r:id="rId209">
         <w:r>
           <w:rPr>
             <w:rtl w:val="0"/>
@@ -22445,7 +22411,7 @@
         <w:jc w:val="left"/>
         <w:rPr/>
       </w:pPr>
-      <w:hyperlink r:id="rId211">
+      <w:hyperlink r:id="rId210">
         <w:r>
           <w:rPr>
             <w:rtl w:val="0"/>
@@ -22459,7 +22425,7 @@
         </w:rPr>
         <w:tab/>
       </w:r>
-      <w:hyperlink r:id="rId212">
+      <w:hyperlink r:id="rId211">
         <w:r>
           <w:rPr>
             <w:rtl w:val="0"/>
@@ -22492,7 +22458,7 @@
         <w:jc w:val="left"/>
         <w:rPr/>
       </w:pPr>
-      <w:hyperlink r:id="rId213">
+      <w:hyperlink r:id="rId212">
         <w:r>
           <w:rPr>
             <w:rtl w:val="0"/>
@@ -22506,7 +22472,7 @@
         </w:rPr>
         <w:tab/>
       </w:r>
-      <w:hyperlink r:id="rId214">
+      <w:hyperlink r:id="rId213">
         <w:r>
           <w:rPr>
             <w:rtl w:val="0"/>
@@ -22539,7 +22505,7 @@
         <w:jc w:val="left"/>
         <w:rPr/>
       </w:pPr>
-      <w:hyperlink r:id="rId215">
+      <w:hyperlink r:id="rId214">
         <w:r>
           <w:rPr>
             <w:rtl w:val="0"/>
@@ -22553,7 +22519,7 @@
         </w:rPr>
         <w:tab/>
       </w:r>
-      <w:hyperlink r:id="rId216">
+      <w:hyperlink r:id="rId215">
         <w:r>
           <w:rPr>
             <w:rtl w:val="0"/>
@@ -22586,7 +22552,7 @@
         <w:jc w:val="left"/>
         <w:rPr/>
       </w:pPr>
-      <w:hyperlink r:id="rId217">
+      <w:hyperlink r:id="rId216">
         <w:r>
           <w:rPr>
             <w:rtl w:val="0"/>
@@ -22600,7 +22566,7 @@
         </w:rPr>
         <w:tab/>
       </w:r>
-      <w:hyperlink r:id="rId218">
+      <w:hyperlink r:id="rId217">
         <w:r>
           <w:rPr>
             <w:rtl w:val="0"/>
@@ -22633,7 +22599,7 @@
         <w:jc w:val="left"/>
         <w:rPr/>
       </w:pPr>
-      <w:hyperlink r:id="rId219">
+      <w:hyperlink r:id="rId218">
         <w:r>
           <w:rPr>
             <w:rtl w:val="0"/>
@@ -22647,7 +22613,7 @@
         </w:rPr>
         <w:tab/>
       </w:r>
-      <w:hyperlink r:id="rId220">
+      <w:hyperlink r:id="rId219">
         <w:r>
           <w:rPr>
             <w:rtl w:val="0"/>
@@ -22680,7 +22646,7 @@
         <w:jc w:val="left"/>
         <w:rPr/>
       </w:pPr>
-      <w:hyperlink r:id="rId221">
+      <w:hyperlink r:id="rId220">
         <w:r>
           <w:rPr>
             <w:rtl w:val="0"/>
@@ -22694,7 +22660,7 @@
         </w:rPr>
         <w:tab/>
       </w:r>
-      <w:hyperlink r:id="rId222">
+      <w:hyperlink r:id="rId221">
         <w:r>
           <w:rPr>
             <w:rtl w:val="0"/>
@@ -22727,7 +22693,7 @@
         <w:jc w:val="left"/>
         <w:rPr/>
       </w:pPr>
-      <w:hyperlink r:id="rId223">
+      <w:hyperlink r:id="rId222">
         <w:r>
           <w:rPr>
             <w:rtl w:val="0"/>
@@ -22741,7 +22707,7 @@
         </w:rPr>
         <w:tab/>
       </w:r>
-      <w:hyperlink r:id="rId224">
+      <w:hyperlink r:id="rId223">
         <w:r>
           <w:rPr>
             <w:rtl w:val="0"/>
@@ -22774,7 +22740,7 @@
         <w:jc w:val="left"/>
         <w:rPr/>
       </w:pPr>
-      <w:hyperlink r:id="rId225">
+      <w:hyperlink r:id="rId224">
         <w:r>
           <w:rPr>
             <w:rtl w:val="0"/>
@@ -22788,7 +22754,7 @@
         </w:rPr>
         <w:tab/>
       </w:r>
-      <w:hyperlink r:id="rId226">
+      <w:hyperlink r:id="rId225">
         <w:r>
           <w:rPr>
             <w:rtl w:val="0"/>
@@ -22821,7 +22787,7 @@
         <w:jc w:val="left"/>
         <w:rPr/>
       </w:pPr>
-      <w:hyperlink r:id="rId227">
+      <w:hyperlink r:id="rId226">
         <w:r>
           <w:rPr>
             <w:rtl w:val="0"/>
@@ -22835,7 +22801,7 @@
         </w:rPr>
         <w:tab/>
       </w:r>
-      <w:hyperlink r:id="rId228">
+      <w:hyperlink r:id="rId227">
         <w:r>
           <w:rPr>
             <w:rtl w:val="0"/>
@@ -22868,7 +22834,7 @@
         <w:jc w:val="left"/>
         <w:rPr/>
       </w:pPr>
-      <w:hyperlink r:id="rId229">
+      <w:hyperlink r:id="rId228">
         <w:r>
           <w:rPr>
             <w:rtl w:val="0"/>
@@ -22882,7 +22848,7 @@
         </w:rPr>
         <w:tab/>
       </w:r>
-      <w:hyperlink r:id="rId230">
+      <w:hyperlink r:id="rId229">
         <w:r>
           <w:rPr>
             <w:rtl w:val="0"/>
@@ -22915,7 +22881,7 @@
         <w:jc w:val="left"/>
         <w:rPr/>
       </w:pPr>
-      <w:hyperlink r:id="rId231">
+      <w:hyperlink r:id="rId230">
         <w:r>
           <w:rPr>
             <w:rtl w:val="0"/>
@@ -22929,7 +22895,7 @@
         </w:rPr>
         <w:tab/>
       </w:r>
-      <w:hyperlink r:id="rId232">
+      <w:hyperlink r:id="rId231">
         <w:r>
           <w:rPr>
             <w:rtl w:val="0"/>
@@ -22962,7 +22928,7 @@
         <w:jc w:val="left"/>
         <w:rPr/>
       </w:pPr>
-      <w:hyperlink r:id="rId233">
+      <w:hyperlink r:id="rId232">
         <w:r>
           <w:rPr>
             <w:rtl w:val="0"/>
@@ -22976,7 +22942,7 @@
         </w:rPr>
         <w:tab/>
       </w:r>
-      <w:hyperlink r:id="rId234">
+      <w:hyperlink r:id="rId233">
         <w:r>
           <w:rPr>
             <w:rtl w:val="0"/>
@@ -23009,7 +22975,7 @@
         <w:jc w:val="left"/>
         <w:rPr/>
       </w:pPr>
-      <w:hyperlink r:id="rId235">
+      <w:hyperlink r:id="rId234">
         <w:r>
           <w:rPr>
             <w:rtl w:val="0"/>
@@ -23023,7 +22989,7 @@
         </w:rPr>
         <w:tab/>
       </w:r>
-      <w:hyperlink r:id="rId236">
+      <w:hyperlink r:id="rId235">
         <w:r>
           <w:rPr>
             <w:rtl w:val="0"/>
@@ -23056,7 +23022,7 @@
         <w:jc w:val="left"/>
         <w:rPr/>
       </w:pPr>
-      <w:hyperlink r:id="rId237">
+      <w:hyperlink r:id="rId236">
         <w:r>
           <w:rPr>
             <w:rtl w:val="0"/>
@@ -23070,7 +23036,7 @@
         </w:rPr>
         <w:tab/>
       </w:r>
-      <w:hyperlink r:id="rId238">
+      <w:hyperlink r:id="rId237">
         <w:r>
           <w:rPr>
             <w:rtl w:val="0"/>
@@ -23103,7 +23069,7 @@
         <w:jc w:val="left"/>
         <w:rPr/>
       </w:pPr>
-      <w:hyperlink r:id="rId239">
+      <w:hyperlink r:id="rId238">
         <w:r>
           <w:rPr>
             <w:rtl w:val="0"/>
@@ -23117,7 +23083,7 @@
         </w:rPr>
         <w:tab/>
       </w:r>
-      <w:hyperlink r:id="rId240">
+      <w:hyperlink r:id="rId239">
         <w:r>
           <w:rPr>
             <w:rtl w:val="0"/>

</xml_diff>

<commit_message>
Fix final manuscript audit findings
</commit_message>
<xml_diff>
--- a/manuscript/Manuscript.docx
+++ b/manuscript/Manuscript.docx
@@ -101,7 +101,7 @@
           <w:vertAlign w:val="superscript"/>
           <w:rtl w:val="0"/>
         </w:rPr>
-        <w:t xml:space="preserve">4,5,6</w:t>
+        <w:t xml:space="preserve">1,4,5</w:t>
       </w:r>
       <w:r>
         <w:rPr>
@@ -115,7 +115,7 @@
           <w:vertAlign w:val="superscript"/>
           <w:rtl w:val="0"/>
         </w:rPr>
-        <w:t xml:space="preserve">⍅1</w:t>
+        <w:t xml:space="preserve">⍅2</w:t>
       </w:r>
       <w:r>
         <w:rPr>
@@ -129,7 +129,7 @@
           <w:vertAlign w:val="superscript"/>
           <w:rtl w:val="0"/>
         </w:rPr>
-        <w:t xml:space="preserve">⍅1</w:t>
+        <w:t xml:space="preserve">⍅2</w:t>
       </w:r>
       <w:r>
         <w:rPr>
@@ -232,19 +232,15 @@
         <w:spacing w:after="0" w:before="0" w:line="276" w:lineRule="auto"/>
         <w:ind w:left="720" w:hanging="360"/>
         <w:jc w:val="left"/>
+        <w:rPr/>
+      </w:pPr>
+      <w:r>
         <w:rPr>
           <w:sz w:val="20"/>
           <w:szCs w:val="20"/>
-        </w:rPr>
-      </w:pPr>
-      <w:r>
-        <w:rPr>
-          <w:sz w:val="20"/>
-          <w:szCs w:val="20"/>
-          <w:rtl w:val="0"/>
-        </w:rPr>
-        <w:t xml:space="preserve">Department of Veterinary Medicine, University of Cambridge, Cambridge, CB3 0ES,UK.</w:t>
-        <w:tab/>
+          <w:rtl w:val="0"/>
+        </w:rPr>
+        <w:t xml:space="preserve">Parasites and Microbes, The Wellcome Sanger Institute, Wellcome Genome Campus, Hinxton, Cambridge,UK</w:t>
       </w:r>
     </w:p>
     <w:p>
@@ -256,41 +252,16 @@
         <w:spacing w:after="0" w:before="0" w:line="276" w:lineRule="auto"/>
         <w:ind w:left="720" w:hanging="360"/>
         <w:jc w:val="left"/>
+        <w:rPr/>
+      </w:pPr>
+      <w:r>
         <w:rPr>
           <w:sz w:val="20"/>
           <w:szCs w:val="20"/>
-        </w:rPr>
-      </w:pPr>
-      <w:r>
-        <w:rPr>
-          <w:sz w:val="20"/>
-          <w:szCs w:val="20"/>
-          <w:rtl w:val="0"/>
-        </w:rPr>
-        <w:t xml:space="preserve">Wellcome Sanger Institute, Hinxton, Cambridge, </w:t>
-      </w:r>
-      <w:r>
-        <w:rPr>
-          <w:sz w:val="20"/>
-          <w:szCs w:val="20"/>
-          <w:highlight w:val="white"/>
-          <w:rtl w:val="0"/>
-        </w:rPr>
-        <w:t xml:space="preserve">CB10 1RQ, UK</w:t>
-      </w:r>
-      <w:r>
-        <w:rPr>
-          <w:sz w:val="20"/>
-          <w:szCs w:val="20"/>
-          <w:rtl w:val="0"/>
-        </w:rPr>
-        <w:t xml:space="preserve">.</w:t>
+          <w:rtl w:val="0"/>
+        </w:rPr>
+        <w:t xml:space="preserve">Department of Veterinary Medicine, University of Cambridge, Cambridge, CB3 0ES,UK.</w:t>
         <w:tab/>
-      </w:r>
-      <w:r>
-        <w:rPr>
-          <w:rtl w:val="0"/>
-        </w:rPr>
       </w:r>
     </w:p>
     <w:p>
@@ -303,10 +274,7 @@
         <w:spacing w:after="0" w:before="0" w:line="276" w:lineRule="auto"/>
         <w:ind w:left="720" w:hanging="360"/>
         <w:jc w:val="left"/>
-        <w:rPr>
-          <w:sz w:val="20"/>
-          <w:szCs w:val="20"/>
-        </w:rPr>
+        <w:rPr/>
       </w:pPr>
       <w:r>
         <w:rPr>
@@ -328,49 +296,18 @@
           <w:ilvl w:val="0"/>
           <w:numId w:val="1"/>
         </w:numPr>
-        <w:spacing w:after="0" w:before="0" w:line="276" w:lineRule="auto"/>
+        <w:spacing w:line="276" w:lineRule="auto"/>
         <w:ind w:left="720" w:hanging="360"/>
         <w:jc w:val="left"/>
+        <w:rPr/>
+      </w:pPr>
+      <w:r>
         <w:rPr>
           <w:sz w:val="20"/>
           <w:szCs w:val="20"/>
-        </w:rPr>
-      </w:pPr>
-      <w:hyperlink r:id="rId6">
-        <w:r>
-          <w:rPr>
-            <w:sz w:val="20"/>
-            <w:szCs w:val="20"/>
-            <w:highlight w:val="white"/>
-            <w:rtl w:val="0"/>
-          </w:rPr>
-          <w:t xml:space="preserve">Parasites and Microbes, Wellcome Sanger Institute, Hinxton, Cambridge, </w:t>
-        </w:r>
-      </w:hyperlink>
-      <w:r>
-        <w:rPr>
-          <w:sz w:val="20"/>
-          <w:szCs w:val="20"/>
-          <w:highlight w:val="white"/>
-          <w:rtl w:val="0"/>
-        </w:rPr>
-        <w:t xml:space="preserve">CB10 1RQ</w:t>
-      </w:r>
-      <w:hyperlink r:id="rId7">
-        <w:r>
-          <w:rPr>
-            <w:sz w:val="20"/>
-            <w:szCs w:val="20"/>
-            <w:highlight w:val="white"/>
-            <w:rtl w:val="0"/>
-          </w:rPr>
-          <w:t xml:space="preserve">, UK</w:t>
-        </w:r>
-      </w:hyperlink>
-      <w:r>
-        <w:rPr>
-          <w:rtl w:val="0"/>
-        </w:rPr>
+          <w:rtl w:val="0"/>
+        </w:rPr>
+        <w:t xml:space="preserve">European Molecular Biology Laboratory-European Bioinformatics Institute, Cambridge, United Kingdom.</w:t>
       </w:r>
     </w:p>
     <w:p>
@@ -379,118 +316,19 @@
           <w:ilvl w:val="0"/>
           <w:numId w:val="1"/>
         </w:numPr>
-        <w:spacing w:after="0" w:before="0" w:line="276" w:lineRule="auto"/>
+        <w:spacing w:line="330" w:lineRule="auto"/>
         <w:ind w:left="720" w:hanging="360"/>
         <w:jc w:val="left"/>
+        <w:rPr/>
+      </w:pPr>
+      <w:r>
         <w:rPr>
           <w:sz w:val="20"/>
           <w:szCs w:val="20"/>
-        </w:rPr>
-      </w:pPr>
-      <w:r>
-        <w:rPr>
-          <w:sz w:val="20"/>
-          <w:szCs w:val="20"/>
-          <w:highlight w:val="white"/>
-          <w:rtl w:val="0"/>
-        </w:rPr>
-        <w:t xml:space="preserve">​</w:t>
-      </w:r>
-      <w:hyperlink r:id="rId8">
-        <w:r>
-          <w:rPr>
-            <w:sz w:val="20"/>
-            <w:szCs w:val="20"/>
-            <w:highlight w:val="white"/>
-            <w:rtl w:val="0"/>
-          </w:rPr>
-          <w:t xml:space="preserve">Milner Centre for Evolution, Department of Life Sciences, University of Bath, Bath, </w:t>
-        </w:r>
-      </w:hyperlink>
-      <w:hyperlink r:id="rId9">
-        <w:r>
-          <w:rPr>
-            <w:sz w:val="20"/>
-            <w:szCs w:val="20"/>
-            <w:highlight w:val="white"/>
-            <w:rtl w:val="0"/>
-          </w:rPr>
-          <w:t xml:space="preserve">BA2 7AY</w:t>
-        </w:r>
-      </w:hyperlink>
-      <w:hyperlink r:id="rId10">
-        <w:r>
-          <w:rPr>
-            <w:sz w:val="20"/>
-            <w:szCs w:val="20"/>
-            <w:highlight w:val="white"/>
-            <w:rtl w:val="0"/>
-          </w:rPr>
-          <w:t xml:space="preserve">, UK</w:t>
-        </w:r>
-      </w:hyperlink>
-      <w:r>
-        <w:rPr>
-          <w:rtl w:val="0"/>
-        </w:rPr>
-      </w:r>
-    </w:p>
-    <w:p>
-      <w:pPr>
-        <w:numPr>
-          <w:ilvl w:val="0"/>
-          <w:numId w:val="1"/>
-        </w:numPr>
-        <w:spacing w:after="0" w:before="0" w:line="276" w:lineRule="auto"/>
-        <w:ind w:left="720" w:hanging="360"/>
-        <w:jc w:val="left"/>
-        <w:rPr>
-          <w:sz w:val="20"/>
-          <w:szCs w:val="20"/>
-        </w:rPr>
-      </w:pPr>
-      <w:r>
-        <w:rPr>
-          <w:sz w:val="20"/>
-          <w:szCs w:val="20"/>
-          <w:highlight w:val="white"/>
-          <w:rtl w:val="0"/>
-        </w:rPr>
-        <w:t xml:space="preserve">​</w:t>
-      </w:r>
-      <w:hyperlink r:id="rId11">
-        <w:r>
-          <w:rPr>
-            <w:sz w:val="20"/>
-            <w:szCs w:val="20"/>
-            <w:highlight w:val="white"/>
-            <w:rtl w:val="0"/>
-          </w:rPr>
-          <w:t xml:space="preserve">The Great Ormond Street Institute of Child Health, University College London, London, </w:t>
-        </w:r>
-      </w:hyperlink>
-      <w:hyperlink r:id="rId12">
-        <w:r>
-          <w:rPr>
-            <w:sz w:val="20"/>
-            <w:szCs w:val="20"/>
-            <w:highlight w:val="white"/>
-            <w:rtl w:val="0"/>
-          </w:rPr>
-          <w:t xml:space="preserve">WC1N 1EH, </w:t>
-        </w:r>
-      </w:hyperlink>
-      <w:hyperlink r:id="rId13">
-        <w:r>
-          <w:rPr>
-            <w:sz w:val="20"/>
-            <w:szCs w:val="20"/>
-            <w:highlight w:val="white"/>
-            <w:rtl w:val="0"/>
-          </w:rPr>
-          <w:t xml:space="preserve">UK</w:t>
-        </w:r>
-      </w:hyperlink>
+          <w:rtl w:val="0"/>
+        </w:rPr>
+        <w:t xml:space="preserve">Infection, Immunity and Inflammation Department, UCL Great Ormond Street Institute of Child Health Biomedical Research Centre, London, UK</w:t>
+      </w:r>
       <w:r>
         <w:rPr>
           <w:rtl w:val="0"/>
@@ -849,7 +687,7 @@
         </w:rPr>
         <w:t xml:space="preserve"> a major human pathogen responsible for an estimated 1.2 million infections and 7000 deaths annually in the USA alone </w:t>
       </w:r>
-      <w:hyperlink r:id="rId14">
+      <w:hyperlink r:id="rId6">
         <w:r>
           <w:rPr>
             <w:rtl w:val="0"/>
@@ -883,7 +721,7 @@
         </w:rPr>
         <w:t xml:space="preserve"> driven widespread resistance – in some cases repeatedly, over short timeframes and across diverse populations </w:t>
       </w:r>
-      <w:hyperlink r:id="rId15">
+      <w:hyperlink r:id="rId7">
         <w:r>
           <w:rPr>
             <w:rtl w:val="0"/>
@@ -912,7 +750,7 @@
         </w:rPr>
         <w:t xml:space="preserve"> </w:t>
       </w:r>
-      <w:hyperlink r:id="rId16">
+      <w:hyperlink r:id="rId8">
         <w:r>
           <w:rPr>
             <w:rtl w:val="0"/>
@@ -977,7 +815,7 @@
         </w:rPr>
         <w:t xml:space="preserve"> isolates, each tested for susceptibility to multiple beta-lactams using phenotypic assays such as minimum inhibitory concentration (MIC) </w:t>
       </w:r>
-      <w:hyperlink r:id="rId17">
+      <w:hyperlink r:id="rId9">
         <w:r>
           <w:rPr>
             <w:rtl w:val="0"/>
@@ -1027,7 +865,7 @@
         </w:rPr>
         <w:t xml:space="preserve">span multiple dilution steps (e.g. 4, 8, 16, or 32 μg/mL), and II) susceptibility phenotypes across beta-lactam drugs are typically correlated </w:t>
       </w:r>
-      <w:hyperlink r:id="rId18">
+      <w:hyperlink r:id="rId10">
         <w:r>
           <w:rPr>
             <w:rtl w:val="0"/>
@@ -1051,7 +889,7 @@
         </w:rPr>
         <w:t xml:space="preserve">in others, epidemiological factors, such as sequential treatment with separate beta-lactams, generates co-resistance </w:t>
       </w:r>
-      <w:hyperlink r:id="rId19">
+      <w:hyperlink r:id="rId11">
         <w:r>
           <w:rPr>
             <w:rtl w:val="0"/>
@@ -1075,7 +913,7 @@
         </w:rPr>
         <w:t xml:space="preserve">Understanding how these correlations arise and persist is crucial, because they could accelerate drug resistance across multiple beta-lactams simultaneously, restricting the efficacy of the entire drug class </w:t>
       </w:r>
-      <w:hyperlink r:id="rId20">
+      <w:hyperlink r:id="rId12">
         <w:r>
           <w:rPr>
             <w:rtl w:val="0"/>
@@ -1157,7 +995,7 @@
         </w:rPr>
         <w:t xml:space="preserve"> clinical or epidemiological cut-offs </w:t>
       </w:r>
-      <w:hyperlink r:id="rId21">
+      <w:hyperlink r:id="rId13">
         <w:r>
           <w:rPr>
             <w:rtl w:val="0"/>
@@ -1197,7 +1035,7 @@
         </w:rPr>
         <w:t xml:space="preserve"> </w:t>
       </w:r>
-      <w:hyperlink r:id="rId22">
+      <w:hyperlink r:id="rId14">
         <w:r>
           <w:rPr>
             <w:rtl w:val="0"/>
@@ -1225,7 +1063,7 @@
         </w:rPr>
         <w:t xml:space="preserve">Secondly, MICs are typically analysed separately for each drug, despite the underlying resistance mechanisms being known to affect multiple beta-lactams simultaneously </w:t>
       </w:r>
-      <w:hyperlink r:id="rId23">
+      <w:hyperlink r:id="rId15">
         <w:r>
           <w:rPr>
             <w:rtl w:val="0"/>
@@ -1249,7 +1087,7 @@
         </w:rPr>
         <w:t xml:space="preserve">Clinically, this is important for selecting effective therapies, but it is also important from an evolutionary perspective, because genetic changes that affect multiple phenotypes can shape subsequent trajectories </w:t>
       </w:r>
-      <w:hyperlink r:id="rId24">
+      <w:hyperlink r:id="rId16">
         <w:r>
           <w:rPr>
             <w:rtl w:val="0"/>
@@ -1265,7 +1103,7 @@
         </w:rPr>
         <w:t xml:space="preserve">. For instance, if a single mechanism confers resistance to multiple beta-lactams, selection for resistance to any of those drugs may propagate resistance to others </w:t>
       </w:r>
-      <w:hyperlink r:id="rId25">
+      <w:hyperlink r:id="rId17">
         <w:r>
           <w:rPr>
             <w:rtl w:val="0"/>
@@ -1301,7 +1139,7 @@
         </w:rPr>
         <w:t xml:space="preserve">frequently contain missing or heterogeneous measurements, such as when values fall outside the dilution range of the assay, or when multiple susceptibility-testing methods are combined within a single collection </w:t>
       </w:r>
-      <w:hyperlink r:id="rId26">
+      <w:hyperlink r:id="rId18">
         <w:r>
           <w:rPr>
             <w:rtl w:val="0"/>
@@ -1321,7 +1159,7 @@
         </w:rPr>
         <w:t xml:space="preserve">often necessitate separate analyses per drug, complicating clinical surveillance and reducing statistical power to identify subtle, but important evolutionary changes over time </w:t>
       </w:r>
-      <w:hyperlink r:id="rId27">
+      <w:hyperlink r:id="rId19">
         <w:r>
           <w:rPr>
             <w:rtl w:val="0"/>
@@ -1341,7 +1179,7 @@
         </w:rPr>
         <w:t xml:space="preserve"> Existing multivariate approaches (pairwise correlations, categorical classification rules, multi-trait GWAS) address some of these problems, but are limited in their ability to capture fine-scale variation in continuous MIC data, identify covarying effects, and provide an intuitive representation of high-dimensional resistance in relation to metadata </w:t>
       </w:r>
-      <w:hyperlink r:id="rId28">
+      <w:hyperlink r:id="rId20">
         <w:r>
           <w:rPr>
             <w:rtl w:val="0"/>
@@ -1373,7 +1211,7 @@
         </w:rPr>
         <w:t xml:space="preserve">S. pneumoniae </w:t>
       </w:r>
-      <w:hyperlink r:id="rId29">
+      <w:hyperlink r:id="rId21">
         <w:r>
           <w:rPr>
             <w:rtl w:val="0"/>
@@ -1425,7 +1263,7 @@
         </w:rPr>
         <w:t xml:space="preserve"> because of the complex genetic mechanisms underlying beta-lactam resistance. In streptococci, beta-lactams bind to the active site of the penicillin-binding proteins (PBPs), inhibiting their role in peptidoglycan cell wall biosynthesis </w:t>
       </w:r>
-      <w:hyperlink r:id="rId30">
+      <w:hyperlink r:id="rId22">
         <w:r>
           <w:rPr>
             <w:rtl w:val="0"/>
@@ -1448,7 +1286,7 @@
         </w:rPr>
         <w:t xml:space="preserve">nce primarily arises through the modification of three PBPs—PBP1A, PBP2B, and PBP2X—where changes in the transpeptidase domains reduce antibiotic binding affinity </w:t>
       </w:r>
-      <w:hyperlink r:id="rId31">
+      <w:hyperlink r:id="rId23">
         <w:r>
           <w:rPr>
             <w:rtl w:val="0"/>
@@ -1464,7 +1302,7 @@
         </w:rPr>
         <w:t xml:space="preserve">. The variants within these proteins that reduce antibiotic binding (i.e. causal variants) are contained within highly variable ‘mosaic’ blocks, formed via recombination with other streptococci species </w:t>
       </w:r>
-      <w:hyperlink r:id="rId32">
+      <w:hyperlink r:id="rId24">
         <w:r>
           <w:rPr>
             <w:rtl w:val="0"/>
@@ -1480,7 +1318,7 @@
         </w:rPr>
         <w:t xml:space="preserve">. However, within these blocks, many substitutions are merely hitchhikers (i.e. variants that do not directly affect resistance), and others only increase MIC in combination or alter the fitness effects of primary resistance mutations </w:t>
       </w:r>
-      <w:hyperlink r:id="rId33">
+      <w:hyperlink r:id="rId25">
         <w:r>
           <w:rPr>
             <w:rtl w:val="0"/>
@@ -1512,7 +1350,7 @@
         </w:rPr>
         <w:t xml:space="preserve">reliably link changes in the PBPs with non-susceptible phenotypes, precisely identifying the individual substitutions associated with changes in MIC remains challenging, particularly when GWAS analyses each antibiotic separately or as binary resistant/susceptible traits, as this limits the detection of fine-scale, correlated effects across drugs </w:t>
       </w:r>
-      <w:hyperlink r:id="rId34">
+      <w:hyperlink r:id="rId26">
         <w:r>
           <w:rPr>
             <w:rtl w:val="0"/>
@@ -1528,7 +1366,7 @@
         </w:rPr>
         <w:t xml:space="preserve">. Consequently, there has been limited overlap between methods in which PBP substitutions are identified as associated with non-susceptible phenotypes </w:t>
       </w:r>
-      <w:hyperlink r:id="rId35">
+      <w:hyperlink r:id="rId27">
         <w:r>
           <w:rPr>
             <w:rtl w:val="0"/>
@@ -1561,7 +1399,7 @@
         </w:rPr>
         <w:t xml:space="preserve">However, to address these issues, we need tools which can account for the fact that beta-lactam phenotypes–and their underlying genetic mechanism–are both continuous and multivariate. While all beta-lactams target PBPs, different subclasses bind to each PBP with distinct binding affinities–for example, penicillins (e.g. penicillin, amoxicillin) primarily bind to PBP2X and PBP2B, whereas cephalosporins bind predominantly to PBP2X and 1A </w:t>
       </w:r>
-      <w:hyperlink r:id="rId36">
+      <w:hyperlink r:id="rId28">
         <w:r>
           <w:rPr>
             <w:rtl w:val="0"/>
@@ -1577,7 +1415,7 @@
         </w:rPr>
         <w:t xml:space="preserve">. Because of this, a single PBP mutation can affect susceptibility to multiple beta-lactams in different ways </w:t>
       </w:r>
-      <w:hyperlink r:id="rId37">
+      <w:hyperlink r:id="rId29">
         <w:r>
           <w:rPr>
             <w:rtl w:val="0"/>
@@ -1600,7 +1438,7 @@
         </w:rPr>
         <w:t xml:space="preserve"> drugs, but cumulatively leading to clinical resistance across several drugs (</w:t>
       </w:r>
-      <w:hyperlink r:id="rId38">
+      <w:hyperlink r:id="rId30">
         <w:r>
           <w:rPr>
             <w:highlight w:val="white"/>
@@ -1616,7 +1454,7 @@
         </w:rPr>
         <w:t xml:space="preserve">–</w:t>
       </w:r>
-      <w:hyperlink r:id="rId39">
+      <w:hyperlink r:id="rId31">
         <w:r>
           <w:rPr>
             <w:highlight w:val="white"/>
@@ -1658,7 +1496,7 @@
         </w:rPr>
         <w:t xml:space="preserve"> an ideal model system for developing methods to visualise multivariate drug resistance phenotypes, and to use them to interpret how mutations collectively confer high-level resistance. These tools would then allow us to investigate whether phenotypes differ across phylogenetic lineages (i.e. Multilocus Sequence Types - MLST) </w:t>
       </w:r>
-      <w:hyperlink r:id="rId40">
+      <w:hyperlink r:id="rId32">
         <w:r>
           <w:rPr>
             <w:rtl w:val="0"/>
@@ -1690,7 +1528,7 @@
         </w:rPr>
         <w:t xml:space="preserve">To develop this toolkit, we propose an approach inspired by ‘Antigenic Cartography’. Originally developed to visualise antigenic evolution in H3N2 influenza, antigenic cartography has enabled the precise tracking of antigenic changes in viral pathogens–guiding vaccine design and improving understanding of immune responses to evolving pathogens </w:t>
       </w:r>
-      <w:hyperlink r:id="rId41">
+      <w:hyperlink r:id="rId33">
         <w:r>
           <w:rPr>
             <w:rtl w:val="0"/>
@@ -1837,7 +1675,7 @@
         </w:rPr>
         <w:t xml:space="preserve">We used a published dataset of 4,309 invasive pneumococcal isolates, collected in the United States through the Active Bacterial Core surveillance (ABC) programme between 1998 and 2015 </w:t>
       </w:r>
-      <w:hyperlink r:id="rId42">
+      <w:hyperlink r:id="rId34">
         <w:r>
           <w:rPr>
             <w:rtl w:val="0"/>
@@ -1863,7 +1701,7 @@
         </w:rPr>
         <w:t xml:space="preserve">run by the Centers for Disease Control and Prevention (CDC) Emerging Infectious Disease programme </w:t>
       </w:r>
-      <w:hyperlink r:id="rId43">
+      <w:hyperlink r:id="rId35">
         <w:r>
           <w:rPr>
             <w:rtl w:val="0"/>
@@ -1922,7 +1760,7 @@
         </w:rPr>
         <w:t xml:space="preserve"> beta-lactams, of three subclasses: penicillin, amoxicillin (penicillins), ceftriaxone, cefotaxime, cefuroxime (cephalosporins), and meropenem (a carbapenem). Whole genome sequencing for all isolates was performed using the Illumina HiSeq or MiSeq platforms </w:t>
       </w:r>
-      <w:hyperlink r:id="rId44">
+      <w:hyperlink r:id="rId36">
         <w:r>
           <w:rPr>
             <w:rtl w:val="0"/>
@@ -2006,7 +1844,7 @@
         </w:rPr>
         <w:t xml:space="preserve">Phenotype maps visualise a Euclidean distance matrix derived from MIC data. To run iterative multidimensional scaling (SMACOF algorithm) using MIC data, MIC values were log₂ transformed to approximate a standard distribution </w:t>
       </w:r>
-      <w:hyperlink r:id="rId45">
+      <w:hyperlink r:id="rId37">
         <w:r>
           <w:rPr>
             <w:rtl w:val="0"/>
@@ -2045,7 +1883,7 @@
         </w:rPr>
         <w:t xml:space="preserve">. Given this set of target distances, MDS finds a low-dimensional representation of those distances with minimal error </w:t>
       </w:r>
-      <w:hyperlink r:id="rId46">
+      <w:hyperlink r:id="rId38">
         <w:r>
           <w:rPr>
             <w:rtl w:val="0"/>
@@ -2315,7 +2153,7 @@
         </w:rPr>
         <w:t xml:space="preserve">Here, ‘stress’ is the sum of the squared residuals between points on the map and their measured distances. The MDS algorithm searches for a minimum stress value by iteratively shifting the positions of isolates on the map. As MDS can be applied to either metric or rank data, both numeric and censored MIC values can be represented (Supplementary Section S1.6). We also developed “genetic maps”, which visualise genetic differences among isolates using a Hamming distance matrix based on an amino acid sequence alignment (Supplementary Figure S8) </w:t>
       </w:r>
-      <w:hyperlink r:id="rId47">
+      <w:hyperlink r:id="rId39">
         <w:r>
           <w:rPr>
             <w:rtl w:val="0"/>
@@ -2390,7 +2228,7 @@
         <w:rPr>
           <w:rtl w:val="0"/>
         </w:rPr>
-        <w:t xml:space="preserve">S2.5-8), </w:t>
+        <w:t xml:space="preserve">S2.5-9), </w:t>
       </w:r>
       <w:r>
         <w:rPr>
@@ -2404,7 +2242,7 @@
         </w:rPr>
         <w:t xml:space="preserve">ach of which were originally developed to identify substitutions underlying antigenic change in H3N2 influenza </w:t>
       </w:r>
-      <w:hyperlink r:id="rId48">
+      <w:hyperlink r:id="rId40">
         <w:r>
           <w:rPr>
             <w:rtl w:val="0"/>
@@ -2448,7 +2286,7 @@
         </w:rPr>
         <w:t xml:space="preserve">between amino acid substitutions and isolate position on the phenotype map, and estimate the phenotypic effect sizes of each substitution </w:t>
       </w:r>
-      <w:hyperlink r:id="rId49">
+      <w:hyperlink r:id="rId41">
         <w:r>
           <w:rPr>
             <w:rtl w:val="0"/>
@@ -2492,7 +2330,7 @@
         </w:rPr>
         <w:t xml:space="preserve">S2.10) </w:t>
       </w:r>
-      <w:hyperlink r:id="rId50">
+      <w:hyperlink r:id="rId42">
         <w:r>
           <w:rPr>
             <w:rtl w:val="0"/>
@@ -3005,9 +2843,9 @@
           <w:color w:val="0e0e0e"/>
           <w:rtl w:val="0"/>
         </w:rPr>
-        <w:t xml:space="preserve">While higher-dimensional projections further reduced error (Table 1), improvements beyond two dimensions were more modest (e.g., 2D to 3D results in a projection error of 0.012 MIC units - less than the error of MIC testing), suggesting 2D maps adequately capture key phenotypic patterns for this dataset </w:t>
-      </w:r>
-      <w:hyperlink r:id="rId51">
+        <w:t xml:space="preserve">While higher-dimensional projections further reduced error (Table 1), improvements beyond two dimensions were more modest (e.g., 2D to 3D results in a drop in projection error of 0.406 MIC units - less than the error of MIC testing), suggesting 2D maps adequately capture key phenotypic patterns for this dataset </w:t>
+      </w:r>
+      <w:hyperlink r:id="rId43">
         <w:r>
           <w:rPr>
             <w:rtl w:val="0"/>
@@ -3046,10 +2884,10 @@
         <w:ind w:left="0"/>
         <w:rPr/>
         <w:sectPr>
-          <w:headerReference r:id="rId52" w:type="default"/>
-          <w:footerReference r:id="rId53" w:type="default"/>
-          <w:footerReference r:id="rId54" w:type="first"/>
-          <w:footerReference r:id="rId55" w:type="even"/>
+          <w:headerReference r:id="rId44" w:type="default"/>
+          <w:footerReference r:id="rId45" w:type="default"/>
+          <w:footerReference r:id="rId46" w:type="first"/>
+          <w:footerReference r:id="rId47" w:type="even"/>
           <w:pgSz w:h="16840" w:w="11900" w:orient="portrait"/>
           <w:pgMar w:bottom="1440" w:top="1440" w:left="1440" w:right="1440" w:header="708" w:footer="708"/>
           <w:pgNumType w:start="1"/>
@@ -3080,7 +2918,7 @@
                     <pic:cNvPicPr preferRelativeResize="0"/>
                   </pic:nvPicPr>
                   <pic:blipFill>
-                    <a:blip r:embed="rId56"/>
+                    <a:blip r:embed="rId48"/>
                     <a:srcRect b="10061" l="0" r="0" t="8537"/>
                     <a:stretch>
                       <a:fillRect/>
@@ -5143,7 +4981,7 @@
         </w:rPr>
         <w:t xml:space="preserve">the range of error expected if isolates were remeasured experimentally </w:t>
       </w:r>
-      <w:hyperlink r:id="rId57">
+      <w:hyperlink r:id="rId49">
         <w:r>
           <w:rPr>
             <w:rtl w:val="0"/>
@@ -6234,7 +6072,7 @@
                 <w:szCs w:val="18"/>
                 <w:rtl w:val="0"/>
               </w:rPr>
-              <w:t xml:space="preserve">85.535</w:t>
+              <w:t xml:space="preserve">86.535</w:t>
             </w:r>
           </w:p>
         </w:tc>
@@ -6431,7 +6269,7 @@
         </w:rPr>
         <w:t xml:space="preserve">transpeptidase sequences typically display elevated MIC </w:t>
       </w:r>
-      <w:hyperlink r:id="rId58">
+      <w:hyperlink r:id="rId50">
         <w:r>
           <w:rPr>
             <w:rtl w:val="0"/>
@@ -6535,16 +6373,16 @@
           <wp:inline distB="114300" distT="114300" distL="114300" distR="114300">
             <wp:extent cx="5731200" cy="3797300"/>
             <wp:effectExtent b="0" l="0" r="0" t="0"/>
-            <wp:docPr id="2" name="image2.jpg"/>
+            <wp:docPr id="2" name="image3.jpg"/>
             <a:graphic>
               <a:graphicData uri="http://schemas.openxmlformats.org/drawingml/2006/picture">
                 <pic:pic>
                   <pic:nvPicPr>
-                    <pic:cNvPr id="0" name="image2.jpg"/>
+                    <pic:cNvPr id="0" name="image3.jpg"/>
                     <pic:cNvPicPr preferRelativeResize="0"/>
                   </pic:nvPicPr>
                   <pic:blipFill>
-                    <a:blip r:embed="rId59"/>
+                    <a:blip r:embed="rId51"/>
                     <a:srcRect b="0" l="0" r="0" t="0"/>
                     <a:stretch>
                       <a:fillRect/>
@@ -6717,7 +6555,7 @@
         </w:rPr>
         <w:t xml:space="preserve"> methods increase statistical power to identify substitutions with effects on multiple drugs, potentially revealing trade-offs between beta-lactam subclasses </w:t>
       </w:r>
-      <w:hyperlink r:id="rId60">
+      <w:hyperlink r:id="rId52">
         <w:r>
           <w:rPr>
             <w:rtl w:val="0"/>
@@ -6769,7 +6607,7 @@
         <w:rPr>
           <w:rtl w:val="0"/>
         </w:rPr>
-        <w:t xml:space="preserve">= 71% and 57.2% for axes 1 and 2 respectively), with PBP2X accounting for the majority (76% and 61.3%, respectively). T</w:t>
+        <w:t xml:space="preserve">= 71.4% and 57.8% for axes 1 and 2 respectively), with PBP2X accounting for the majority (76% and 61.3%, respectively). T</w:t>
       </w:r>
       <w:r>
         <w:rPr>
@@ -6869,7 +6707,7 @@
         </w:rPr>
         <w:t xml:space="preserve">everal high-ranking substitutions mapped to or near conserved PBP active-site motifs (Supplementary File 1). For example, in PBP2X, I371T, A369V, L364F, and M343T formed a cluster near the active site between the S337TMK and S395SN motifs, while V523L and S531Y lay closer to the K547SG motif </w:t>
       </w:r>
-      <w:hyperlink r:id="rId61">
+      <w:hyperlink r:id="rId53">
         <w:r>
           <w:rPr>
             <w:rtl w:val="0"/>
@@ -6883,7 +6721,7 @@
         </w:rPr>
         <w:t xml:space="preserve">. In PBP1A, T371S was within the S370TMK motif, and several further candidates lay between S370TMK and S466SN or downstream of K557TG. Moreover, PBP2B candidates with subclass-specific effects were located between S443SN and K615TG, including L609S near K615TG </w:t>
       </w:r>
-      <w:hyperlink r:id="rId62">
+      <w:hyperlink r:id="rId54">
         <w:r>
           <w:rPr>
             <w:rtl w:val="0"/>
@@ -7072,7 +6910,7 @@
         <w:rPr>
           <w:rtl w:val="0"/>
         </w:rPr>
-        <w:t xml:space="preserve">Supplementary Figure S19</w:t>
+        <w:t xml:space="preserve">Supplementary Figure S20</w:t>
       </w:r>
       <w:r>
         <w:rPr>
@@ -7084,21 +6922,13 @@
         <w:rPr>
           <w:rtl w:val="0"/>
         </w:rPr>
-        <w:t xml:space="preserve"> We also compared the results of the multivariate mvLMM to conventional univariate methods applied to individual MICs for each drug. Multivariate mvLMMs detected 123 candidate substitutions at 107 PBP positions which were not identified by univariate LMMs on MICs for each drug individually (Table 3 and Supplementary Section S3.3). These included several substitutions with contrasting subclass effects—such as those in PBP1A and PBP2B—many of which were also supported by both clustering and single-substitution analyses</w:t>
+        <w:t xml:space="preserve"> We also compared the results of the multivariate mvLMM to conventional univariate methods applied to individual MICs for each drug. Multivariate mvLMMs detected 123 candidate substitutions at 107 PBP positions which were not identified by univariate LMMs on MICs for each drug individually (Table 3 and Supplementary Section S3.3). These included several substitutions with contrasting subclass effects—such as those in PBP1A and PBP2B—11 of which were also supported by the clustering analyses</w:t>
       </w:r>
       <w:r>
         <w:rPr>
           <w:rtl w:val="0"/>
         </w:rPr>
         <w:t xml:space="preserve">. </w:t>
-      </w:r>
-      <w:r>
-        <w:br w:type="page"/>
-      </w:r>
-      <w:r>
-        <w:rPr>
-          <w:rtl w:val="0"/>
-        </w:rPr>
       </w:r>
     </w:p>
     <w:p>
@@ -7117,6 +6947,37 @@
     </w:p>
     <w:p>
       <w:pPr>
+        <w:tabs>
+          <w:tab w:val="left" w:leader="none" w:pos="220"/>
+          <w:tab w:val="left" w:leader="none" w:pos="720"/>
+        </w:tabs>
+        <w:rPr/>
+      </w:pPr>
+      <w:r>
+        <w:br w:type="page"/>
+      </w:r>
+      <w:r>
+        <w:rPr>
+          <w:rtl w:val="0"/>
+        </w:rPr>
+      </w:r>
+    </w:p>
+    <w:p>
+      <w:pPr>
+        <w:tabs>
+          <w:tab w:val="left" w:leader="none" w:pos="220"/>
+          <w:tab w:val="left" w:leader="none" w:pos="720"/>
+        </w:tabs>
+        <w:rPr/>
+      </w:pPr>
+      <w:r>
+        <w:rPr>
+          <w:rtl w:val="0"/>
+        </w:rPr>
+      </w:r>
+    </w:p>
+    <w:p>
+      <w:pPr>
         <w:rPr>
           <w:b w:val="1"/>
           <w:bCs w:val="1"/>
@@ -7135,16 +6996,16 @@
           <wp:inline distB="114300" distT="114300" distL="114300" distR="114300">
             <wp:extent cx="5734050" cy="4129108"/>
             <wp:effectExtent b="0" l="0" r="0" t="0"/>
-            <wp:docPr id="1" name="image3.jpg"/>
+            <wp:docPr id="1" name="image2.jpg"/>
             <a:graphic>
               <a:graphicData uri="http://schemas.openxmlformats.org/drawingml/2006/picture">
                 <pic:pic>
                   <pic:nvPicPr>
-                    <pic:cNvPr id="0" name="image3.jpg"/>
+                    <pic:cNvPr id="0" name="image2.jpg"/>
                     <pic:cNvPicPr preferRelativeResize="0"/>
                   </pic:nvPicPr>
                   <pic:blipFill>
-                    <a:blip r:embed="rId63"/>
+                    <a:blip r:embed="rId55"/>
                     <a:srcRect b="704" l="0" r="0" t="12053"/>
                     <a:stretch>
                       <a:fillRect/>
@@ -17766,7 +17627,7 @@
         </w:rPr>
         <w:t xml:space="preserve">loss. Although susceptibility profiles were highly correlated across drugs, phenotypes deviated from a strictly linear path, as shown by the improved fit of a two-dimensional over a one-dimensional map. We hypothesise these divergences arise from intrinsic variation in drug-protein binding and the relative use of specific beta-lactam subclasses across populations </w:t>
       </w:r>
-      <w:hyperlink r:id="rId64">
+      <w:hyperlink r:id="rId56">
         <w:r>
           <w:rPr>
             <w:rtl w:val="0"/>
@@ -17798,7 +17659,7 @@
         </w:rPr>
         <w:t xml:space="preserve">others, a result consistent with previous findings, but demonstrated here across multiple beta-lactam subclasses </w:t>
       </w:r>
-      <w:hyperlink r:id="rId65">
+      <w:hyperlink r:id="rId57">
         <w:r>
           <w:rPr>
             <w:rtl w:val="0"/>
@@ -17974,7 +17835,7 @@
         </w:rPr>
         <w:t xml:space="preserve">methods </w:t>
       </w:r>
-      <w:hyperlink r:id="rId66">
+      <w:hyperlink r:id="rId58">
         <w:r>
           <w:rPr>
             <w:rtl w:val="0"/>
@@ -18006,7 +17867,7 @@
         </w:rPr>
         <w:t xml:space="preserve">refinements to genotype-phenotype association testing in bacteria, such as fine-mapping within specific genomic regions and using amino acid changes rather than nucleotides </w:t>
       </w:r>
-      <w:hyperlink r:id="rId67">
+      <w:hyperlink r:id="rId59">
         <w:r>
           <w:rPr>
             <w:rtl w:val="0"/>
@@ -18109,7 +17970,7 @@
         </w:rPr>
         <w:t xml:space="preserve"> due to its complex genetic basis and phenotypic variation and covariation </w:t>
       </w:r>
-      <w:hyperlink r:id="rId68">
+      <w:hyperlink r:id="rId60">
         <w:r>
           <w:rPr>
             <w:rtl w:val="0"/>
@@ -18173,7 +18034,7 @@
         </w:rPr>
         <w:t xml:space="preserve">where phenotypic data are unavailable, or novel combinations of substitutions emerge </w:t>
       </w:r>
-      <w:hyperlink r:id="rId69">
+      <w:hyperlink r:id="rId61">
         <w:r>
           <w:rPr>
             <w:rtl w:val="0"/>
@@ -18222,7 +18083,7 @@
         </w:rPr>
         <w:t xml:space="preserve"> experimental testing will be required to demonstrate the phenotypic effects of these substitutions, this list of markers may help in identifying emerging resistance during clinical interventions, such as serotype displacement after vaccination </w:t>
       </w:r>
-      <w:hyperlink r:id="rId70">
+      <w:hyperlink r:id="rId62">
         <w:r>
           <w:rPr>
             <w:rtl w:val="0"/>
@@ -18347,7 +18208,7 @@
         </w:rPr>
         <w:t xml:space="preserve"> highlighted 31 and 27 positions as associated with high-level MIC to beta-lactams respectively </w:t>
       </w:r>
-      <w:hyperlink r:id="rId71">
+      <w:hyperlink r:id="rId63">
         <w:r>
           <w:rPr>
             <w:rtl w:val="0"/>
@@ -18376,7 +18237,7 @@
         </w:rPr>
         <w:t xml:space="preserve">the greater sensitivity of multivariate approaches in detecting subtle and correlated genotype-phenotype associations </w:t>
       </w:r>
-      <w:hyperlink r:id="rId72">
+      <w:hyperlink r:id="rId64">
         <w:r>
           <w:rPr>
             <w:rtl w:val="0"/>
@@ -18442,7 +18303,7 @@
         </w:rPr>
         <w:t xml:space="preserve">he presence of such variants among bacterial populations suggests small, incremental MIC changes are epidemiologically relevant–either by directly contributing to treatment failure rates or by facilitating stepwise progression toward clinically significant resistance </w:t>
       </w:r>
-      <w:hyperlink r:id="rId73">
+      <w:hyperlink r:id="rId65">
         <w:r>
           <w:rPr>
             <w:rtl w:val="0"/>
@@ -18456,7 +18317,7 @@
         </w:rPr>
         <w:t xml:space="preserve">. Even if transitory, these changes may confer competitive advantages under variable drug exposure, such as in carriage sites or biofilm formations </w:t>
       </w:r>
-      <w:hyperlink r:id="rId74">
+      <w:hyperlink r:id="rId66">
         <w:r>
           <w:rPr>
             <w:rtl w:val="0"/>
@@ -18470,7 +18331,7 @@
         </w:rPr>
         <w:t xml:space="preserve">. Early detection of such changes is therefore essential for informing treatment guidelines and pre-empting the emergence of high-level resistance </w:t>
       </w:r>
-      <w:hyperlink r:id="rId75">
+      <w:hyperlink r:id="rId67">
         <w:r>
           <w:rPr>
             <w:rtl w:val="0"/>
@@ -18530,7 +18391,7 @@
         </w:rPr>
         <w:t xml:space="preserve">) </w:t>
       </w:r>
-      <w:hyperlink r:id="rId76">
+      <w:hyperlink r:id="rId68">
         <w:r>
           <w:rPr>
             <w:rtl w:val="0"/>
@@ -18627,7 +18488,7 @@
         </w:rPr>
         <w:t xml:space="preserve"> </w:t>
       </w:r>
-      <w:hyperlink r:id="rId77">
+      <w:hyperlink r:id="rId69">
         <w:r>
           <w:rPr>
             <w:rtl w:val="0"/>
@@ -18739,7 +18600,7 @@
         </w:rPr>
         <w:t xml:space="preserve">, and the target-binding specificity of drug structures </w:t>
       </w:r>
-      <w:hyperlink r:id="rId78">
+      <w:hyperlink r:id="rId70">
         <w:r>
           <w:rPr>
             <w:rtl w:val="0"/>
@@ -18771,7 +18632,7 @@
         </w:rPr>
         <w:t xml:space="preserve">This is an important distinction, as substitutions with effects on multiple drugs have a greater capacity to evade multiple antibiotics, and how this affects their relative selection pressure may determine how resistance to the entire class of drugs might evolve. In future, these insights could inform therapeutic protocols that exploit collateral sensitivity or calibrate models of co-selection in response to interventions </w:t>
       </w:r>
-      <w:hyperlink r:id="rId79">
+      <w:hyperlink r:id="rId71">
         <w:r>
           <w:rPr>
             <w:rtl w:val="0"/>
@@ -18820,7 +18681,7 @@
         </w:rPr>
         <w:t xml:space="preserve">or recombination rate </w:t>
       </w:r>
-      <w:hyperlink r:id="rId80">
+      <w:hyperlink r:id="rId72">
         <w:r>
           <w:rPr>
             <w:rtl w:val="0"/>
@@ -18840,7 +18701,7 @@
         </w:rPr>
         <w:t xml:space="preserve"> Some MLSTs, including 320 and 156, shifted in prevalence following the introduction of pneumococcal conjugate vaccines–which coincided with increases in resistance frequencies due to serotype replacement </w:t>
       </w:r>
-      <w:hyperlink r:id="rId81">
+      <w:hyperlink r:id="rId73">
         <w:r>
           <w:rPr>
             <w:rtl w:val="0"/>
@@ -18874,7 +18735,7 @@
         </w:rPr>
         <w:t xml:space="preserve">can achieve elevated MICs through multiple distinct mutational combinations, that these combinations can be specific to certain lineages, and that they are likely shaped by the extensive epistatic effects among PBPs </w:t>
       </w:r>
-      <w:hyperlink r:id="rId82">
+      <w:hyperlink r:id="rId74">
         <w:r>
           <w:rPr>
             <w:rtl w:val="0"/>
@@ -18888,7 +18749,7 @@
         </w:rPr>
         <w:t xml:space="preserve">. This has practical implications for clinical surveillance, as tailoring treatment to genetic backgrounds may help slow the emergence of high-level resistance </w:t>
       </w:r>
-      <w:hyperlink r:id="rId83">
+      <w:hyperlink r:id="rId75">
         <w:r>
           <w:rPr>
             <w:rtl w:val="0"/>
@@ -18902,7 +18763,7 @@
         </w:rPr>
         <w:t xml:space="preserve">. More broadly, this highlights the importance of genetic background in shaping evolutionary trajectories in this species, as it demonstrates the fitness and phenotypic outcomes of individual mutations are likely context-dependent </w:t>
       </w:r>
-      <w:hyperlink r:id="rId84">
+      <w:hyperlink r:id="rId76">
         <w:r>
           <w:rPr>
             <w:rtl w:val="0"/>
@@ -18965,7 +18826,7 @@
         </w:rPr>
         <w:t xml:space="preserve">By visualising several continuous phenotypic traits simultaneously, these ‘maps’ could enable further comparisons among pneumococcal populations </w:t>
       </w:r>
-      <w:hyperlink r:id="rId85">
+      <w:hyperlink r:id="rId77">
         <w:r>
           <w:rPr>
             <w:rtl w:val="0"/>
@@ -18979,7 +18840,7 @@
         </w:rPr>
         <w:t xml:space="preserve">, facilitate modelling of full susceptibility profiles </w:t>
       </w:r>
-      <w:hyperlink r:id="rId86">
+      <w:hyperlink r:id="rId78">
         <w:r>
           <w:rPr>
             <w:rtl w:val="0"/>
@@ -18993,7 +18854,7 @@
         </w:rPr>
         <w:t xml:space="preserve">, and help track phenotypic changes over evolutionary time </w:t>
       </w:r>
-      <w:hyperlink r:id="rId87">
+      <w:hyperlink r:id="rId79">
         <w:r>
           <w:rPr>
             <w:rtl w:val="0"/>
@@ -19095,7 +18956,7 @@
         </w:rPr>
         <w:t xml:space="preserve">data </w:t>
       </w:r>
-      <w:hyperlink r:id="rId88">
+      <w:hyperlink r:id="rId80">
         <w:r>
           <w:rPr>
             <w:rtl w:val="0"/>
@@ -19115,7 +18976,7 @@
         </w:rPr>
         <w:t xml:space="preserve">could be applied at smaller scales to experimental evolution studies and within-host treatment monitoring </w:t>
       </w:r>
-      <w:hyperlink r:id="rId89">
+      <w:hyperlink r:id="rId81">
         <w:r>
           <w:rPr>
             <w:rtl w:val="0"/>
@@ -19129,7 +18990,7 @@
         </w:rPr>
         <w:t xml:space="preserve">. Moreover, because the toolkit relies solely on phenotypic data, it could, in principle, be adapted to other species and drugs. This could also include multi-class drug resistance, as phenotypic correlations have been demonstrated across drug classes for several important bacterial pathogens, yet the causes of this are poorly understood </w:t>
       </w:r>
-      <w:hyperlink r:id="rId90">
+      <w:hyperlink r:id="rId82">
         <w:r>
           <w:rPr>
             <w:rtl w:val="0"/>
@@ -19143,7 +19004,7 @@
         </w:rPr>
         <w:t xml:space="preserve">. With adequate testing, the tool could be applied to MIC data from other large-scale surveillance programs, and used to help identify lineage- or species-specific genetic predispositions in acquiring resistance </w:t>
       </w:r>
-      <w:hyperlink r:id="rId91">
+      <w:hyperlink r:id="rId83">
         <w:r>
           <w:rPr>
             <w:rtl w:val="0"/>
@@ -19613,6 +19474,194 @@
         </w:rPr>
         <w:t xml:space="preserve">References:</w:t>
       </w:r>
+      <w:r>
+        <w:rPr>
+          <w:rtl w:val="0"/>
+        </w:rPr>
+      </w:r>
+    </w:p>
+    <w:p>
+      <w:pPr>
+        <w:keepNext w:val="0"/>
+        <w:keepLines w:val="0"/>
+        <w:pageBreakBefore w:val="0"/>
+        <w:widowControl w:val="0"/>
+        <w:pBdr>
+          <w:top w:space="0" w:sz="0" w:val="nil"/>
+          <w:left w:space="0" w:sz="0" w:val="nil"/>
+          <w:bottom w:space="0" w:sz="0" w:val="nil"/>
+          <w:right w:space="0" w:sz="0" w:val="nil"/>
+          <w:between w:space="0" w:sz="0" w:val="nil"/>
+        </w:pBdr>
+        <w:shd w:fill="auto" w:val="clear"/>
+        <w:spacing w:after="240" w:before="0" w:line="240" w:lineRule="auto"/>
+        <w:ind w:left="384.00000000000006" w:right="0" w:hanging="384.00000000000006"/>
+        <w:jc w:val="left"/>
+        <w:rPr/>
+      </w:pPr>
+      <w:hyperlink r:id="rId84">
+        <w:r>
+          <w:rPr>
+            <w:rtl w:val="0"/>
+          </w:rPr>
+          <w:t xml:space="preserve">1.</w:t>
+        </w:r>
+      </w:hyperlink>
+      <w:r>
+        <w:rPr>
+          <w:rtl w:val="0"/>
+        </w:rPr>
+        <w:tab/>
+      </w:r>
+      <w:hyperlink r:id="rId85">
+        <w:r>
+          <w:rPr>
+            <w:rtl w:val="0"/>
+          </w:rPr>
+          <w:t xml:space="preserve">Beall B, Chochua S, Gertz RE, Li Y, Li Z, McGee L, et al. A Population-Based Descriptive Atlas of Invasive Pneumococcal Strains Recovered Within the U.S. During 2015–2016. Front Microbiol. 2018 Nov 19;9. doi:10.3389/fmicb.2018.02670 </w:t>
+        </w:r>
+      </w:hyperlink>
+      <w:r>
+        <w:rPr>
+          <w:rtl w:val="0"/>
+        </w:rPr>
+      </w:r>
+    </w:p>
+    <w:p>
+      <w:pPr>
+        <w:keepNext w:val="0"/>
+        <w:keepLines w:val="0"/>
+        <w:pageBreakBefore w:val="0"/>
+        <w:widowControl w:val="0"/>
+        <w:pBdr>
+          <w:top w:space="0" w:sz="0" w:val="nil"/>
+          <w:left w:space="0" w:sz="0" w:val="nil"/>
+          <w:bottom w:space="0" w:sz="0" w:val="nil"/>
+          <w:right w:space="0" w:sz="0" w:val="nil"/>
+          <w:between w:space="0" w:sz="0" w:val="nil"/>
+        </w:pBdr>
+        <w:shd w:fill="auto" w:val="clear"/>
+        <w:spacing w:after="240" w:before="0" w:line="240" w:lineRule="auto"/>
+        <w:ind w:left="384.00000000000006" w:right="0" w:hanging="384.00000000000006"/>
+        <w:jc w:val="left"/>
+        <w:rPr/>
+      </w:pPr>
+      <w:hyperlink r:id="rId86">
+        <w:r>
+          <w:rPr>
+            <w:rtl w:val="0"/>
+          </w:rPr>
+          <w:t xml:space="preserve">2.</w:t>
+        </w:r>
+      </w:hyperlink>
+      <w:r>
+        <w:rPr>
+          <w:rtl w:val="0"/>
+        </w:rPr>
+        <w:tab/>
+      </w:r>
+      <w:hyperlink r:id="rId87">
+        <w:r>
+          <w:rPr>
+            <w:rtl w:val="0"/>
+          </w:rPr>
+          <w:t xml:space="preserve">McCormick AW, Whitney CG, Farley MM, Lynfield R, Harrison LH, Bennett NM, et al. Geographic diversity and temporal trends of antimicrobial resistance in Streptococcus pneumoniae in the United States. Nat Med. 2003 Apr;9(4):424–30. doi:10.1038/nm839 </w:t>
+        </w:r>
+      </w:hyperlink>
+      <w:r>
+        <w:rPr>
+          <w:rtl w:val="0"/>
+        </w:rPr>
+      </w:r>
+    </w:p>
+    <w:p>
+      <w:pPr>
+        <w:keepNext w:val="0"/>
+        <w:keepLines w:val="0"/>
+        <w:pageBreakBefore w:val="0"/>
+        <w:widowControl w:val="0"/>
+        <w:pBdr>
+          <w:top w:space="0" w:sz="0" w:val="nil"/>
+          <w:left w:space="0" w:sz="0" w:val="nil"/>
+          <w:bottom w:space="0" w:sz="0" w:val="nil"/>
+          <w:right w:space="0" w:sz="0" w:val="nil"/>
+          <w:between w:space="0" w:sz="0" w:val="nil"/>
+        </w:pBdr>
+        <w:shd w:fill="auto" w:val="clear"/>
+        <w:spacing w:after="240" w:before="0" w:line="240" w:lineRule="auto"/>
+        <w:ind w:left="384.00000000000006" w:right="0" w:hanging="384.00000000000006"/>
+        <w:jc w:val="left"/>
+        <w:rPr/>
+      </w:pPr>
+      <w:hyperlink r:id="rId88">
+        <w:r>
+          <w:rPr>
+            <w:rtl w:val="0"/>
+          </w:rPr>
+          <w:t xml:space="preserve">3.</w:t>
+        </w:r>
+      </w:hyperlink>
+      <w:r>
+        <w:rPr>
+          <w:rtl w:val="0"/>
+        </w:rPr>
+        <w:tab/>
+      </w:r>
+      <w:hyperlink r:id="rId89">
+        <w:r>
+          <w:rPr>
+            <w:rtl w:val="0"/>
+          </w:rPr>
+          <w:t xml:space="preserve">Dewé TCM, D’Aeth JC, Croucher NJ. Genomic epidemiology of penicillin-non-susceptible Streptococcus pneumoniae. Microb Genomics. 2019 Oct;5(10):e000305. doi:10.1099/mgen.0.000305 PubMed PMID: 31609685; PubMed Central PMCID: PMC6861860. </w:t>
+        </w:r>
+      </w:hyperlink>
+      <w:r>
+        <w:rPr>
+          <w:rtl w:val="0"/>
+        </w:rPr>
+      </w:r>
+    </w:p>
+    <w:p>
+      <w:pPr>
+        <w:keepNext w:val="0"/>
+        <w:keepLines w:val="0"/>
+        <w:pageBreakBefore w:val="0"/>
+        <w:widowControl w:val="0"/>
+        <w:pBdr>
+          <w:top w:space="0" w:sz="0" w:val="nil"/>
+          <w:left w:space="0" w:sz="0" w:val="nil"/>
+          <w:bottom w:space="0" w:sz="0" w:val="nil"/>
+          <w:right w:space="0" w:sz="0" w:val="nil"/>
+          <w:between w:space="0" w:sz="0" w:val="nil"/>
+        </w:pBdr>
+        <w:shd w:fill="auto" w:val="clear"/>
+        <w:spacing w:after="240" w:before="0" w:line="240" w:lineRule="auto"/>
+        <w:ind w:left="384.00000000000006" w:right="0" w:hanging="384.00000000000006"/>
+        <w:jc w:val="left"/>
+        <w:rPr/>
+      </w:pPr>
+      <w:hyperlink r:id="rId90">
+        <w:r>
+          <w:rPr>
+            <w:rtl w:val="0"/>
+          </w:rPr>
+          <w:t xml:space="preserve">4.</w:t>
+        </w:r>
+      </w:hyperlink>
+      <w:r>
+        <w:rPr>
+          <w:rtl w:val="0"/>
+        </w:rPr>
+        <w:tab/>
+      </w:r>
+      <w:hyperlink r:id="rId91">
+        <w:r>
+          <w:rPr>
+            <w:rtl w:val="0"/>
+          </w:rPr>
+          <w:t xml:space="preserve">Schuchat A, Hilger T, Zell E, Farley MM, Reingold A, Harrison L, et al. Active bacterial core surveillance of the emerging infections program network. Emerg Infect Dis. 2001 Jan;7(1):92–9. doi:10.3201/eid0701.010114 PubMed PMID: 11266299; PubMed Central PMCID: PMC2631675. </w:t>
+        </w:r>
+      </w:hyperlink>
       <w:r>
         <w:rPr>
           <w:rtl w:val="0"/>
@@ -19643,7 +19692,7 @@
           <w:rPr>
             <w:rtl w:val="0"/>
           </w:rPr>
-          <w:t xml:space="preserve">1.</w:t>
+          <w:t xml:space="preserve">5.</w:t>
         </w:r>
       </w:hyperlink>
       <w:r>
@@ -19657,7 +19706,7 @@
           <w:rPr>
             <w:rtl w:val="0"/>
           </w:rPr>
-          <w:t xml:space="preserve">Beall B, Chochua S, Gertz RE, Li Y, Li Z, McGee L, et al. A Population-Based Descriptive Atlas of Invasive Pneumococcal Strains Recovered Within the U.S. During 2015–2016. Front Microbiol. 2018 Nov 19;9. doi:10.3389/fmicb.2018.02670 </w:t>
+          <w:t xml:space="preserve">Croucher NJ, Harris SR, Fraser C, Quail MA, Burton J, van der Linden M, et al. Rapid pneumococcal evolution in response to clinical interventions. Science. 2011 Jan 28;331(6016):430–4. doi:10.1126/science.1198545 PubMed PMID: 21273480; PubMed Central PMCID: PMC3648787. </w:t>
         </w:r>
       </w:hyperlink>
       <w:r>
@@ -19690,7 +19739,7 @@
           <w:rPr>
             <w:rtl w:val="0"/>
           </w:rPr>
-          <w:t xml:space="preserve">2.</w:t>
+          <w:t xml:space="preserve">6.</w:t>
         </w:r>
       </w:hyperlink>
       <w:r>
@@ -19704,7 +19753,7 @@
           <w:rPr>
             <w:rtl w:val="0"/>
           </w:rPr>
-          <w:t xml:space="preserve">McCormick AW, Whitney CG, Farley MM, Lynfield R, Harrison LH, Bennett NM, et al. Geographic diversity and temporal trends of antimicrobial resistance in Streptococcus pneumoniae in the United States. Nat Med. 2003 Apr;9(4):424–30. doi:10.1038/nm839 </w:t>
+          <w:t xml:space="preserve">Chewapreecha C, Marttinen P, Croucher NJ, Salter SJ, Harris SR, Mather AE, et al. Comprehensive Identification of Single Nucleotide Polymorphisms Associated with Beta-lactam Resistance within Pneumococcal Mosaic Genes. PLOS Genet. 2014 Aug 7;10(8):e1004547. doi:10.1371/journal.pgen.1004547 </w:t>
         </w:r>
       </w:hyperlink>
       <w:r>
@@ -19737,7 +19786,7 @@
           <w:rPr>
             <w:rtl w:val="0"/>
           </w:rPr>
-          <w:t xml:space="preserve">3.</w:t>
+          <w:t xml:space="preserve">7.</w:t>
         </w:r>
       </w:hyperlink>
       <w:r>
@@ -19751,7 +19800,7 @@
           <w:rPr>
             <w:rtl w:val="0"/>
           </w:rPr>
-          <w:t xml:space="preserve">Dewé TCM, D’Aeth JC, Croucher NJ. Genomic epidemiology of penicillin-non-susceptible Streptococcus pneumoniae. Microb Genomics. 2019 Oct;5(10):e000305. doi:10.1099/mgen.0.000305 PubMed PMID: 31609685; PubMed Central PMCID: PMC6861860. </w:t>
+          <w:t xml:space="preserve">Lehtinen S, Chewapreecha C, Lees J, Hanage WP, Lipsitch M, Croucher NJ, et al. Horizontal gene transfer rate is not the primary determinant of observed antibiotic resistance frequencies in Streptococcus pneumoniae. Sci Adv. 2020 May 20;6(21):eaaz6137. doi:10.1126/sciadv.aaz6137 PubMed PMID: 32671212; PubMed Central PMCID: PMC7314567. </w:t>
         </w:r>
       </w:hyperlink>
       <w:r>
@@ -19784,7 +19833,7 @@
           <w:rPr>
             <w:rtl w:val="0"/>
           </w:rPr>
-          <w:t xml:space="preserve">4.</w:t>
+          <w:t xml:space="preserve">8.</w:t>
         </w:r>
       </w:hyperlink>
       <w:r>
@@ -19798,7 +19847,7 @@
           <w:rPr>
             <w:rtl w:val="0"/>
           </w:rPr>
-          <w:t xml:space="preserve">Schuchat A, Hilger T, Zell E, Farley MM, Reingold A, Harrison L, et al. Active bacterial core surveillance of the emerging infections program network. Emerg Infect Dis. 2001 Jan;7(1):92–9. doi:10.3201/eid0701.010114 PubMed PMID: 11266299; PubMed Central PMCID: PMC2631675. </w:t>
+          <w:t xml:space="preserve">Li Y, Metcalf BJ, Chochua S, Li Z, Gertz RE, Walker H, et al. Penicillin-Binding Protein Transpeptidase Signatures for Tracking and Predicting β-Lactam Resistance Levels in Streptococcus pneumoniae. mBio. 2016 Jun 14;7(3):10.1128/mbio.00756-16. doi:10.1128/mbio.00756-16 </w:t>
         </w:r>
       </w:hyperlink>
       <w:r>
@@ -19831,7 +19880,7 @@
           <w:rPr>
             <w:rtl w:val="0"/>
           </w:rPr>
-          <w:t xml:space="preserve">5.</w:t>
+          <w:t xml:space="preserve">9.</w:t>
         </w:r>
       </w:hyperlink>
       <w:r>
@@ -19845,7 +19894,7 @@
           <w:rPr>
             <w:rtl w:val="0"/>
           </w:rPr>
-          <w:t xml:space="preserve">Croucher NJ, Harris SR, Fraser C, Quail MA, Burton J, van der Linden M, et al. Rapid pneumococcal evolution in response to clinical interventions. Science. 2011 Jan 28;331(6016):430–4. doi:10.1126/science.1198545 PubMed PMID: 21273480; PubMed Central PMCID: PMC3648787. </w:t>
+          <w:t xml:space="preserve">D’Aeth JC, van der Linden MP, McGee L, de Lencastre H, Turner P, Song JH, et al. The role of interspecies recombination in the evolution of antibiotic-resistant pneumococci. eLife. 2021 Jul 14;10:e67113. doi:10.7554/eLife.67113 PubMed PMID: 34259624; PubMed Central PMCID: PMC8321556. </w:t>
         </w:r>
       </w:hyperlink>
       <w:r>
@@ -19878,7 +19927,7 @@
           <w:rPr>
             <w:rtl w:val="0"/>
           </w:rPr>
-          <w:t xml:space="preserve">6.</w:t>
+          <w:t xml:space="preserve">10.</w:t>
         </w:r>
       </w:hyperlink>
       <w:r>
@@ -19892,7 +19941,7 @@
           <w:rPr>
             <w:rtl w:val="0"/>
           </w:rPr>
-          <w:t xml:space="preserve">Chewapreecha C, Marttinen P, Croucher NJ, Salter SJ, Harris SR, Mather AE, et al. Comprehensive Identification of Single Nucleotide Polymorphisms Associated with Beta-lactam Resistance within Pneumococcal Mosaic Genes. PLOS Genet. 2014 Aug 7;10(8):e1004547. doi:10.1371/journal.pgen.1004547 </w:t>
+          <w:t xml:space="preserve">Gladstone RA, Lo SW, Lees JA, Croucher NJ, van Tonder AJ, Corander J, et al. International genomic definition of pneumococcal lineages, to contextualise disease, antibiotic resistance and vaccine impact. EBioMedicine. 2019 Apr 16;43:338–46. doi:10.1016/j.ebiom.2019.04.021 PubMed PMID: 31003929; PubMed Central PMCID: PMC6557916. </w:t>
         </w:r>
       </w:hyperlink>
       <w:r>
@@ -19925,7 +19974,7 @@
           <w:rPr>
             <w:rtl w:val="0"/>
           </w:rPr>
-          <w:t xml:space="preserve">7.</w:t>
+          <w:t xml:space="preserve">11.</w:t>
         </w:r>
       </w:hyperlink>
       <w:r>
@@ -19939,7 +19988,7 @@
           <w:rPr>
             <w:rtl w:val="0"/>
           </w:rPr>
-          <w:t xml:space="preserve">Lehtinen S, Chewapreecha C, Lees J, Hanage WP, Lipsitch M, Croucher NJ, et al. Horizontal gene transfer rate is not the primary determinant of observed antibiotic resistance frequencies in Streptococcus pneumoniae. Sci Adv. 2020 May 20;6(21):eaaz6137. doi:10.1126/sciadv.aaz6137 PubMed PMID: 32671212; PubMed Central PMCID: PMC7314567. </w:t>
+          <w:t xml:space="preserve">Link-Gelles R, Thomas A, Lynfield R, Petit S, Schaffner W, Harrison L, et al. Geographic and temporal trends in antimicrobial nonsusceptibility in Streptococcus pneumoniae in the post-vaccine era in the United States. J Infect Dis. 2013 Oct 15;208(8):1266–73. doi:10.1093/infdis/jit315 PubMed PMID: 23852588; PubMed Central PMCID: PMC3778966. </w:t>
         </w:r>
       </w:hyperlink>
       <w:r>
@@ -19972,7 +20021,7 @@
           <w:rPr>
             <w:rtl w:val="0"/>
           </w:rPr>
-          <w:t xml:space="preserve">8.</w:t>
+          <w:t xml:space="preserve">12.</w:t>
         </w:r>
       </w:hyperlink>
       <w:r>
@@ -19986,7 +20035,7 @@
           <w:rPr>
             <w:rtl w:val="0"/>
           </w:rPr>
-          <w:t xml:space="preserve">Li Y, Metcalf BJ, Chochua S, Li Z, Gertz RE, Walker H, et al. Penicillin-Binding Protein Transpeptidase Signatures for Tracking and Predicting β-Lactam Resistance Levels in Streptococcus pneumoniae. mBio. 2016 Jun 14;7(3):10.1128/mbio.00756-16. doi:10.1128/mbio.00756-16 </w:t>
+          <w:t xml:space="preserve">Colijn C, Cohen T, Fraser C, Hanage W, Goldstein E, Givon-Lavi N, et al. What is the mechanism for persistent coexistence of drug-susceptible and drug-resistant strains of Streptococcus pneumoniae? J R Soc Interface. 2009 Nov 25;7(47):905–19. doi:10.1098/rsif.2009.0400 </w:t>
         </w:r>
       </w:hyperlink>
       <w:r>
@@ -20019,7 +20068,7 @@
           <w:rPr>
             <w:rtl w:val="0"/>
           </w:rPr>
-          <w:t xml:space="preserve">9.</w:t>
+          <w:t xml:space="preserve">13.</w:t>
         </w:r>
       </w:hyperlink>
       <w:r>
@@ -20033,7 +20082,7 @@
           <w:rPr>
             <w:rtl w:val="0"/>
           </w:rPr>
-          <w:t xml:space="preserve">D’Aeth JC, van der Linden MP, McGee L, de Lencastre H, Turner P, Song JH, et al. The role of interspecies recombination in the evolution of antibiotic-resistant pneumococci. eLife. 2021 Jul 14;10:e67113. doi:10.7554/eLife.67113 PubMed PMID: 34259624; PubMed Central PMCID: PMC8321556. </w:t>
+          <w:t xml:space="preserve">Chang HH, Cohen T, Grad YH, Hanage WP, O’Brien TF, Lipsitch M. Origin and proliferation of multiple-drug resistance in bacterial pathogens. Microbiol Mol Biol Rev. 2015 Mar;79(1):101–16. doi:10.1128/MMBR.00039-14 PubMed PMID: 25652543; PubMed Central PMCID: PMC4402963. </w:t>
         </w:r>
       </w:hyperlink>
       <w:r>
@@ -20066,7 +20115,7 @@
           <w:rPr>
             <w:rtl w:val="0"/>
           </w:rPr>
-          <w:t xml:space="preserve">10.</w:t>
+          <w:t xml:space="preserve">14.</w:t>
         </w:r>
       </w:hyperlink>
       <w:r>
@@ -20080,7 +20129,7 @@
           <w:rPr>
             <w:rtl w:val="0"/>
           </w:rPr>
-          <w:t xml:space="preserve">Gladstone RA, Lo SW, Lees JA, Croucher NJ, van Tonder AJ, Corander J, et al. International genomic definition of pneumococcal lineages, to contextualise disease, antibiotic resistance and vaccine impact. EBioMedicine. 2019 Apr 16;43:338–46. doi:10.1016/j.ebiom.2019.04.021 PubMed PMID: 31003929; PubMed Central PMCID: PMC6557916. </w:t>
+          <w:t xml:space="preserve">Opatowski L, Mandel J, Varon E, Boëlle PY, Temime L, Guillemot D. Antibiotic dose impact on resistance selection in the community: a mathematical model of beta-lactams and Streptococcus pneumoniae dynamics. Antimicrob Agents Chemother. 2010 Jun;54(6):2330–7. doi:10.1128/AAC.00331-09 PubMed PMID: 20231396; PubMed Central PMCID: PMC2876390. </w:t>
         </w:r>
       </w:hyperlink>
       <w:r>
@@ -20113,7 +20162,7 @@
           <w:rPr>
             <w:rtl w:val="0"/>
           </w:rPr>
-          <w:t xml:space="preserve">11.</w:t>
+          <w:t xml:space="preserve">15.</w:t>
         </w:r>
       </w:hyperlink>
       <w:r>
@@ -20127,7 +20176,7 @@
           <w:rPr>
             <w:rtl w:val="0"/>
           </w:rPr>
-          <w:t xml:space="preserve">Link-Gelles R, Thomas A, Lynfield R, Petit S, Schaffner W, Harrison L, et al. Geographic and temporal trends in antimicrobial nonsusceptibility in Streptococcus pneumoniae in the post-vaccine era in the United States. J Infect Dis. 2013 Oct 15;208(8):1266–73. doi:10.1093/infdis/jit315 PubMed PMID: 23852588; PubMed Central PMCID: PMC3778966. </w:t>
+          <w:t xml:space="preserve">Jorgensen JH, Ferraro MJ. Antimicrobial susceptibility testing: a review of general principles and contemporary practices. Clin Infect Dis. 2009 Dec 1;49(11):1749–55. doi:10.1086/647952 PubMed PMID: 19857164. </w:t>
         </w:r>
       </w:hyperlink>
       <w:r>
@@ -20160,7 +20209,7 @@
           <w:rPr>
             <w:rtl w:val="0"/>
           </w:rPr>
-          <w:t xml:space="preserve">12.</w:t>
+          <w:t xml:space="preserve">16.</w:t>
         </w:r>
       </w:hyperlink>
       <w:r>
@@ -20174,7 +20223,7 @@
           <w:rPr>
             <w:rtl w:val="0"/>
           </w:rPr>
-          <w:t xml:space="preserve">Colijn C, Cohen T, Fraser C, Hanage W, Goldstein E, Givon-Lavi N, et al. What is the mechanism for persistent coexistence of drug-susceptible and drug-resistant strains of Streptococcus pneumoniae? J R Soc Interface. 2009 Nov 25;7(47):905–19. doi:10.1098/rsif.2009.0400 </w:t>
+          <w:t xml:space="preserve">Michael A, Kelman T, Pitesky M. Overview of Quantitative Methodologies to Understand Antimicrobial Resistance via Minimum Inhibitory Concentration. Anim Basel. 2020 Aug 12;10(8):1405. doi:10.3390/ani10081405 PubMed PMID: 32806615; PubMed Central PMCID: PMC7459578. </w:t>
         </w:r>
       </w:hyperlink>
       <w:r>
@@ -20207,7 +20256,7 @@
           <w:rPr>
             <w:rtl w:val="0"/>
           </w:rPr>
-          <w:t xml:space="preserve">13.</w:t>
+          <w:t xml:space="preserve">17.</w:t>
         </w:r>
       </w:hyperlink>
       <w:r>
@@ -20221,7 +20270,7 @@
           <w:rPr>
             <w:rtl w:val="0"/>
           </w:rPr>
-          <w:t xml:space="preserve">Chang HH, Cohen T, Grad YH, Hanage WP, O’Brien TF, Lipsitch M. Origin and proliferation of multiple-drug resistance in bacterial pathogens. Microbiol Mol Biol Rev. 2015 Mar;79(1):101–16. doi:10.1128/MMBR.00039-14 PubMed PMID: 25652543; PubMed Central PMCID: PMC4402963. </w:t>
+          <w:t xml:space="preserve">Negri MC, Morosini MI, Baquero MR, Campo R del, Blázquez J, Baquero F. Very Low Cefotaxime Concentrations Select for Hypermutable Streptococcus pneumoniae Populations. Antimicrob Agents Chemother. 2002 Feb;46(2):528–30. doi:10.1128/AAC.46.2.528-530.2002 PubMed PMID: 11796370; PubMed Central PMCID: PMC127056. </w:t>
         </w:r>
       </w:hyperlink>
       <w:r>
@@ -20254,7 +20303,7 @@
           <w:rPr>
             <w:rtl w:val="0"/>
           </w:rPr>
-          <w:t xml:space="preserve">14.</w:t>
+          <w:t xml:space="preserve">18.</w:t>
         </w:r>
       </w:hyperlink>
       <w:r>
@@ -20268,7 +20317,7 @@
           <w:rPr>
             <w:rtl w:val="0"/>
           </w:rPr>
-          <w:t xml:space="preserve">Opatowski L, Mandel J, Varon E, Boëlle PY, Temime L, Guillemot D. Antibiotic dose impact on resistance selection in the community: a mathematical model of beta-lactams and Streptococcus pneumoniae dynamics. Antimicrob Agents Chemother. 2010 Jun;54(6):2330–7. doi:10.1128/AAC.00331-09 PubMed PMID: 20231396; PubMed Central PMCID: PMC2876390. </w:t>
+          <w:t xml:space="preserve">Weinstein MP, Klugman KP, Jones RN. Rationale for revised penicillin susceptibility breakpoints versus Streptococcus pneumoniae: coping with antimicrobial susceptibility in an era of resistance. Clin Infect Dis Off Publ Infect Dis Soc Am. 2009 Jun 1;48(11):1596–600. doi:10.1086/598975 PubMed PMID: 19400744. </w:t>
         </w:r>
       </w:hyperlink>
       <w:r>
@@ -20301,7 +20350,7 @@
           <w:rPr>
             <w:rtl w:val="0"/>
           </w:rPr>
-          <w:t xml:space="preserve">15.</w:t>
+          <w:t xml:space="preserve">19.</w:t>
         </w:r>
       </w:hyperlink>
       <w:r>
@@ -20315,7 +20364,7 @@
           <w:rPr>
             <w:rtl w:val="0"/>
           </w:rPr>
-          <w:t xml:space="preserve">Jorgensen JH, Ferraro MJ. Antimicrobial susceptibility testing: a review of general principles and contemporary practices. Clin Infect Dis. 2009 Dec 1;49(11):1749–55. doi:10.1086/647952 PubMed PMID: 19857164. </w:t>
+          <w:t xml:space="preserve">Gullberg E, Cao S, Berg OG, Ilbäck C, Sandegren L, Hughes D, et al. Selection of resistant bacteria at very low antibiotic concentrations. PLoS Pathog. 2011 Jul;7(7):e1002158. doi:10.1371/journal.ppat.1002158 PubMed PMID: 21811410; PubMed Central PMCID: PMC3141051. </w:t>
         </w:r>
       </w:hyperlink>
       <w:r>
@@ -20348,7 +20397,7 @@
           <w:rPr>
             <w:rtl w:val="0"/>
           </w:rPr>
-          <w:t xml:space="preserve">16.</w:t>
+          <w:t xml:space="preserve">20.</w:t>
         </w:r>
       </w:hyperlink>
       <w:r>
@@ -20362,7 +20411,7 @@
           <w:rPr>
             <w:rtl w:val="0"/>
           </w:rPr>
-          <w:t xml:space="preserve">Michael A, Kelman T, Pitesky M. Overview of Quantitative Methodologies to Understand Antimicrobial Resistance via Minimum Inhibitory Concentration. Anim Basel. 2020 Aug 12;10(8):1405. doi:10.3390/ani10081405 PubMed PMID: 32806615; PubMed Central PMCID: PMC7459578. </w:t>
+          <w:t xml:space="preserve">Andersson DI, Hughes D. Microbiological effects of sublethal levels of antibiotics. Nat Rev Microbiol. 2014 Jul;12(7):465–78. doi:10.1038/nrmicro3270 PubMed PMID: 24861036. </w:t>
         </w:r>
       </w:hyperlink>
       <w:r>
@@ -20395,7 +20444,7 @@
           <w:rPr>
             <w:rtl w:val="0"/>
           </w:rPr>
-          <w:t xml:space="preserve">17.</w:t>
+          <w:t xml:space="preserve">21.</w:t>
         </w:r>
       </w:hyperlink>
       <w:r>
@@ -20409,7 +20458,7 @@
           <w:rPr>
             <w:rtl w:val="0"/>
           </w:rPr>
-          <w:t xml:space="preserve">Negri MC, Morosini MI, Baquero MR, Campo R del, Blázquez J, Baquero F. Very Low Cefotaxime Concentrations Select for Hypermutable Streptococcus pneumoniae Populations. Antimicrob Agents Chemother. 2002 Feb;46(2):528–30. doi:10.1128/AAC.46.2.528-530.2002 PubMed PMID: 11796370; PubMed Central PMCID: PMC127056. </w:t>
+          <w:t xml:space="preserve">Baquero F, Negri MC, Morosini MI, Blázquez J. Antibiotic-selective environments. Clin Infect Dis Off Publ Infect Dis Soc Am. 1998 Aug;27 Suppl 1:S5-11. doi:10.1086/514916 PubMed PMID: 9710666. </w:t>
         </w:r>
       </w:hyperlink>
       <w:r>
@@ -20442,7 +20491,7 @@
           <w:rPr>
             <w:rtl w:val="0"/>
           </w:rPr>
-          <w:t xml:space="preserve">18.</w:t>
+          <w:t xml:space="preserve">22.</w:t>
         </w:r>
       </w:hyperlink>
       <w:r>
@@ -20456,7 +20505,7 @@
           <w:rPr>
             <w:rtl w:val="0"/>
           </w:rPr>
-          <w:t xml:space="preserve">Weinstein MP, Klugman KP, Jones RN. Rationale for revised penicillin susceptibility breakpoints versus Streptococcus pneumoniae: coping with antimicrobial susceptibility in an era of resistance. Clin Infect Dis Off Publ Infect Dis Soc Am. 2009 Jun 1;48(11):1596–600. doi:10.1086/598975 PubMed PMID: 19400744. </w:t>
+          <w:t xml:space="preserve">Hakenbeck R, Brückner R, Denapaite D, Maurer P. Molecular mechanisms of β-lactam resistance in Streptococcus pneumoniae. Future Microbiol. 2012 Mar;7(3):395–410. doi:10.2217/fmb.12.2 PubMed PMID: 22393892. </w:t>
         </w:r>
       </w:hyperlink>
       <w:r>
@@ -20489,7 +20538,7 @@
           <w:rPr>
             <w:rtl w:val="0"/>
           </w:rPr>
-          <w:t xml:space="preserve">19.</w:t>
+          <w:t xml:space="preserve">23.</w:t>
         </w:r>
       </w:hyperlink>
       <w:r>
@@ -20503,7 +20552,7 @@
           <w:rPr>
             <w:rtl w:val="0"/>
           </w:rPr>
-          <w:t xml:space="preserve">Gullberg E, Cao S, Berg OG, Ilbäck C, Sandegren L, Hughes D, et al. Selection of resistant bacteria at very low antibiotic concentrations. PLoS Pathog. 2011 Jul;7(7):e1002158. doi:10.1371/journal.ppat.1002158 PubMed PMID: 21811410; PubMed Central PMCID: PMC3141051. </w:t>
+          <w:t xml:space="preserve">Coffey TJ, Daniels M, McDougal LK, Dowson CG, Tenover FC, Spratt BG. Genetic analysis of clinical isolates of Streptococcus pneumoniae with high-level resistance to expanded-spectrum cephalosporins. Antimicrob Agents Chemother. 1995 Jun;39(6):1306–13. doi:10.1128/AAC.39.6.1306 PubMed PMID: 7574521; PubMed Central PMCID: PMC162732. </w:t>
         </w:r>
       </w:hyperlink>
       <w:r>
@@ -20536,7 +20585,7 @@
           <w:rPr>
             <w:rtl w:val="0"/>
           </w:rPr>
-          <w:t xml:space="preserve">20.</w:t>
+          <w:t xml:space="preserve">24.</w:t>
         </w:r>
       </w:hyperlink>
       <w:r>
@@ -20550,7 +20599,7 @@
           <w:rPr>
             <w:rtl w:val="0"/>
           </w:rPr>
-          <w:t xml:space="preserve">Andersson DI, Hughes D. Microbiological effects of sublethal levels of antibiotics. Nat Rev Microbiol. 2014 Jul;12(7):465–78. doi:10.1038/nrmicro3270 PubMed PMID: 24861036. </w:t>
+          <w:t xml:space="preserve">Kocaoglu O, Tsui HCT, Winkler ME, Carlson EE. Profiling of β-lactam selectivity for penicillin-binding proteins in Streptococcus pneumoniae D39. Antimicrob Agents Chemother. 2015;59(6):3548–55. doi:10.1128/AAC.05142-14 PubMed PMID: 25845878; PubMed Central PMCID: PMC4432181. </w:t>
         </w:r>
       </w:hyperlink>
       <w:r>
@@ -20583,7 +20632,7 @@
           <w:rPr>
             <w:rtl w:val="0"/>
           </w:rPr>
-          <w:t xml:space="preserve">21.</w:t>
+          <w:t xml:space="preserve">25.</w:t>
         </w:r>
       </w:hyperlink>
       <w:r>
@@ -20597,7 +20646,7 @@
           <w:rPr>
             <w:rtl w:val="0"/>
           </w:rPr>
-          <w:t xml:space="preserve">Baquero F, Negri MC, Morosini MI, Blázquez J. Antibiotic-selective environments. Clin Infect Dis Off Publ Infect Dis Soc Am. 1998 Aug;27 Suppl 1:S5-11. doi:10.1086/514916 PubMed PMID: 9710666. </w:t>
+          <w:t xml:space="preserve">Pouwels KB, Freeman R, Muller-Pebody B, Rooney G, Henderson KL, Robotham JV, et al. Association between use of different antibiotics and trimethoprim resistance: going beyond the obvious crude association. J Antimicrob Chemother. 2018 Jun 1;73(6):1700–7. doi:10.1093/jac/dky031 PubMed PMID: 29394363. </w:t>
         </w:r>
       </w:hyperlink>
       <w:r>
@@ -20630,7 +20679,7 @@
           <w:rPr>
             <w:rtl w:val="0"/>
           </w:rPr>
-          <w:t xml:space="preserve">22.</w:t>
+          <w:t xml:space="preserve">26.</w:t>
         </w:r>
       </w:hyperlink>
       <w:r>
@@ -20644,7 +20693,7 @@
           <w:rPr>
             <w:rtl w:val="0"/>
           </w:rPr>
-          <w:t xml:space="preserve">Hakenbeck R, Brückner R, Denapaite D, Maurer P. Molecular mechanisms of β-lactam resistance in Streptococcus pneumoniae. Future Microbiol. 2012 Mar;7(3):395–410. doi:10.2217/fmb.12.2 PubMed PMID: 22393892. </w:t>
+          <w:t xml:space="preserve">Pouwels KB, Muller-Pebody B, Smieszek T, Hopkins S, Robotham JV. Selection and co-selection of antibiotic resistances among Escherichia coli by antibiotic use in primary care: An ecological analysis. PLoS One. 2019;14(6):e0218134. doi:10.1371/journal.pone.0218134 PubMed PMID: 31181106; PubMed Central PMCID: PMC6557515. </w:t>
         </w:r>
       </w:hyperlink>
       <w:r>
@@ -20677,7 +20726,7 @@
           <w:rPr>
             <w:rtl w:val="0"/>
           </w:rPr>
-          <w:t xml:space="preserve">23.</w:t>
+          <w:t xml:space="preserve">27.</w:t>
         </w:r>
       </w:hyperlink>
       <w:r>
@@ -20691,7 +20740,7 @@
           <w:rPr>
             <w:rtl w:val="0"/>
           </w:rPr>
-          <w:t xml:space="preserve">Coffey TJ, Daniels M, McDougal LK, Dowson CG, Tenover FC, Spratt BG. Genetic analysis of clinical isolates of Streptococcus pneumoniae with high-level resistance to expanded-spectrum cephalosporins. Antimicrob Agents Chemother. 1995 Jun;39(6):1306–13. doi:10.1128/AAC.39.6.1306 PubMed PMID: 7574521; PubMed Central PMCID: PMC162732. </w:t>
+          <w:t xml:space="preserve">Seale AC, Hutchison C, Fernandes S, Stoesser N, Kelly H, Lowe B, et al. Supporting surveillance capacity for antimicrobial resistance: Laboratory capacity strengthening for drug resistant infections in low and middle income countries. Wellcome Open Res. 2017;2:91. doi:10.12688/wellcomeopenres.12523.1 PubMed PMID: 29181453; PubMed Central PMCID: PMC5686477. </w:t>
         </w:r>
       </w:hyperlink>
       <w:r>
@@ -20724,7 +20773,7 @@
           <w:rPr>
             <w:rtl w:val="0"/>
           </w:rPr>
-          <w:t xml:space="preserve">24.</w:t>
+          <w:t xml:space="preserve">28.</w:t>
         </w:r>
       </w:hyperlink>
       <w:r>
@@ -20738,7 +20787,7 @@
           <w:rPr>
             <w:rtl w:val="0"/>
           </w:rPr>
-          <w:t xml:space="preserve">Kocaoglu O, Tsui HCT, Winkler ME, Carlson EE. Profiling of β-lactam selectivity for penicillin-binding proteins in Streptococcus pneumoniae D39. Antimicrob Agents Chemother. 2015;59(6):3548–55. doi:10.1128/AAC.05142-14 PubMed PMID: 25845878; PubMed Central PMCID: PMC4432181. </w:t>
+          <w:t xml:space="preserve">Iskandar K, Molinier L, Hallit S, Sartelli M, Hardcastle TC, Haque M, et al. Surveillance of antimicrobial resistance in low- and middle-income countries: a scattered picture. Antimicrob Resist Infect Control. 2021 Mar 31;10(1):63. doi:10.1186/s13756-021-00931-w PubMed PMID: 33789754; PubMed Central PMCID: PMC8011122. </w:t>
         </w:r>
       </w:hyperlink>
       <w:r>
@@ -20771,7 +20820,7 @@
           <w:rPr>
             <w:rtl w:val="0"/>
           </w:rPr>
-          <w:t xml:space="preserve">25.</w:t>
+          <w:t xml:space="preserve">29.</w:t>
         </w:r>
       </w:hyperlink>
       <w:r>
@@ -20785,7 +20834,7 @@
           <w:rPr>
             <w:rtl w:val="0"/>
           </w:rPr>
-          <w:t xml:space="preserve">Pouwels KB, Freeman R, Muller-Pebody B, Rooney G, Henderson KL, Robotham JV, et al. Association between use of different antibiotics and trimethoprim resistance: going beyond the obvious crude association. J Antimicrob Chemother. 2018 Jun 1;73(6):1700–7. doi:10.1093/jac/dky031 PubMed PMID: 29394363. </w:t>
+          <w:t xml:space="preserve">Argimón S, Masim MAL, Gayeta JM, Lagrada ML, Macaranas PKV, Cohen V, et al. Integrating whole-genome sequencing within the National Antimicrobial Resistance Surveillance Program in the Philippines. Nat Commun. 2020 Jun 1;11(1):2719. doi:10.1038/s41467-020-16322-5 PubMed PMID: 32483195; PubMed Central PMCID: PMC7264328. </w:t>
         </w:r>
       </w:hyperlink>
       <w:r>
@@ -20818,7 +20867,7 @@
           <w:rPr>
             <w:rtl w:val="0"/>
           </w:rPr>
-          <w:t xml:space="preserve">26.</w:t>
+          <w:t xml:space="preserve">30.</w:t>
         </w:r>
       </w:hyperlink>
       <w:r>
@@ -20832,7 +20881,7 @@
           <w:rPr>
             <w:rtl w:val="0"/>
           </w:rPr>
-          <w:t xml:space="preserve">Pouwels KB, Muller-Pebody B, Smieszek T, Hopkins S, Robotham JV. Selection and co-selection of antibiotic resistances among Escherichia coli by antibiotic use in primary care: An ecological analysis. PLoS One. 2019;14(6):e0218134. doi:10.1371/journal.pone.0218134 PubMed PMID: 31181106; PubMed Central PMCID: PMC6557515. </w:t>
+          <w:t xml:space="preserve">Lees JA, Mai TT, Galardini M, Wheeler NE, Horsfield ST, Parkhill J, et al. Improved Prediction of Bacterial Genotype-Phenotype Associations Using Interpretable Pangenome-Spanning Regressions. mBio. 2020 Jul 7;11(4):e01344-20. doi:10.1128/mBio.01344-20 PubMed PMID: 32636251; PubMed Central PMCID: PMC7343994. </w:t>
         </w:r>
       </w:hyperlink>
       <w:r>
@@ -20865,7 +20914,7 @@
           <w:rPr>
             <w:rtl w:val="0"/>
           </w:rPr>
-          <w:t xml:space="preserve">27.</w:t>
+          <w:t xml:space="preserve">31.</w:t>
         </w:r>
       </w:hyperlink>
       <w:r>
@@ -20879,7 +20928,7 @@
           <w:rPr>
             <w:rtl w:val="0"/>
           </w:rPr>
-          <w:t xml:space="preserve">Seale AC, Hutchison C, Fernandes S, Stoesser N, Kelly H, Lowe B, et al. Supporting surveillance capacity for antimicrobial resistance: Laboratory capacity strengthening for drug resistant infections in low and middle income countries. Wellcome Open Res. 2017;2:91. doi:10.12688/wellcomeopenres.12523.1 PubMed PMID: 29181453; PubMed Central PMCID: PMC5686477. </w:t>
+          <w:t xml:space="preserve">Dhand A, Sakoulas G. Reduced vancomycin susceptibility among clinical Staphylococcus aureus isolates (‘the MIC Creep’): implications for therapy. F1000 Med Rep. 2012 Feb 1;4:4. doi:10.3410/M4-4 PubMed PMID: 22312414; PubMed Central PMCID: PMC3270590. </w:t>
         </w:r>
       </w:hyperlink>
       <w:r>
@@ -20912,7 +20961,7 @@
           <w:rPr>
             <w:rtl w:val="0"/>
           </w:rPr>
-          <w:t xml:space="preserve">28.</w:t>
+          <w:t xml:space="preserve">32.</w:t>
         </w:r>
       </w:hyperlink>
       <w:r>
@@ -20926,7 +20975,7 @@
           <w:rPr>
             <w:rtl w:val="0"/>
           </w:rPr>
-          <w:t xml:space="preserve">Iskandar K, Molinier L, Hallit S, Sartelli M, Hardcastle TC, Haque M, et al. Surveillance of antimicrobial resistance in low- and middle-income countries: a scattered picture. Antimicrob Resist Infect Control. 2021 Mar 31;10(1):63. doi:10.1186/s13756-021-00931-w PubMed PMID: 33789754; PubMed Central PMCID: PMC8011122. </w:t>
+          <w:t xml:space="preserve">Ryu S, Cowling BJ, Wu P, Olesen S, Fraser C, Sun DS, et al. Case-based surveillance of antimicrobial resistance with full susceptibility profiles. JAC Antimicrob Resist. 2019 Dec;1(3):dlz070. doi:10.1093/jacamr/dlz070 PubMed PMID: 32280945; PubMed Central PMCID: PMC7134534. </w:t>
         </w:r>
       </w:hyperlink>
       <w:r>
@@ -20959,7 +21008,7 @@
           <w:rPr>
             <w:rtl w:val="0"/>
           </w:rPr>
-          <w:t xml:space="preserve">29.</w:t>
+          <w:t xml:space="preserve">33.</w:t>
         </w:r>
       </w:hyperlink>
       <w:r>
@@ -20973,7 +21022,7 @@
           <w:rPr>
             <w:rtl w:val="0"/>
           </w:rPr>
-          <w:t xml:space="preserve">Argimón S, Masim MAL, Gayeta JM, Lagrada ML, Macaranas PKV, Cohen V, et al. Integrating whole-genome sequencing within the National Antimicrobial Resistance Surveillance Program in the Philippines. Nat Commun. 2020 Jun 1;11(1):2719. doi:10.1038/s41467-020-16322-5 PubMed PMID: 32483195; PubMed Central PMCID: PMC7264328. </w:t>
+          <w:t xml:space="preserve">CRyPTIC Consortium. Quantitative measurement of antibiotic resistance in Mycobacterium tuberculosis reveals genetic determinants of resistance and susceptibility in a target gene approach. Nat Commun. 2024 Jan 12;15(1):488. doi:10.1038/s41467-023-44325-5 PubMed PMID: 38216576; PubMed Central PMCID: PMC10786857. </w:t>
         </w:r>
       </w:hyperlink>
       <w:r>
@@ -21006,7 +21055,7 @@
           <w:rPr>
             <w:rtl w:val="0"/>
           </w:rPr>
-          <w:t xml:space="preserve">30.</w:t>
+          <w:t xml:space="preserve">34.</w:t>
         </w:r>
       </w:hyperlink>
       <w:r>
@@ -21020,7 +21069,7 @@
           <w:rPr>
             <w:rtl w:val="0"/>
           </w:rPr>
-          <w:t xml:space="preserve">Lees JA, Mai TT, Galardini M, Wheeler NE, Horsfield ST, Parkhill J, et al. Improved Prediction of Bacterial Genotype-Phenotype Associations Using Interpretable Pangenome-Spanning Regressions. mBio. 2020 Jul 7;11(4):e01344-20. doi:10.1128/mBio.01344-20 PubMed PMID: 32636251; PubMed Central PMCID: PMC7343994. </w:t>
+          <w:t xml:space="preserve">Mallawaarachchi S, Tonkin-Hill G, Croucher NJ, Turner P, Speed D, Corander J, et al. Genome-wide association, prediction and heritability in bacteria with application to Streptococcus pneumoniae. NAR Genomics Bioinforma. 2022 Mar;4(1):lqac011. doi:10.1093/nargab/lqac011 PubMed PMID: 35211669; PubMed Central PMCID: PMC8862724. </w:t>
         </w:r>
       </w:hyperlink>
       <w:r>
@@ -21053,7 +21102,7 @@
           <w:rPr>
             <w:rtl w:val="0"/>
           </w:rPr>
-          <w:t xml:space="preserve">31.</w:t>
+          <w:t xml:space="preserve">35.</w:t>
         </w:r>
       </w:hyperlink>
       <w:r>
@@ -21067,7 +21116,7 @@
           <w:rPr>
             <w:rtl w:val="0"/>
           </w:rPr>
-          <w:t xml:space="preserve">Dhand A, Sakoulas G. Reduced vancomycin susceptibility among clinical Staphylococcus aureus isolates (‘the MIC Creep’): implications for therapy. F1000 Med Rep. 2012 Feb 1;4:4. doi:10.3410/M4-4 PubMed PMID: 22312414; PubMed Central PMCID: PMC3270590. </w:t>
+          <w:t xml:space="preserve">Gladstone RA, Lo SW, Goater R, Yeats C, Taylor B, Hadfield J, et al. Visualizing variation within global pneumococcal sequence clusters (GPSCS) and country population snapshots to contextualize pneumococcal isolates. Microb Genomics. 2020 Apr 30;6(5):1–13. doi:10.1099/MGEN.0.000357/ PubMed PMID: 32375991. </w:t>
         </w:r>
       </w:hyperlink>
       <w:r>
@@ -21100,7 +21149,7 @@
           <w:rPr>
             <w:rtl w:val="0"/>
           </w:rPr>
-          <w:t xml:space="preserve">32.</w:t>
+          <w:t xml:space="preserve">36.</w:t>
         </w:r>
       </w:hyperlink>
       <w:r>
@@ -21114,7 +21163,7 @@
           <w:rPr>
             <w:rtl w:val="0"/>
           </w:rPr>
-          <w:t xml:space="preserve">Ryu S, Cowling BJ, Wu P, Olesen S, Fraser C, Sun DS, et al. Case-based surveillance of antimicrobial resistance with full susceptibility profiles. JAC Antimicrob Resist. 2019 Dec;1(3):dlz070. doi:10.1093/jacamr/dlz070 PubMed PMID: 32280945; PubMed Central PMCID: PMC7134534. </w:t>
+          <w:t xml:space="preserve">Hakenbeck R. Discovery of β-lactam-resistant variants in diverse pneumococcal populations. Genome Med. 2014 Sep 25;6(9):72. doi:10.1186/s13073-014-0072-8 PubMed PMID: 25473434. </w:t>
         </w:r>
       </w:hyperlink>
       <w:r>
@@ -21147,7 +21196,7 @@
           <w:rPr>
             <w:rtl w:val="0"/>
           </w:rPr>
-          <w:t xml:space="preserve">33.</w:t>
+          <w:t xml:space="preserve">37.</w:t>
         </w:r>
       </w:hyperlink>
       <w:r>
@@ -21161,7 +21210,7 @@
           <w:rPr>
             <w:rtl w:val="0"/>
           </w:rPr>
-          <w:t xml:space="preserve">CRyPTIC Consortium. Quantitative measurement of antibiotic resistance in Mycobacterium tuberculosis reveals genetic determinants of resistance and susceptibility in a target gene approach. Nat Commun. 2024 Jan 12;15(1):488. doi:10.1038/s41467-023-44325-5 PubMed PMID: 38216576; PubMed Central PMCID: PMC10786857. </w:t>
+          <w:t xml:space="preserve">Dowson CG, Hutchison A, Brannigan JA, George RC, Hansman D, Liñares J, et al. Horizontal transfer of penicillin-binding protein genes in penicillin-resistant clinical isolates of Streptococcus pneumoniae. Proc Natl Acad Sci U S A. 1989 Nov;86(22):8842–6. doi:10.1073/pnas.86.22.8842 PubMed PMID: 2813426; PubMed Central PMCID: PMC298386. </w:t>
         </w:r>
       </w:hyperlink>
       <w:r>
@@ -21194,7 +21243,7 @@
           <w:rPr>
             <w:rtl w:val="0"/>
           </w:rPr>
-          <w:t xml:space="preserve">34.</w:t>
+          <w:t xml:space="preserve">38.</w:t>
         </w:r>
       </w:hyperlink>
       <w:r>
@@ -21208,7 +21257,7 @@
           <w:rPr>
             <w:rtl w:val="0"/>
           </w:rPr>
-          <w:t xml:space="preserve">Mallawaarachchi S, Tonkin-Hill G, Croucher NJ, Turner P, Speed D, Corander J, et al. Genome-wide association, prediction and heritability in bacteria with application to Streptococcus pneumoniae. NAR Genomics Bioinforma. 2022 Mar;4(1):lqac011. doi:10.1093/nargab/lqac011 PubMed PMID: 35211669; PubMed Central PMCID: PMC8862724. </w:t>
+          <w:t xml:space="preserve">Skwark MJ, Croucher NJ, Puranen S, Chewapreecha C, Pesonen M, Xu YY, et al. Interacting networks of resistance, virulence and core machinery genes identified by genome-wide epistasis analysis. PLOS Genet. 2017 Feb 16;13(2):e1006508. doi:10.1371/journal.pgen.1006508 </w:t>
         </w:r>
       </w:hyperlink>
       <w:r>
@@ -21241,7 +21290,7 @@
           <w:rPr>
             <w:rtl w:val="0"/>
           </w:rPr>
-          <w:t xml:space="preserve">35.</w:t>
+          <w:t xml:space="preserve">39.</w:t>
         </w:r>
       </w:hyperlink>
       <w:r>
@@ -21255,7 +21304,7 @@
           <w:rPr>
             <w:rtl w:val="0"/>
           </w:rPr>
-          <w:t xml:space="preserve">Gladstone RA, Lo SW, Goater R, Yeats C, Taylor B, Hadfield J, et al. Visualizing variation within global pneumococcal sequence clusters (GPSCS) and country population snapshots to contextualize pneumococcal isolates. Microb Genomics. 2020 Apr 30;6(5):1–13. doi:10.1099/MGEN.0.000357/ PubMed PMID: 32375991. </w:t>
+          <w:t xml:space="preserve">Pensar J, Puranen S, Arnold B, MacAlasdair N, Kuronen J, Tonkin-Hill G, et al. Genome-wide epistasis and co-selection study using mutual information. Nucleic Acids Res. 2019 Oct 10;47(18):e112. doi:10.1093/nar/gkz656 </w:t>
         </w:r>
       </w:hyperlink>
       <w:r>
@@ -21288,7 +21337,7 @@
           <w:rPr>
             <w:rtl w:val="0"/>
           </w:rPr>
-          <w:t xml:space="preserve">36.</w:t>
+          <w:t xml:space="preserve">40.</w:t>
         </w:r>
       </w:hyperlink>
       <w:r>
@@ -21302,7 +21351,7 @@
           <w:rPr>
             <w:rtl w:val="0"/>
           </w:rPr>
-          <w:t xml:space="preserve">Hakenbeck R. Discovery of β-lactam-resistant variants in diverse pneumococcal populations. Genome Med. 2014 Sep 25;6(9):72. doi:10.1186/s13073-014-0072-8 PubMed PMID: 25473434. </w:t>
+          <w:t xml:space="preserve">Orio AGA, Piñas GE, Cortes PR, Cian MB, Echenique J. Compensatory Evolution of pbp Mutations Restores the Fitness Cost Imposed by β-Lactam Resistance in Streptococcus pneumoniae. PLOS Pathog. 2011 Feb 17;7(2):e1002000. doi:10.1371/journal.ppat.1002000 </w:t>
         </w:r>
       </w:hyperlink>
       <w:r>
@@ -21335,7 +21384,7 @@
           <w:rPr>
             <w:rtl w:val="0"/>
           </w:rPr>
-          <w:t xml:space="preserve">37.</w:t>
+          <w:t xml:space="preserve">41.</w:t>
         </w:r>
       </w:hyperlink>
       <w:r>
@@ -21349,7 +21398,7 @@
           <w:rPr>
             <w:rtl w:val="0"/>
           </w:rPr>
-          <w:t xml:space="preserve">Dowson CG, Hutchison A, Brannigan JA, George RC, Hansman D, Liñares J, et al. Horizontal transfer of penicillin-binding protein genes in penicillin-resistant clinical isolates of Streptococcus pneumoniae. Proc Natl Acad Sci U S A. 1989 Nov;86(22):8842–6. doi:10.1073/pnas.86.22.8842 PubMed PMID: 2813426; PubMed Central PMCID: PMC298386. </w:t>
+          <w:t xml:space="preserve">Mouz N, Di Guilmi AM, Gordon E, Hakenbeck R, Dideberg O, Vernet T. Mutations in the active site of penicillin-binding protein PBP2x from Streptococcus pneumoniae. Role in the specificity for beta-lactam antibiotics. J Biol Chem. 1999 Jul 2;274(27):19175–80. doi:10.1074/jbc.274.27.19175 PubMed PMID: 10383423. </w:t>
         </w:r>
       </w:hyperlink>
       <w:r>
@@ -21382,7 +21431,7 @@
           <w:rPr>
             <w:rtl w:val="0"/>
           </w:rPr>
-          <w:t xml:space="preserve">38.</w:t>
+          <w:t xml:space="preserve">42.</w:t>
         </w:r>
       </w:hyperlink>
       <w:r>
@@ -21396,7 +21445,7 @@
           <w:rPr>
             <w:rtl w:val="0"/>
           </w:rPr>
-          <w:t xml:space="preserve">Skwark MJ, Croucher NJ, Puranen S, Chewapreecha C, Pesonen M, Xu YY, et al. Interacting networks of resistance, virulence and core machinery genes identified by genome-wide epistasis analysis. PLOS Genet. 2017 Feb 16;13(2):e1006508. doi:10.1371/journal.pgen.1006508 </w:t>
+          <w:t xml:space="preserve">Zerfaß I, Hakenbeck R, Denapaite D. An Important Site in PBP2x of Penicillin-Resistant Clinical Isolates of Streptococcus pneumoniae: Mutational Analysis of Thr338. Antimicrob Agents Chemother. 2009 Mar;53(3):1107–15. doi:10.1128/AAC.01107-08 PubMed PMID: 19075056; PubMed Central PMCID: PMC2650557. </w:t>
         </w:r>
       </w:hyperlink>
       <w:r>
@@ -21429,7 +21478,7 @@
           <w:rPr>
             <w:rtl w:val="0"/>
           </w:rPr>
-          <w:t xml:space="preserve">39.</w:t>
+          <w:t xml:space="preserve">43.</w:t>
         </w:r>
       </w:hyperlink>
       <w:r>
@@ -21443,7 +21492,7 @@
           <w:rPr>
             <w:rtl w:val="0"/>
           </w:rPr>
-          <w:t xml:space="preserve">Pensar J, Puranen S, Arnold B, MacAlasdair N, Kuronen J, Tonkin-Hill G, et al. Genome-wide epistasis and co-selection study using mutual information. Nucleic Acids Res. 2019 Oct 10;47(18):e112. doi:10.1093/nar/gkz656 </w:t>
+          <w:t xml:space="preserve">Enright MC, Spratt BG. A multilocus sequence typing scheme for Streptococcus pneumoniae: identification of clones associated with serious invasive disease. Microbiology. 1998 Nov;144 (Pt 11):3049–60. doi:10.1099/00221287-144-11-3049 PubMed PMID: 9846740. </w:t>
         </w:r>
       </w:hyperlink>
       <w:r>
@@ -21476,7 +21525,7 @@
           <w:rPr>
             <w:rtl w:val="0"/>
           </w:rPr>
-          <w:t xml:space="preserve">40.</w:t>
+          <w:t xml:space="preserve">44.</w:t>
         </w:r>
       </w:hyperlink>
       <w:r>
@@ -21490,7 +21539,7 @@
           <w:rPr>
             <w:rtl w:val="0"/>
           </w:rPr>
-          <w:t xml:space="preserve">Orio AGA, Piñas GE, Cortes PR, Cian MB, Echenique J. Compensatory Evolution of pbp Mutations Restores the Fitness Cost Imposed by β-Lactam Resistance in Streptococcus pneumoniae. PLOS Pathog. 2011 Feb 17;7(2):e1002000. doi:10.1371/journal.ppat.1002000 </w:t>
+          <w:t xml:space="preserve">Smith DJ, Lapedes AS, de Jong JC, Bestebroer TM, Rimmelzwaan GF, Osterhaus ADME, et al. Mapping the antigenic and genetic evolution of influenza virus. Science. 2004 Jul 16;305(5682):371–6. doi:10.1126/science.1097211 PubMed PMID: 15218094. </w:t>
         </w:r>
       </w:hyperlink>
       <w:r>
@@ -21523,7 +21572,7 @@
           <w:rPr>
             <w:rtl w:val="0"/>
           </w:rPr>
-          <w:t xml:space="preserve">41.</w:t>
+          <w:t xml:space="preserve">45.</w:t>
         </w:r>
       </w:hyperlink>
       <w:r>
@@ -21537,7 +21586,7 @@
           <w:rPr>
             <w:rtl w:val="0"/>
           </w:rPr>
-          <w:t xml:space="preserve">Mouz N, Di Guilmi AM, Gordon E, Hakenbeck R, Dideberg O, Vernet T. Mutations in the active site of penicillin-binding protein PBP2x from Streptococcus pneumoniae. Role in the specificity for beta-lactam antibiotics. J Biol Chem. 1999 Jul 2;274(27):19175–80. doi:10.1074/jbc.274.27.19175 PubMed PMID: 10383423. </w:t>
+          <w:t xml:space="preserve">Wilks SH, Mühlemann B, Shen X, Türeli S, LeGresley EB, Netzl A, et al. Mapping SARS-CoV-2 antigenic relationships and serological responses. Science. 2023 Oct 6;382(6666):eadj0070. doi:10.1126/science.adj0070 PubMed PMID: 37797027; PubMed Central PMCID: PMC12145880. </w:t>
         </w:r>
       </w:hyperlink>
       <w:r>
@@ -21570,7 +21619,7 @@
           <w:rPr>
             <w:rtl w:val="0"/>
           </w:rPr>
-          <w:t xml:space="preserve">42.</w:t>
+          <w:t xml:space="preserve">46.</w:t>
         </w:r>
       </w:hyperlink>
       <w:r>
@@ -21584,7 +21633,7 @@
           <w:rPr>
             <w:rtl w:val="0"/>
           </w:rPr>
-          <w:t xml:space="preserve">Zerfaß I, Hakenbeck R, Denapaite D. An Important Site in PBP2x of Penicillin-Resistant Clinical Isolates of Streptococcus pneumoniae: Mutational Analysis of Thr338. Antimicrob Agents Chemother. 2009 Mar;53(3):1107–15. doi:10.1128/AAC.01107-08 PubMed PMID: 19075056; PubMed Central PMCID: PMC2650557. </w:t>
+          <w:t xml:space="preserve">Katzelnick LC, Coello Escoto A, Huang AT, Garcia-Carreras B, Chowdhury N, Maljkovic Berry I, et al. Antigenic evolution of dengue viruses over 20 years. Science. 2021 Nov 19;374(6570):999–1004. doi:10.1126/science.abk0058 PubMed PMID: 34793238; PubMed Central PMCID: PMC8693836. </w:t>
         </w:r>
       </w:hyperlink>
       <w:r>
@@ -21617,7 +21666,7 @@
           <w:rPr>
             <w:rtl w:val="0"/>
           </w:rPr>
-          <w:t xml:space="preserve">43.</w:t>
+          <w:t xml:space="preserve">47.</w:t>
         </w:r>
       </w:hyperlink>
       <w:r>
@@ -21631,7 +21680,7 @@
           <w:rPr>
             <w:rtl w:val="0"/>
           </w:rPr>
-          <w:t xml:space="preserve">Enright MC, Spratt BG. A multilocus sequence typing scheme for Streptococcus pneumoniae: identification of clones associated with serious invasive disease. Microbiology. 1998 Nov;144 (Pt 11):3049–60. doi:10.1099/00221287-144-11-3049 PubMed PMID: 9846740. </w:t>
+          <w:t xml:space="preserve">Fonville JM, Wilks SH, James SL, Fox A, Ventresca M, Aban M, et al. Antibody landscapes after influenza virus infection or vaccination. Science. 2014 Nov 21;346(6212):996–1000. doi:10.1126/science.1256427 PubMed PMID: 25414313; PubMed Central PMCID: PMC4246172. </w:t>
         </w:r>
       </w:hyperlink>
       <w:r>
@@ -21664,7 +21713,7 @@
           <w:rPr>
             <w:rtl w:val="0"/>
           </w:rPr>
-          <w:t xml:space="preserve">44.</w:t>
+          <w:t xml:space="preserve">48.</w:t>
         </w:r>
       </w:hyperlink>
       <w:r>
@@ -21678,7 +21727,7 @@
           <w:rPr>
             <w:rtl w:val="0"/>
           </w:rPr>
-          <w:t xml:space="preserve">Smith DJ, Lapedes AS, de Jong JC, Bestebroer TM, Rimmelzwaan GF, Osterhaus ADME, et al. Mapping the antigenic and genetic evolution of influenza virus. Science. 2004 Jul 16;305(5682):371–6. doi:10.1126/science.1097211 PubMed PMID: 15218094. </w:t>
+          <w:t xml:space="preserve">Li Y, Metcalf BJ, Chochua S, Li Z, Gertz RE, Walker H, et al. Validation of β-lactam minimum inhibitory concentration predictions for pneumococcal isolates with newly encountered penicillin binding protein (PBP) sequences. BMC Genomics. 2017 Aug 15;18(1):621. doi:10.1186/s12864-017-4017-7 PubMed PMID: 28810827. </w:t>
         </w:r>
       </w:hyperlink>
       <w:r>
@@ -21711,7 +21760,7 @@
           <w:rPr>
             <w:rtl w:val="0"/>
           </w:rPr>
-          <w:t xml:space="preserve">45.</w:t>
+          <w:t xml:space="preserve">49.</w:t>
         </w:r>
       </w:hyperlink>
       <w:r>
@@ -21725,7 +21774,7 @@
           <w:rPr>
             <w:rtl w:val="0"/>
           </w:rPr>
-          <w:t xml:space="preserve">Wilks SH, Mühlemann B, Shen X, Türeli S, LeGresley EB, Netzl A, et al. Mapping SARS-CoV-2 antigenic relationships and serological responses. Science. 2023 Oct 6;382(6666):eadj0070. doi:10.1126/science.adj0070 PubMed PMID: 37797027; PubMed Central PMCID: PMC12145880. </w:t>
+          <w:t xml:space="preserve">Mair P, Groenen PJF, De Leeuw J. More on Multidimensional Scaling and Unfolding in R: smacof Version 2. J Stat Softw. 2022 May 13;102:1–47. doi:10.18637/jss.v102.i10 </w:t>
         </w:r>
       </w:hyperlink>
       <w:r>
@@ -21758,7 +21807,7 @@
           <w:rPr>
             <w:rtl w:val="0"/>
           </w:rPr>
-          <w:t xml:space="preserve">46.</w:t>
+          <w:t xml:space="preserve">50.</w:t>
         </w:r>
       </w:hyperlink>
       <w:r>
@@ -21772,7 +21821,7 @@
           <w:rPr>
             <w:rtl w:val="0"/>
           </w:rPr>
-          <w:t xml:space="preserve">Katzelnick LC, Coello Escoto A, Huang AT, Garcia-Carreras B, Chowdhury N, Maljkovic Berry I, et al. Antigenic evolution of dengue viruses over 20 years. Science. 2021 Nov 19;374(6570):999–1004. doi:10.1126/science.abk0058 PubMed PMID: 34793238; PubMed Central PMCID: PMC8693836. </w:t>
+          <w:t xml:space="preserve">De Leeuw J, Mair P. Multidimensional Scaling Using Majorization: SMACOF in R. J Stat Softw. 2009 Aug 4;31:1–30. doi:10.18637/jss.v031.i03 </w:t>
         </w:r>
       </w:hyperlink>
       <w:r>
@@ -21805,7 +21854,7 @@
           <w:rPr>
             <w:rtl w:val="0"/>
           </w:rPr>
-          <w:t xml:space="preserve">47.</w:t>
+          <w:t xml:space="preserve">51.</w:t>
         </w:r>
       </w:hyperlink>
       <w:r>
@@ -21819,7 +21868,7 @@
           <w:rPr>
             <w:rtl w:val="0"/>
           </w:rPr>
-          <w:t xml:space="preserve">Fonville JM, Wilks SH, James SL, Fox A, Ventresca M, Aban M, et al. Antibody landscapes after influenza virus infection or vaccination. Science. 2014 Nov 21;346(6212):996–1000. doi:10.1126/science.1256427 PubMed PMID: 25414313; PubMed Central PMCID: PMC4246172. </w:t>
+          <w:t xml:space="preserve">Pattinson DJ. Predicting the Antigenic Evolution of Influenza Viruses with Application to Vaccination Strategy [Internet]. [Cambridge, UK]: University of Cambridge; 2020 [cited 2025 Aug 15]. Available from: https://www.repository.cam.ac.uk/items/0fd9bca6-c64b-47cd-92b4-34302f5e6bd6 </w:t>
         </w:r>
       </w:hyperlink>
       <w:r>
@@ -21852,7 +21901,7 @@
           <w:rPr>
             <w:rtl w:val="0"/>
           </w:rPr>
-          <w:t xml:space="preserve">48.</w:t>
+          <w:t xml:space="preserve">52.</w:t>
         </w:r>
       </w:hyperlink>
       <w:r>
@@ -21866,7 +21915,7 @@
           <w:rPr>
             <w:rtl w:val="0"/>
           </w:rPr>
-          <w:t xml:space="preserve">Li Y, Metcalf BJ, Chochua S, Li Z, Gertz RE, Walker H, et al. Validation of β-lactam minimum inhibitory concentration predictions for pneumococcal isolates with newly encountered penicillin binding protein (PBP) sequences. BMC Genomics. 2017 Aug 15;18(1):621. doi:10.1186/s12864-017-4017-7 PubMed PMID: 28810827. </w:t>
+          <w:t xml:space="preserve">Lippert C, Listgarten J, Liu Y, Kadie CM, Davidson RI, Heckerman D. FaST linear mixed models for genome-wide association studies. Nat Methods. 2011 Oct;8(10):833–5. doi:10.1038/nmeth.1681 </w:t>
         </w:r>
       </w:hyperlink>
       <w:r>
@@ -21899,7 +21948,7 @@
           <w:rPr>
             <w:rtl w:val="0"/>
           </w:rPr>
-          <w:t xml:space="preserve">49.</w:t>
+          <w:t xml:space="preserve">53.</w:t>
         </w:r>
       </w:hyperlink>
       <w:r>
@@ -21913,7 +21962,7 @@
           <w:rPr>
             <w:rtl w:val="0"/>
           </w:rPr>
-          <w:t xml:space="preserve">Mair P, Groenen PJF, De Leeuw J. More on Multidimensional Scaling and Unfolding in R: smacof Version 2. J Stat Softw. 2022 May 13;102:1–47. doi:10.18637/jss.v102.i10 </w:t>
+          <w:t xml:space="preserve">Lippert C, Casale FP, Rakitsch B, Stegle O. LIMIX: genetic analysis of multiple traits [Internet]. bioRxiv; 2014 [cited 2025 Aug 15]. p. 003905. Available from: https://www.biorxiv.org/content/10.1101/003905v1 doi:10.1101/003905 </w:t>
         </w:r>
       </w:hyperlink>
       <w:r>
@@ -21946,7 +21995,7 @@
           <w:rPr>
             <w:rtl w:val="0"/>
           </w:rPr>
-          <w:t xml:space="preserve">50.</w:t>
+          <w:t xml:space="preserve">54.</w:t>
         </w:r>
       </w:hyperlink>
       <w:r>
@@ -21960,7 +22009,7 @@
           <w:rPr>
             <w:rtl w:val="0"/>
           </w:rPr>
-          <w:t xml:space="preserve">De Leeuw J, Mair P. Multidimensional Scaling Using Majorization: SMACOF in R. J Stat Softw. 2009 Aug 4;31:1–30. doi:10.18637/jss.v031.i03 </w:t>
+          <w:t xml:space="preserve">Brennan-Krohn T, Smith KP, Kirby JE. The Poisoned Well: Enhancing the Predictive Value of Antimicrobial Susceptibility Testing in the Era of Multidrug Resistance. J Clin Microbiol. 2017 Aug;55(8):2304–8. doi:10.1128/JCM.00511-17 PubMed PMID: 28468856; PubMed Central PMCID: PMC5527407. </w:t>
         </w:r>
       </w:hyperlink>
       <w:r>
@@ -21993,7 +22042,7 @@
           <w:rPr>
             <w:rtl w:val="0"/>
           </w:rPr>
-          <w:t xml:space="preserve">51.</w:t>
+          <w:t xml:space="preserve">55.</w:t>
         </w:r>
       </w:hyperlink>
       <w:r>
@@ -22007,7 +22056,7 @@
           <w:rPr>
             <w:rtl w:val="0"/>
           </w:rPr>
-          <w:t xml:space="preserve">Pattinson DJ. Predicting the Antigenic Evolution of Influenza Viruses with Application to Vaccination Strategy [Internet]. [Cambridge, UK]: University of Cambridge; 2020 [cited 2025 Aug 15]. Available from: https://www.repository.cam.ac.uk/items/0fd9bca6-c64b-47cd-92b4-34302f5e6bd6 </w:t>
+          <w:t xml:space="preserve">Andrews JM. Determination of minimum inhibitory concentrations. J Antimicrob Chemother. 2001 Jul 1;48(Suppl 1):5–16. doi:10.1093/jac/48.suppl_1.5 </w:t>
         </w:r>
       </w:hyperlink>
       <w:r>
@@ -22040,7 +22089,7 @@
           <w:rPr>
             <w:rtl w:val="0"/>
           </w:rPr>
-          <w:t xml:space="preserve">52.</w:t>
+          <w:t xml:space="preserve">56.</w:t>
         </w:r>
       </w:hyperlink>
       <w:r>
@@ -22054,7 +22103,7 @@
           <w:rPr>
             <w:rtl w:val="0"/>
           </w:rPr>
-          <w:t xml:space="preserve">Lippert C, Listgarten J, Liu Y, Kadie CM, Davidson RI, Heckerman D. FaST linear mixed models for genome-wide association studies. Nat Methods. 2011 Oct;8(10):833–5. doi:10.1038/nmeth.1681 </w:t>
+          <w:t xml:space="preserve">Bedford T, Rambaut A, Pascual M. Canalization of the evolutionary trajectory of the human influenza virus. BMC Biol. 2012 Apr 30;10(1):38. doi:10.1186/1741-7007-10-38 </w:t>
         </w:r>
       </w:hyperlink>
       <w:r>
@@ -22087,7 +22136,7 @@
           <w:rPr>
             <w:rtl w:val="0"/>
           </w:rPr>
-          <w:t xml:space="preserve">53.</w:t>
+          <w:t xml:space="preserve">57.</w:t>
         </w:r>
       </w:hyperlink>
       <w:r>
@@ -22101,7 +22150,7 @@
           <w:rPr>
             <w:rtl w:val="0"/>
           </w:rPr>
-          <w:t xml:space="preserve">Lippert C, Casale FP, Rakitsch B, Stegle O. LIMIX: genetic analysis of multiple traits [Internet]. bioRxiv; 2014 [cited 2025 Aug 15]. p. 003905. Available from: https://www.biorxiv.org/content/10.1101/003905v1 doi:10.1101/003905 </w:t>
+          <w:t xml:space="preserve">Gibson PS, Bexkens E, Zuber S, Cowley LA, Veening JW. The acquisition of clinically relevant amoxicillin resistance in Streptococcus pneumoniae requires ordered horizontal gene transfer of four loci. PLOS Pathog. 2022 Jul 25;18(7):e1010727. doi:10.1371/journal.ppat.1010727 </w:t>
         </w:r>
       </w:hyperlink>
       <w:r>
@@ -22134,7 +22183,7 @@
           <w:rPr>
             <w:rtl w:val="0"/>
           </w:rPr>
-          <w:t xml:space="preserve">54.</w:t>
+          <w:t xml:space="preserve">58.</w:t>
         </w:r>
       </w:hyperlink>
       <w:r>
@@ -22148,7 +22197,7 @@
           <w:rPr>
             <w:rtl w:val="0"/>
           </w:rPr>
-          <w:t xml:space="preserve">Brennan-Krohn T, Smith KP, Kirby JE. The Poisoned Well: Enhancing the Predictive Value of Antimicrobial Susceptibility Testing in the Era of Multidrug Resistance. J Clin Microbiol. 2017 Aug;55(8):2304–8. doi:10.1128/JCM.00511-17 PubMed PMID: 28468856; PubMed Central PMCID: PMC5527407. </w:t>
+          <w:t xml:space="preserve">Batisti Biffignandi G, Chindelevitch L, Corbella M, Feil EJ, Sassera D, Lees JA. Optimising machine learning prediction of minimum inhibitory concentrations in Klebsiella pneumoniae. Microb Genomics. 2024 Mar;10(3):001222. doi:10.1099/mgen.0.001222 PubMed PMID: 38529944; PubMed Central PMCID: PMC10995625. </w:t>
         </w:r>
       </w:hyperlink>
       <w:r>
@@ -22181,7 +22230,7 @@
           <w:rPr>
             <w:rtl w:val="0"/>
           </w:rPr>
-          <w:t xml:space="preserve">55.</w:t>
+          <w:t xml:space="preserve">59.</w:t>
         </w:r>
       </w:hyperlink>
       <w:r>
@@ -22195,7 +22244,7 @@
           <w:rPr>
             <w:rtl w:val="0"/>
           </w:rPr>
-          <w:t xml:space="preserve">Andrews JM. Determination of minimum inhibitory concentrations. J Antimicrob Chemother. 2001 Jul 1;48(Suppl 1):5–16. doi:10.1093/jac/48.suppl_1.5 </w:t>
+          <w:t xml:space="preserve">Schaid DJ, Chen W, Larson NB. From genome-wide associations to candidate causal variants by statistical fine-mapping. Nat Rev Genet. 2018 Aug;19(8):491–504. doi:10.1038/s41576-018-0016-z PubMed PMID: 29844615; PubMed Central PMCID: PMC6050137. </w:t>
         </w:r>
       </w:hyperlink>
       <w:r>
@@ -22228,7 +22277,7 @@
           <w:rPr>
             <w:rtl w:val="0"/>
           </w:rPr>
-          <w:t xml:space="preserve">56.</w:t>
+          <w:t xml:space="preserve">60.</w:t>
         </w:r>
       </w:hyperlink>
       <w:r>
@@ -22242,7 +22291,7 @@
           <w:rPr>
             <w:rtl w:val="0"/>
           </w:rPr>
-          <w:t xml:space="preserve">Bedford T, Rambaut A, Pascual M. Canalization of the evolutionary trajectory of the human influenza virus. BMC Biol. 2012 Apr 30;10(1):38. doi:10.1186/1741-7007-10-38 </w:t>
+          <w:t xml:space="preserve">Lekhuleni C, Ndlangisa K, Gladstone RA, Chochua S, Metcalf BJ, Li Y, et al. Impact of pneumococcal conjugate vaccines on invasive pneumococcal disease-causing lineages among South African children. Nat Commun. 2024 Sep 27;15(1):8401. doi:10.1038/s41467-024-52459-3 </w:t>
         </w:r>
       </w:hyperlink>
       <w:r>
@@ -22275,7 +22324,7 @@
           <w:rPr>
             <w:rtl w:val="0"/>
           </w:rPr>
-          <w:t xml:space="preserve">57.</w:t>
+          <w:t xml:space="preserve">61.</w:t>
         </w:r>
       </w:hyperlink>
       <w:r>
@@ -22289,7 +22338,7 @@
           <w:rPr>
             <w:rtl w:val="0"/>
           </w:rPr>
-          <w:t xml:space="preserve">Gibson PS, Bexkens E, Zuber S, Cowley LA, Veening JW. The acquisition of clinically relevant amoxicillin resistance in Streptococcus pneumoniae requires ordered horizontal gene transfer of four loci. PLOS Pathog. 2022 Jul 25;18(7):e1010727. doi:10.1371/journal.ppat.1010727 </w:t>
+          <w:t xml:space="preserve">Colangeli R, Jedrey H, Kim S, Connell R, Ma S, Chippada Venkata UD, et al. Bacterial Factors That Predict Relapse after Tuberculosis Therapy. N Engl J Med. 2018 Aug 30;379(9):823–33. doi:10.1056/NEJMoa1715849 PubMed PMID: 30157391; PubMed Central PMCID: PMC6317071. </w:t>
         </w:r>
       </w:hyperlink>
       <w:r>
@@ -22322,7 +22371,7 @@
           <w:rPr>
             <w:rtl w:val="0"/>
           </w:rPr>
-          <w:t xml:space="preserve">58.</w:t>
+          <w:t xml:space="preserve">62.</w:t>
         </w:r>
       </w:hyperlink>
       <w:r>
@@ -22336,7 +22385,7 @@
           <w:rPr>
             <w:rtl w:val="0"/>
           </w:rPr>
-          <w:t xml:space="preserve">Batisti Biffignandi G, Chindelevitch L, Corbella M, Feil EJ, Sassera D, Lees JA. Optimising machine learning prediction of minimum inhibitory concentrations in Klebsiella pneumoniae. Microb Genomics. 2024 Mar;10(3):001222. doi:10.1099/mgen.0.001222 PubMed PMID: 38529944; PubMed Central PMCID: PMC10995625. </w:t>
+          <w:t xml:space="preserve">Negri MC, Lipsitch M, Blázquez J, Levin BR, Baquero F. Concentration-dependent selection of small phenotypic differences in TEM beta-lactamase-mediated antibiotic resistance. Antimicrob Agents Chemother. 2000 Sep;44(9):2485–91. doi:10.1128/AAC.44.9.2485-2491.2000 PubMed PMID: 10952599; PubMed Central PMCID: PMC90089. </w:t>
         </w:r>
       </w:hyperlink>
       <w:r>
@@ -22369,7 +22418,7 @@
           <w:rPr>
             <w:rtl w:val="0"/>
           </w:rPr>
-          <w:t xml:space="preserve">59.</w:t>
+          <w:t xml:space="preserve">63.</w:t>
         </w:r>
       </w:hyperlink>
       <w:r>
@@ -22383,7 +22432,7 @@
           <w:rPr>
             <w:rtl w:val="0"/>
           </w:rPr>
-          <w:t xml:space="preserve">Schaid DJ, Chen W, Larson NB. From genome-wide associations to candidate causal variants by statistical fine-mapping. Nat Rev Genet. 2018 Aug;19(8):491–504. doi:10.1038/s41576-018-0016-z PubMed PMID: 29844615; PubMed Central PMCID: PMC6050137. </w:t>
+          <w:t xml:space="preserve">Liakopoulos A, Aulin LBS, Buffoni M, Fragkiskou E, van Hasselt JGC, Rozen DE. Allele-specific collateral and fitness effects determine the dynamics of fluoroquinolone resistance evolution. Proc Natl Acad Sci U S A. 2022 May 3;119(18):e2121768119. doi:10.1073/pnas.2121768119 PubMed PMID: 35476512; PubMed Central PMCID: PMC9170170. </w:t>
         </w:r>
       </w:hyperlink>
       <w:r>
@@ -22416,7 +22465,7 @@
           <w:rPr>
             <w:rtl w:val="0"/>
           </w:rPr>
-          <w:t xml:space="preserve">60.</w:t>
+          <w:t xml:space="preserve">64.</w:t>
         </w:r>
       </w:hyperlink>
       <w:r>
@@ -22430,7 +22479,7 @@
           <w:rPr>
             <w:rtl w:val="0"/>
           </w:rPr>
-          <w:t xml:space="preserve">Lekhuleni C, Ndlangisa K, Gladstone RA, Chochua S, Metcalf BJ, Li Y, et al. Impact of pneumococcal conjugate vaccines on invasive pneumococcal disease-causing lineages among South African children. Nat Commun. 2024 Sep 27;15(1):8401. doi:10.1038/s41467-024-52459-3 </w:t>
+          <w:t xml:space="preserve">Hernando-Amado S, Laborda P, Martínez JL. Tackling antibiotic resistance by inducing transient and robust collateral sensitivity. Nat Commun. 2023 Mar 30;14(1):1723. doi:10.1038/s41467-023-37357-4 </w:t>
         </w:r>
       </w:hyperlink>
       <w:r>
@@ -22463,7 +22512,7 @@
           <w:rPr>
             <w:rtl w:val="0"/>
           </w:rPr>
-          <w:t xml:space="preserve">61.</w:t>
+          <w:t xml:space="preserve">65.</w:t>
         </w:r>
       </w:hyperlink>
       <w:r>
@@ -22477,7 +22526,7 @@
           <w:rPr>
             <w:rtl w:val="0"/>
           </w:rPr>
-          <w:t xml:space="preserve">Colangeli R, Jedrey H, Kim S, Connell R, Ma S, Chippada Venkata UD, et al. Bacterial Factors That Predict Relapse after Tuberculosis Therapy. N Engl J Med. 2018 Aug 30;379(9):823–33. doi:10.1056/NEJMoa1715849 PubMed PMID: 30157391; PubMed Central PMCID: PMC6317071. </w:t>
+          <w:t xml:space="preserve">Lehtinen S, Blanquart F, Croucher NJ, Turner P, Lipsitch M, Fraser C. Evolution of antibiotic resistance is linked to any genetic mechanism affecting bacterial duration of carriage. Proc Natl Acad Sci U S A. 2017 Jan 31;114(5):1075–80. doi:10.1073/pnas.1617849114 PubMed PMID: 28096340; PubMed Central PMCID: PMC5293062. </w:t>
         </w:r>
       </w:hyperlink>
       <w:r>
@@ -22510,7 +22559,7 @@
           <w:rPr>
             <w:rtl w:val="0"/>
           </w:rPr>
-          <w:t xml:space="preserve">62.</w:t>
+          <w:t xml:space="preserve">66.</w:t>
         </w:r>
       </w:hyperlink>
       <w:r>
@@ -22524,7 +22573,7 @@
           <w:rPr>
             <w:rtl w:val="0"/>
           </w:rPr>
-          <w:t xml:space="preserve">Negri MC, Lipsitch M, Blázquez J, Levin BR, Baquero F. Concentration-dependent selection of small phenotypic differences in TEM beta-lactamase-mediated antibiotic resistance. Antimicrob Agents Chemother. 2000 Sep;44(9):2485–91. doi:10.1128/AAC.44.9.2485-2491.2000 PubMed PMID: 10952599; PubMed Central PMCID: PMC90089. </w:t>
+          <w:t xml:space="preserve">Hanage WP, Fraser C, Tang J, Connor TR, Corander J. Hyper-recombination, diversity, and antibiotic resistance in pneumococcus. Science. 2009 Jun 12;324(5933):1454–7. doi:10.1126/science.1171908 PubMed PMID: 19520963. </w:t>
         </w:r>
       </w:hyperlink>
       <w:r>
@@ -22557,7 +22606,7 @@
           <w:rPr>
             <w:rtl w:val="0"/>
           </w:rPr>
-          <w:t xml:space="preserve">63.</w:t>
+          <w:t xml:space="preserve">67.</w:t>
         </w:r>
       </w:hyperlink>
       <w:r>
@@ -22571,7 +22620,7 @@
           <w:rPr>
             <w:rtl w:val="0"/>
           </w:rPr>
-          <w:t xml:space="preserve">Liakopoulos A, Aulin LBS, Buffoni M, Fragkiskou E, van Hasselt JGC, Rozen DE. Allele-specific collateral and fitness effects determine the dynamics of fluoroquinolone resistance evolution. Proc Natl Acad Sci U S A. 2022 May 3;119(18):e2121768119. doi:10.1073/pnas.2121768119 PubMed PMID: 35476512; PubMed Central PMCID: PMC9170170. </w:t>
+          <w:t xml:space="preserve">Dagan R, Klugman KP. Impact of conjugate pneumococcal vaccines on antibiotic resistance. Lancet Infect Dis. 2008 Dec;8(12):785–95. doi:10.1016/S1473-3099(08)70281-0 PubMed PMID: 19022193. </w:t>
         </w:r>
       </w:hyperlink>
       <w:r>
@@ -22604,7 +22653,7 @@
           <w:rPr>
             <w:rtl w:val="0"/>
           </w:rPr>
-          <w:t xml:space="preserve">64.</w:t>
+          <w:t xml:space="preserve">68.</w:t>
         </w:r>
       </w:hyperlink>
       <w:r>
@@ -22618,7 +22667,7 @@
           <w:rPr>
             <w:rtl w:val="0"/>
           </w:rPr>
-          <w:t xml:space="preserve">Hernando-Amado S, Laborda P, Martínez JL. Tackling antibiotic resistance by inducing transient and robust collateral sensitivity. Nat Commun. 2023 Mar 30;14(1):1723. doi:10.1038/s41467-023-37357-4 </w:t>
+          <w:t xml:space="preserve">Kyaw MH, Lynfield R, Schaffner W, Craig AS, Hadler J, Reingold A, et al. Effect of introduction of the pneumococcal conjugate vaccine on drug-resistant Streptococcus pneumoniae. N Engl J Med. 2006 Apr 6;354(14):1455–63. doi:10.1056/NEJMoa051642 PubMed PMID: 16598044. </w:t>
         </w:r>
       </w:hyperlink>
       <w:r>
@@ -22651,7 +22700,7 @@
           <w:rPr>
             <w:rtl w:val="0"/>
           </w:rPr>
-          <w:t xml:space="preserve">65.</w:t>
+          <w:t xml:space="preserve">69.</w:t>
         </w:r>
       </w:hyperlink>
       <w:r>
@@ -22665,7 +22714,7 @@
           <w:rPr>
             <w:rtl w:val="0"/>
           </w:rPr>
-          <w:t xml:space="preserve">Lehtinen S, Blanquart F, Croucher NJ, Turner P, Lipsitch M, Fraser C. Evolution of antibiotic resistance is linked to any genetic mechanism affecting bacterial duration of carriage. Proc Natl Acad Sci U S A. 2017 Jan 31;114(5):1075–80. doi:10.1073/pnas.1617849114 PubMed PMID: 28096340; PubMed Central PMCID: PMC5293062. </w:t>
+          <w:t xml:space="preserve">Wildfire J, Waterlow NR, Clements A, Fuller NM, Knight GM. MIC distribution analysis identifies differences in AMR between population sub-groups. Wellcome Open Res. 2024;9:244. doi:10.12688/wellcomeopenres.21269.1 PubMed PMID: 39119595; PubMed Central PMCID: PMC11306957. </w:t>
         </w:r>
       </w:hyperlink>
       <w:r>
@@ -22698,7 +22747,7 @@
           <w:rPr>
             <w:rtl w:val="0"/>
           </w:rPr>
-          <w:t xml:space="preserve">66.</w:t>
+          <w:t xml:space="preserve">70.</w:t>
         </w:r>
       </w:hyperlink>
       <w:r>
@@ -22712,7 +22761,7 @@
           <w:rPr>
             <w:rtl w:val="0"/>
           </w:rPr>
-          <w:t xml:space="preserve">Hanage WP, Fraser C, Tang J, Connor TR, Corander J. Hyper-recombination, diversity, and antibiotic resistance in pneumococcus. Science. 2009 Jun 12;324(5933):1454–7. doi:10.1126/science.1171908 PubMed PMID: 19520963. </w:t>
+          <w:t xml:space="preserve">Kenyon C, Laumen J, Van Den Bossche D, Van Dijck C. Where have all the susceptible gonococci gone? A historical review of changes in MIC distribution over the past 75 years. BMC Infect Dis. 2019 Dec 27;19(1):1085. doi:10.1186/s12879-019-4712-x </w:t>
         </w:r>
       </w:hyperlink>
       <w:r>
@@ -22745,7 +22794,7 @@
           <w:rPr>
             <w:rtl w:val="0"/>
           </w:rPr>
-          <w:t xml:space="preserve">67.</w:t>
+          <w:t xml:space="preserve">71.</w:t>
         </w:r>
       </w:hyperlink>
       <w:r>
@@ -22759,7 +22808,7 @@
           <w:rPr>
             <w:rtl w:val="0"/>
           </w:rPr>
-          <w:t xml:space="preserve">Dagan R, Klugman KP. Impact of conjugate pneumococcal vaccines on antibiotic resistance. Lancet Infect Dis. 2008 Dec;8(12):785–95. doi:10.1016/S1473-3099(08)70281-0 PubMed PMID: 19022193. </w:t>
+          <w:t xml:space="preserve">Bedford T, Suchard MA, Lemey P, Dudas G, Gregory V, Hay AJ, et al. Integrating influenza antigenic dynamics with molecular evolution. eLife. 2014 Feb 4;3:e01914. doi:10.7554/eLife.01914 </w:t>
         </w:r>
       </w:hyperlink>
       <w:r>
@@ -22792,7 +22841,7 @@
           <w:rPr>
             <w:rtl w:val="0"/>
           </w:rPr>
-          <w:t xml:space="preserve">68.</w:t>
+          <w:t xml:space="preserve">72.</w:t>
         </w:r>
       </w:hyperlink>
       <w:r>
@@ -22806,7 +22855,7 @@
           <w:rPr>
             <w:rtl w:val="0"/>
           </w:rPr>
-          <w:t xml:space="preserve">Kyaw MH, Lynfield R, Schaffner W, Craig AS, Hadler J, Reingold A, et al. Effect of introduction of the pneumococcal conjugate vaccine on drug-resistant Streptococcus pneumoniae. N Engl J Med. 2006 Apr 6;354(14):1455–63. doi:10.1056/NEJMoa051642 PubMed PMID: 16598044. </w:t>
+          <w:t xml:space="preserve">Balmer A. Multivariate Methods for the Study of Beta-lactam Resistance in Streptococci [PhD Thesis] [Internet]. [Cambridge, UK]: University of Cambridge; 2025 [cited 2025 Aug 15]. Available from: https://www.repository.cam.ac.uk/items/a20b3ee7-5ae5-417f-a95f-15299a52caff </w:t>
         </w:r>
       </w:hyperlink>
       <w:r>
@@ -22839,7 +22888,7 @@
           <w:rPr>
             <w:rtl w:val="0"/>
           </w:rPr>
-          <w:t xml:space="preserve">69.</w:t>
+          <w:t xml:space="preserve">73.</w:t>
         </w:r>
       </w:hyperlink>
       <w:r>
@@ -22853,7 +22902,7 @@
           <w:rPr>
             <w:rtl w:val="0"/>
           </w:rPr>
-          <w:t xml:space="preserve">Wildfire J, Waterlow NR, Clements A, Fuller NM, Knight GM. MIC distribution analysis identifies differences in AMR between population sub-groups. Wellcome Open Res. 2024;9:244. doi:10.12688/wellcomeopenres.21269.1 PubMed PMID: 39119595; PubMed Central PMCID: PMC11306957. </w:t>
+          <w:t xml:space="preserve">Global antimicrobial resistance and use surveillance system (‎GLASS)‎ report: 2022 [Internet]. [cited 2024 Jun 22]. Available from: https://www.who.int/publications/i/item/9789240062702 </w:t>
         </w:r>
       </w:hyperlink>
       <w:r>
@@ -22886,194 +22935,6 @@
           <w:rPr>
             <w:rtl w:val="0"/>
           </w:rPr>
-          <w:t xml:space="preserve">70.</w:t>
-        </w:r>
-      </w:hyperlink>
-      <w:r>
-        <w:rPr>
-          <w:rtl w:val="0"/>
-        </w:rPr>
-        <w:tab/>
-      </w:r>
-      <w:hyperlink r:id="rId231">
-        <w:r>
-          <w:rPr>
-            <w:rtl w:val="0"/>
-          </w:rPr>
-          <w:t xml:space="preserve">Kenyon C, Laumen J, Van Den Bossche D, Van Dijck C. Where have all the susceptible gonococci gone? A historical review of changes in MIC distribution over the past 75 years. BMC Infect Dis. 2019 Dec 27;19(1):1085. doi:10.1186/s12879-019-4712-x </w:t>
-        </w:r>
-      </w:hyperlink>
-      <w:r>
-        <w:rPr>
-          <w:rtl w:val="0"/>
-        </w:rPr>
-      </w:r>
-    </w:p>
-    <w:p>
-      <w:pPr>
-        <w:keepNext w:val="0"/>
-        <w:keepLines w:val="0"/>
-        <w:pageBreakBefore w:val="0"/>
-        <w:widowControl w:val="0"/>
-        <w:pBdr>
-          <w:top w:space="0" w:sz="0" w:val="nil"/>
-          <w:left w:space="0" w:sz="0" w:val="nil"/>
-          <w:bottom w:space="0" w:sz="0" w:val="nil"/>
-          <w:right w:space="0" w:sz="0" w:val="nil"/>
-          <w:between w:space="0" w:sz="0" w:val="nil"/>
-        </w:pBdr>
-        <w:shd w:fill="auto" w:val="clear"/>
-        <w:spacing w:after="240" w:before="0" w:line="240" w:lineRule="auto"/>
-        <w:ind w:left="384.00000000000006" w:right="0" w:hanging="384.00000000000006"/>
-        <w:jc w:val="left"/>
-        <w:rPr/>
-      </w:pPr>
-      <w:hyperlink r:id="rId232">
-        <w:r>
-          <w:rPr>
-            <w:rtl w:val="0"/>
-          </w:rPr>
-          <w:t xml:space="preserve">71.</w:t>
-        </w:r>
-      </w:hyperlink>
-      <w:r>
-        <w:rPr>
-          <w:rtl w:val="0"/>
-        </w:rPr>
-        <w:tab/>
-      </w:r>
-      <w:hyperlink r:id="rId233">
-        <w:r>
-          <w:rPr>
-            <w:rtl w:val="0"/>
-          </w:rPr>
-          <w:t xml:space="preserve">Bedford T, Suchard MA, Lemey P, Dudas G, Gregory V, Hay AJ, et al. Integrating influenza antigenic dynamics with molecular evolution. eLife. 2014 Feb 4;3:e01914. doi:10.7554/eLife.01914 </w:t>
-        </w:r>
-      </w:hyperlink>
-      <w:r>
-        <w:rPr>
-          <w:rtl w:val="0"/>
-        </w:rPr>
-      </w:r>
-    </w:p>
-    <w:p>
-      <w:pPr>
-        <w:keepNext w:val="0"/>
-        <w:keepLines w:val="0"/>
-        <w:pageBreakBefore w:val="0"/>
-        <w:widowControl w:val="0"/>
-        <w:pBdr>
-          <w:top w:space="0" w:sz="0" w:val="nil"/>
-          <w:left w:space="0" w:sz="0" w:val="nil"/>
-          <w:bottom w:space="0" w:sz="0" w:val="nil"/>
-          <w:right w:space="0" w:sz="0" w:val="nil"/>
-          <w:between w:space="0" w:sz="0" w:val="nil"/>
-        </w:pBdr>
-        <w:shd w:fill="auto" w:val="clear"/>
-        <w:spacing w:after="240" w:before="0" w:line="240" w:lineRule="auto"/>
-        <w:ind w:left="384.00000000000006" w:right="0" w:hanging="384.00000000000006"/>
-        <w:jc w:val="left"/>
-        <w:rPr/>
-      </w:pPr>
-      <w:hyperlink r:id="rId234">
-        <w:r>
-          <w:rPr>
-            <w:rtl w:val="0"/>
-          </w:rPr>
-          <w:t xml:space="preserve">72.</w:t>
-        </w:r>
-      </w:hyperlink>
-      <w:r>
-        <w:rPr>
-          <w:rtl w:val="0"/>
-        </w:rPr>
-        <w:tab/>
-      </w:r>
-      <w:hyperlink r:id="rId235">
-        <w:r>
-          <w:rPr>
-            <w:rtl w:val="0"/>
-          </w:rPr>
-          <w:t xml:space="preserve">Balmer A. Multivariate Methods for the Study of Beta-lactam Resistance in Streptococci [PhD Thesis] [Internet]. [Cambridge, UK]: University of Cambridge; 2025 [cited 2025 Aug 15]. Available from: https://www.repository.cam.ac.uk/items/a20b3ee7-5ae5-417f-a95f-15299a52caff </w:t>
-        </w:r>
-      </w:hyperlink>
-      <w:r>
-        <w:rPr>
-          <w:rtl w:val="0"/>
-        </w:rPr>
-      </w:r>
-    </w:p>
-    <w:p>
-      <w:pPr>
-        <w:keepNext w:val="0"/>
-        <w:keepLines w:val="0"/>
-        <w:pageBreakBefore w:val="0"/>
-        <w:widowControl w:val="0"/>
-        <w:pBdr>
-          <w:top w:space="0" w:sz="0" w:val="nil"/>
-          <w:left w:space="0" w:sz="0" w:val="nil"/>
-          <w:bottom w:space="0" w:sz="0" w:val="nil"/>
-          <w:right w:space="0" w:sz="0" w:val="nil"/>
-          <w:between w:space="0" w:sz="0" w:val="nil"/>
-        </w:pBdr>
-        <w:shd w:fill="auto" w:val="clear"/>
-        <w:spacing w:after="240" w:before="0" w:line="240" w:lineRule="auto"/>
-        <w:ind w:left="384.00000000000006" w:right="0" w:hanging="384.00000000000006"/>
-        <w:jc w:val="left"/>
-        <w:rPr/>
-      </w:pPr>
-      <w:hyperlink r:id="rId236">
-        <w:r>
-          <w:rPr>
-            <w:rtl w:val="0"/>
-          </w:rPr>
-          <w:t xml:space="preserve">73.</w:t>
-        </w:r>
-      </w:hyperlink>
-      <w:r>
-        <w:rPr>
-          <w:rtl w:val="0"/>
-        </w:rPr>
-        <w:tab/>
-      </w:r>
-      <w:hyperlink r:id="rId237">
-        <w:r>
-          <w:rPr>
-            <w:rtl w:val="0"/>
-          </w:rPr>
-          <w:t xml:space="preserve">Global antimicrobial resistance and use surveillance system (‎GLASS)‎ report: 2022 [Internet]. [cited 2024 Jun 22]. Available from: https://www.who.int/publications/i/item/9789240062702 </w:t>
-        </w:r>
-      </w:hyperlink>
-      <w:r>
-        <w:rPr>
-          <w:rtl w:val="0"/>
-        </w:rPr>
-      </w:r>
-    </w:p>
-    <w:p>
-      <w:pPr>
-        <w:keepNext w:val="0"/>
-        <w:keepLines w:val="0"/>
-        <w:pageBreakBefore w:val="0"/>
-        <w:widowControl w:val="0"/>
-        <w:pBdr>
-          <w:top w:space="0" w:sz="0" w:val="nil"/>
-          <w:left w:space="0" w:sz="0" w:val="nil"/>
-          <w:bottom w:space="0" w:sz="0" w:val="nil"/>
-          <w:right w:space="0" w:sz="0" w:val="nil"/>
-          <w:between w:space="0" w:sz="0" w:val="nil"/>
-        </w:pBdr>
-        <w:shd w:fill="auto" w:val="clear"/>
-        <w:spacing w:after="240" w:before="0" w:line="240" w:lineRule="auto"/>
-        <w:ind w:left="384.00000000000006" w:right="0" w:hanging="384.00000000000006"/>
-        <w:jc w:val="left"/>
-        <w:rPr/>
-      </w:pPr>
-      <w:hyperlink r:id="rId238">
-        <w:r>
-          <w:rPr>
-            <w:rtl w:val="0"/>
-          </w:rPr>
           <w:t xml:space="preserve">74.</w:t>
         </w:r>
       </w:hyperlink>
@@ -23083,7 +22944,7 @@
         </w:rPr>
         <w:tab/>
       </w:r>
-      <w:hyperlink r:id="rId239">
+      <w:hyperlink r:id="rId231">
         <w:r>
           <w:rPr>
             <w:rtl w:val="0"/>
@@ -23276,6 +23137,8 @@
         <w:ind w:left="720" w:hanging="360"/>
       </w:pPr>
       <w:rPr>
+        <w:sz w:val="20"/>
+        <w:szCs w:val="20"/>
         <w:u w:val="none"/>
       </w:rPr>
     </w:lvl>

</xml_diff>

<commit_message>
Install final submission package: Table S9 counts, data availability, manuscript corrections
</commit_message>
<xml_diff>
--- a/manuscript/Manuscript.docx
+++ b/manuscript/Manuscript.docx
@@ -94,7 +94,7 @@
         <w:rPr>
           <w:rtl w:val="0"/>
         </w:rPr>
-        <w:t xml:space="preserve">, Stephanie Lo</w:t>
+        <w:t xml:space="preserve">, Stephanie W. Lo</w:t>
       </w:r>
       <w:r>
         <w:rPr>
@@ -240,7 +240,7 @@
           <w:szCs w:val="20"/>
           <w:rtl w:val="0"/>
         </w:rPr>
-        <w:t xml:space="preserve">Parasites and Microbes, The Wellcome Sanger Institute, Wellcome Genome Campus, Hinxton, Cambridge,UK</w:t>
+        <w:t xml:space="preserve">Parasites and Microbes, The Wellcome Sanger Institute, Wellcome Genome Campus, Hinxton, Cambridge, UK.</w:t>
       </w:r>
     </w:p>
     <w:p>
@@ -260,7 +260,7 @@
           <w:szCs w:val="20"/>
           <w:rtl w:val="0"/>
         </w:rPr>
-        <w:t xml:space="preserve">Department of Veterinary Medicine, University of Cambridge, Cambridge, CB3 0ES,UK.</w:t>
+        <w:t xml:space="preserve">Department of Veterinary Medicine, University of Cambridge, Cambridge, CB3 0ES, UK.</w:t>
         <w:tab/>
       </w:r>
     </w:p>
@@ -2843,7 +2843,7 @@
           <w:color w:val="0e0e0e"/>
           <w:rtl w:val="0"/>
         </w:rPr>
-        <w:t xml:space="preserve">While higher-dimensional projections further reduced error (Table 1), improvements beyond two dimensions were more modest (e.g., 2D to 3D results in a drop in projection error of 0.406 MIC units - less than the error of MIC testing), suggesting 2D maps adequately capture key phenotypic patterns for this dataset </w:t>
+        <w:t xml:space="preserve">While higher-dimensional projections further reduced error (Table 1), improvements beyond two dimensions were more modest. Moving from two to three dimensions changed the projected positions of unique phenotypes by a mean of 0.406 MIC units—less than the expected error of MIC testing—suggesting that two-dimensional maps adequately capture the key phenotypic patterns in this dataset </w:t>
       </w:r>
       <w:hyperlink r:id="rId43">
         <w:r>
@@ -6373,12 +6373,12 @@
           <wp:inline distB="114300" distT="114300" distL="114300" distR="114300">
             <wp:extent cx="5731200" cy="3797300"/>
             <wp:effectExtent b="0" l="0" r="0" t="0"/>
-            <wp:docPr id="2" name="image3.jpg"/>
+            <wp:docPr id="2" name="image2.jpg"/>
             <a:graphic>
               <a:graphicData uri="http://schemas.openxmlformats.org/drawingml/2006/picture">
                 <pic:pic>
                   <pic:nvPicPr>
-                    <pic:cNvPr id="0" name="image3.jpg"/>
+                    <pic:cNvPr id="0" name="image2.jpg"/>
                     <pic:cNvPicPr preferRelativeResize="0"/>
                   </pic:nvPicPr>
                   <pic:blipFill>
@@ -6705,7 +6705,7 @@
         <w:rPr>
           <w:rtl w:val="0"/>
         </w:rPr>
-        <w:t xml:space="preserve">everal high-ranking substitutions mapped to or near conserved PBP active-site motifs (Supplementary File 1). For example, in PBP2X, I371T, A369V, L364F, and M343T formed a cluster near the active site between the S337TMK and S395SN motifs, while V523L and S531Y lay closer to the K547SG motif </w:t>
+        <w:t xml:space="preserve">everal high-ranking substitutions mapped to or near conserved PBP active-site motifs (Supplementary Table S9). For example, in PBP2X, I371T, A369V, L364F, and M343T formed a cluster near the active site between the S337TMK and S395SN motifs, while V523L and S531Y lay closer to the K547SG motif </w:t>
       </w:r>
       <w:hyperlink r:id="rId53">
         <w:r>
@@ -6996,12 +6996,12 @@
           <wp:inline distB="114300" distT="114300" distL="114300" distR="114300">
             <wp:extent cx="5734050" cy="4129108"/>
             <wp:effectExtent b="0" l="0" r="0" t="0"/>
-            <wp:docPr id="1" name="image2.jpg"/>
+            <wp:docPr id="1" name="image3.jpg"/>
             <a:graphic>
               <a:graphicData uri="http://schemas.openxmlformats.org/drawingml/2006/picture">
                 <pic:pic>
                   <pic:nvPicPr>
-                    <pic:cNvPr id="0" name="image2.jpg"/>
+                    <pic:cNvPr id="0" name="image3.jpg"/>
                     <pic:cNvPicPr preferRelativeResize="0"/>
                   </pic:nvPicPr>
                   <pic:blipFill>
@@ -19348,7 +19348,7 @@
         <w:rPr>
           <w:rtl w:val="0"/>
         </w:rPr>
-        <w:t xml:space="preserve">All MIC and PBP sequence data analysed in this study were generated by the CDC Active Bacterial Core surveillance programme and are publicly available. All code, processed data and analysis workflows required to reproduce this study are available at https://github.com/AndrewBalmer/AMR-cartography. Source data for Table 3 and Supplementary Figures S18–S20 are provided in manuscript/source_data/.</w:t>
+        <w:t xml:space="preserve">All MIC and PBP sequence data analysed in this study were generated by the CDC Active Bacterial Core surveillance programme and are publicly available. All analysis code and workflows, together with the source data underlying the figures and tables reported here, are available at https://github.com/AndrewBalmer/AMR-cartography. Large raw and intermediate data files are not redistributed in the repository; the scripts document how to obtain the primary data from the original sources and how to regenerate intermediate files Source data for Table 3 and Supplementary Figures S14, S15 and S18–S20 are provided in manuscript/source_data/.</w:t>
       </w:r>
     </w:p>
     <w:p>

</xml_diff>